<commit_message>
doc: save report draft
</commit_message>
<xml_diff>
--- a/doc/Report/reston_mark_recapture_methods_results_v0.1.docx
+++ b/doc/Report/reston_mark_recapture_methods_results_v0.1.docx
@@ -55,34 +55,37 @@
         <w:t xml:space="preserve"> </w:t>
       </w:r>
       <w:r>
-        <w:t xml:space="preserve">On July 26, 2023, we released</w:t>
-      </w:r>
-      <w:r>
-        <w:t xml:space="preserve"> </w:t>
-      </w:r>
-      <w:r>
-        <w:rPr>
-          <w:rStyle w:val="VerbatimChar"/>
-        </w:rPr>
-        <w:t xml:space="preserve">n_glade_release</w:t>
-      </w:r>
-      <w:r>
-        <w:t xml:space="preserve"> </w:t>
-      </w:r>
-      <w:r>
-        <w:t xml:space="preserve">in the Shenandoah River at the Bentonville site (38.84376, -78.33875).</w:t>
-      </w:r>
-      <w:r>
-        <w:t xml:space="preserve"> </w:t>
-      </w:r>
-      <w:r>
-        <w:t xml:space="preserve">Of these releases, 1,590 were uniquely tagged with Hallprint glue-on shellfish tags such that the individual mussel could be later identified.</w:t>
-      </w:r>
-      <w:r>
-        <w:t xml:space="preserve"> </w:t>
-      </w:r>
-      <w:r>
-        <w:t xml:space="preserve">Of these, 1,590 mussels, 49</w:t>
+        <w:t xml:space="preserve">We released 1224 at Glade Run (38.93031, -77.34245) on July 26, 2023, and 1578 at Snakeden Run (38.9238, -77.33168) on July 27.</w:t>
+      </w:r>
+      <w:r>
+        <w:t xml:space="preserve"> </w:t>
+      </w:r>
+      <w:r>
+        <w:t xml:space="preserve">All releases were uniquely tagged with Hallprint glue-on shellfish tags such that the individual mussel could be later identified.</w:t>
+      </w:r>
+      <w:r>
+        <w:t xml:space="preserve"> </w:t>
+      </w:r>
+      <w:r>
+        <w:t xml:space="preserve">Each site was later sampled a total of eight times from July 2023 to September 2024</w:t>
+      </w:r>
+      <w:r>
+        <w:t xml:space="preserve"> </w:t>
+      </w:r>
+      <w:r>
+        <w:t xml:space="preserve">We sampled the entire area of the site twice by snorkeling (TODO Add table of dates here?).</w:t>
+      </w:r>
+      <w:r>
+        <w:t xml:space="preserve"> </w:t>
+      </w:r>
+      <w:r>
+        <w:t xml:space="preserve">For each mussel encountered, we measured its overall length and recorded the unique tag number.</w:t>
+      </w:r>
+      <w:r>
+        <w:t xml:space="preserve"> </w:t>
+      </w:r>
+      <w:r>
+        <w:t xml:space="preserve">Any untagged</w:t>
       </w:r>
       <w:r>
         <w:t xml:space="preserve"> </w:t>
@@ -92,25 +95,90 @@
           <w:i/>
           <w:iCs/>
         </w:rPr>
-        <w:t xml:space="preserve">Alasmidonta varicosa</w:t>
-      </w:r>
-      <w:r>
-        <w:t xml:space="preserve"> </w:t>
-      </w:r>
-      <w:r>
-        <w:t xml:space="preserve">released by Harrison Lake were also tagged with a PIT transponder.</w:t>
-      </w:r>
-      <w:r>
-        <w:t xml:space="preserve"> </w:t>
-      </w:r>
-      <w:r>
-        <w:t xml:space="preserve">In 2024, the site was sampled four times from June to October.</w:t>
-      </w:r>
-      <w:r>
-        <w:t xml:space="preserve"> </w:t>
-      </w:r>
-      <w:r>
-        <w:t xml:space="preserve">We sampled the entire area of the site twice by:</w:t>
+        <w:t xml:space="preserve">Elliptio complanata</w:t>
+      </w:r>
+      <w:r>
+        <w:t xml:space="preserve"> </w:t>
+      </w:r>
+      <w:r>
+        <w:t xml:space="preserve">found on these occasions were tagged.</w:t>
+      </w:r>
+      <w:r>
+        <w:t xml:space="preserve"> </w:t>
+      </w:r>
+      <w:r>
+        <w:t xml:space="preserve">Becuase</w:t>
+      </w:r>
+      <w:r>
+        <w:t xml:space="preserve"> </w:t>
+      </w:r>
+      <w:r>
+        <w:rPr>
+          <w:i/>
+          <w:iCs/>
+        </w:rPr>
+        <w:t xml:space="preserve">Elliptio complanata</w:t>
+      </w:r>
+      <w:r>
+        <w:t xml:space="preserve"> </w:t>
+      </w:r>
+      <w:r>
+        <w:t xml:space="preserve">did not occur at either site prior to the 2023 release, these untagged individuals represented previously tagged mussels whose tags were lost.</w:t>
+      </w:r>
+    </w:p>
+    <w:bookmarkEnd w:id="20"/>
+    <w:bookmarkStart w:id="21" w:name="popan-description"/>
+    <w:p>
+      <w:pPr>
+        <w:pStyle w:val="Heading2"/>
+      </w:pPr>
+      <w:r>
+        <w:t xml:space="preserve">1.2 POPAN description</w:t>
+      </w:r>
+    </w:p>
+    <w:p>
+      <w:pPr>
+        <w:pStyle w:val="FirstParagraph"/>
+      </w:pPr>
+      <w:r>
+        <w:t xml:space="preserve">We were interested primarily in estimating survival of the release cohort over time.</w:t>
+      </w:r>
+      <w:r>
+        <w:t xml:space="preserve"> </w:t>
+      </w:r>
+      <w:r>
+        <w:t xml:space="preserve">Because we also found a high proportion of dead mussels during sampling, we used Burnham’s joint recovery model which incorporates both live encounters and dead recoveries (</w:t>
+      </w:r>
+      <w:r>
+        <w:t xml:space="preserve">(</w:t>
+      </w:r>
+      <w:r>
+        <w:rPr>
+          <w:b/>
+          <w:bCs/>
+        </w:rPr>
+        <w:t xml:space="preserve">BURNHAM?</w:t>
+      </w:r>
+      <w:r>
+        <w:t xml:space="preserve">)</w:t>
+      </w:r>
+      <w:r>
+        <w:t xml:space="preserve"> </w:t>
+      </w:r>
+      <w:r>
+        <w:t xml:space="preserve">1993) to analyze our mark-recapture data.</w:t>
+      </w:r>
+      <w:r>
+        <w:t xml:space="preserve"> </w:t>
+      </w:r>
+      <w:r>
+        <w:t xml:space="preserve">The Burnham model is an open population model that allows for the estimation of both apparent survival and population size.</w:t>
+      </w:r>
+      <w:r>
+        <w:t xml:space="preserve"> </w:t>
+      </w:r>
+      <w:r>
+        <w:t xml:space="preserve">It has four model parameters that are directly estimated:</w:t>
       </w:r>
     </w:p>
     <w:p>
@@ -121,108 +189,11 @@
           <w:numId w:val="1001"/>
         </w:numPr>
       </w:pPr>
-      <w:r>
-        <w:t xml:space="preserve">snorkeling</w:t>
-      </w:r>
-    </w:p>
-    <w:p>
-      <w:pPr>
-        <w:pStyle w:val="Compact"/>
-        <w:numPr>
-          <w:ilvl w:val="0"/>
-          <w:numId w:val="1001"/>
-        </w:numPr>
-      </w:pPr>
-      <w:r>
-        <w:t xml:space="preserve">passing a PIT tag reader over the area</w:t>
-      </w:r>
-    </w:p>
-    <w:p>
-      <w:pPr>
-        <w:pStyle w:val="FirstParagraph"/>
-      </w:pPr>
-      <w:r>
-        <w:t xml:space="preserve">For each mussel encountered, we measured its overall length and recorded the unique tag number.</w:t>
-      </w:r>
-      <w:r>
-        <w:t xml:space="preserve"> </w:t>
-      </w:r>
-      <w:r>
-        <w:t xml:space="preserve">Untagged mussels were not tagged.</w:t>
-      </w:r>
-    </w:p>
-    <w:bookmarkEnd w:id="20"/>
-    <w:bookmarkStart w:id="21" w:name="popan-description"/>
-    <w:p>
-      <w:pPr>
-        <w:pStyle w:val="Heading2"/>
-      </w:pPr>
-      <w:r>
-        <w:t xml:space="preserve">1.2 POPAN description</w:t>
-      </w:r>
-    </w:p>
-    <w:p>
-      <w:pPr>
-        <w:pStyle w:val="FirstParagraph"/>
-      </w:pPr>
-      <w:r>
-        <w:t xml:space="preserve">We were interested primarily in estimating survival of the release cohort over time and the corresponding abundance on each sampling occasion.</w:t>
-      </w:r>
-      <w:r>
-        <w:t xml:space="preserve"> </w:t>
-      </w:r>
-      <w:r>
-        <w:t xml:space="preserve">Consequently, we used the POPAN mark-recapture framework (</w:t>
-      </w:r>
-      <w:r>
-        <w:t xml:space="preserve">Schwarz and Arnason (1996)</w:t>
-      </w:r>
-      <w:r>
-        <w:t xml:space="preserve">), a parameterization of the Jolly-Seber model, to analyze our mark-recapture data.</w:t>
-      </w:r>
-      <w:r>
-        <w:t xml:space="preserve"> </w:t>
-      </w:r>
-      <w:r>
-        <w:t xml:space="preserve">The POPAN model is an open population model that allows for the estimation of both apparent survival and population size.</w:t>
-      </w:r>
-      <w:r>
-        <w:t xml:space="preserve"> </w:t>
-      </w:r>
-      <w:r>
-        <w:t xml:space="preserve">It has four model parameters that are directly estimated:</w:t>
-      </w:r>
-    </w:p>
-    <w:p>
-      <w:pPr>
-        <w:pStyle w:val="Compact"/>
-        <w:numPr>
-          <w:ilvl w:val="0"/>
-          <w:numId w:val="1002"/>
-        </w:numPr>
-      </w:pPr>
-      <m:oMath>
-        <m:r>
-          <m:t>N</m:t>
-        </m:r>
-      </m:oMath>
-      <w:r>
-        <w:t xml:space="preserve">: Super population of all individuals that will ever be born into the population</w:t>
-      </w:r>
-    </w:p>
-    <w:p>
-      <w:pPr>
-        <w:pStyle w:val="Compact"/>
-        <w:numPr>
-          <w:ilvl w:val="0"/>
-          <w:numId w:val="1002"/>
-        </w:numPr>
-      </w:pPr>
       <m:oMath>
         <m:sSub>
           <m:e>
             <m:r>
-              <m:t>b</m:t>
+              <m:t>S</m:t>
             </m:r>
           </m:e>
           <m:sub>
@@ -233,21 +204,7 @@
         </m:sSub>
       </m:oMath>
       <w:r>
-        <w:t xml:space="preserve">: probability that a member of</w:t>
-      </w:r>
-      <w:r>
-        <w:t xml:space="preserve"> </w:t>
-      </w:r>
-      <m:oMath>
-        <m:r>
-          <m:t>N</m:t>
-        </m:r>
-      </m:oMath>
-      <w:r>
-        <w:t xml:space="preserve"> </w:t>
-      </w:r>
-      <w:r>
-        <w:t xml:space="preserve">will enter the population (i.e., become available for capture) from occasion</w:t>
+        <w:t xml:space="preserve">: probability of an individual surviving from occasion</w:t>
       </w:r>
       <w:r>
         <w:t xml:space="preserve"> </w:t>
@@ -286,70 +243,7 @@
         <w:pStyle w:val="Compact"/>
         <w:numPr>
           <w:ilvl w:val="0"/>
-          <w:numId w:val="1002"/>
-        </w:numPr>
-      </w:pPr>
-      <m:oMath>
-        <m:sSub>
-          <m:e>
-            <m:r>
-              <m:t>ϕ</m:t>
-            </m:r>
-          </m:e>
-          <m:sub>
-            <m:r>
-              <m:t>i</m:t>
-            </m:r>
-          </m:sub>
-        </m:sSub>
-      </m:oMath>
-      <w:r>
-        <w:t xml:space="preserve">: probability of an individual surviving and remaining in population from occasion</w:t>
-      </w:r>
-      <w:r>
-        <w:t xml:space="preserve"> </w:t>
-      </w:r>
-      <m:oMath>
-        <m:r>
-          <m:t>i</m:t>
-        </m:r>
-      </m:oMath>
-      <w:r>
-        <w:t xml:space="preserve"> </w:t>
-      </w:r>
-      <w:r>
-        <w:t xml:space="preserve">to</w:t>
-      </w:r>
-      <w:r>
-        <w:t xml:space="preserve"> </w:t>
-      </w:r>
-      <m:oMath>
-        <m:r>
-          <m:t>i</m:t>
-        </m:r>
-        <m:r>
-          <m:rPr>
-            <m:sty m:val="p"/>
-          </m:rPr>
-          <m:t>+</m:t>
-        </m:r>
-        <m:r>
-          <m:t>1</m:t>
-        </m:r>
-      </m:oMath>
-      <w:r>
-        <w:t xml:space="preserve"> </w:t>
-      </w:r>
-      <w:r>
-        <w:t xml:space="preserve">(i.e., apparent survival)</w:t>
-      </w:r>
-    </w:p>
-    <w:p>
-      <w:pPr>
-        <w:pStyle w:val="Compact"/>
-        <w:numPr>
-          <w:ilvl w:val="0"/>
-          <w:numId w:val="1002"/>
+          <w:numId w:val="1001"/>
         </w:numPr>
       </w:pPr>
       <m:oMath>
@@ -367,7 +261,7 @@
         </m:sSub>
       </m:oMath>
       <w:r>
-        <w:t xml:space="preserve">: probability of capture at occasion</w:t>
+        <w:t xml:space="preserve">: probability of an individual being captured alive at occasion</w:t>
       </w:r>
       <w:r>
         <w:t xml:space="preserve"> </w:t>
@@ -377,34 +271,20 @@
           <m:t>i</m:t>
         </m:r>
       </m:oMath>
-      <w:r>
-        <w:t xml:space="preserve"> </w:t>
-      </w:r>
-      <w:r>
-        <w:t xml:space="preserve">(i.e., detectability).</w:t>
-      </w:r>
     </w:p>
     <w:p>
       <w:pPr>
-        <w:pStyle w:val="FirstParagraph"/>
-      </w:pPr>
-      <w:r>
-        <w:t xml:space="preserve">During field sampling, we only recorded already tagged individuals without tagging new mussels.</w:t>
-      </w:r>
-      <w:r>
-        <w:t xml:space="preserve"> </w:t>
-      </w:r>
-      <w:r>
-        <w:t xml:space="preserve">Consequently, we assumed that</w:t>
-      </w:r>
-      <w:r>
-        <w:t xml:space="preserve"> </w:t>
-      </w:r>
+        <w:pStyle w:val="Compact"/>
+        <w:numPr>
+          <w:ilvl w:val="0"/>
+          <w:numId w:val="1001"/>
+        </w:numPr>
+      </w:pPr>
       <m:oMath>
         <m:sSub>
           <m:e>
             <m:r>
-              <m:t>b</m:t>
+              <m:t>r</m:t>
             </m:r>
           </m:e>
           <m:sub>
@@ -415,242 +295,53 @@
         </m:sSub>
       </m:oMath>
       <w:r>
-        <w:t xml:space="preserve"> </w:t>
-      </w:r>
-      <w:r>
-        <w:t xml:space="preserve">was 0 for the interval between all sampling occasions because no new animals can enter the initial cohort (i.e.,</w:t>
+        <w:t xml:space="preserve">: probability of an individual being recovered dead between occasion</w:t>
       </w:r>
       <w:r>
         <w:t xml:space="preserve"> </w:t>
       </w:r>
       <m:oMath>
         <m:r>
-          <m:t>N</m:t>
+          <m:t>i</m:t>
         </m:r>
       </m:oMath>
       <w:r>
-        <w:t xml:space="preserve">).</w:t>
-      </w:r>
-      <w:r>
-        <w:t xml:space="preserve"> </w:t>
-      </w:r>
-      <w:r>
-        <w:t xml:space="preserve">These four estimates can be used to derive abundance estimates for each occasion after the first occasion:</w:t>
-      </w:r>
+        <w:t xml:space="preserve"> </w:t>
+      </w:r>
+      <w:r>
+        <w:t xml:space="preserve">to</w:t>
+      </w:r>
+      <w:r>
+        <w:t xml:space="preserve"> </w:t>
+      </w:r>
+      <m:oMath>
+        <m:r>
+          <m:t>i</m:t>
+        </m:r>
+        <m:r>
+          <m:rPr>
+            <m:sty m:val="p"/>
+          </m:rPr>
+          <m:t>+</m:t>
+        </m:r>
+        <m:r>
+          <m:t>1</m:t>
+        </m:r>
+      </m:oMath>
     </w:p>
     <w:p>
       <w:pPr>
-        <w:pStyle w:val="BodyText"/>
-      </w:pPr>
-      <m:oMathPara>
-        <m:oMathParaPr>
-          <m:jc m:val="center"/>
-        </m:oMathParaPr>
-        <m:oMath>
-          <m:sSub>
-            <m:e>
-              <m:r>
-                <m:t>N</m:t>
-              </m:r>
-            </m:e>
-            <m:sub>
-              <m:r>
-                <m:t>i</m:t>
-              </m:r>
-            </m:sub>
-          </m:sSub>
-          <m:r>
-            <m:rPr>
-              <m:sty m:val="p"/>
-            </m:rPr>
-            <m:t>=</m:t>
-          </m:r>
-          <m:sSub>
-            <m:e>
-              <m:r>
-                <m:t>N</m:t>
-              </m:r>
-            </m:e>
-            <m:sub>
-              <m:r>
-                <m:t>i</m:t>
-              </m:r>
-              <m:r>
-                <m:rPr>
-                  <m:sty m:val="p"/>
-                </m:rPr>
-                <m:t>−</m:t>
-              </m:r>
-              <m:r>
-                <m:t>1</m:t>
-              </m:r>
-            </m:sub>
-          </m:sSub>
-          <m:sSub>
-            <m:e>
-              <m:r>
-                <m:t>ϕ</m:t>
-              </m:r>
-            </m:e>
-            <m:sub>
-              <m:r>
-                <m:t>i</m:t>
-              </m:r>
-              <m:r>
-                <m:rPr>
-                  <m:sty m:val="p"/>
-                </m:rPr>
-                <m:t>−</m:t>
-              </m:r>
-              <m:r>
-                <m:t>1</m:t>
-              </m:r>
-            </m:sub>
-          </m:sSub>
-          <m:r>
-            <m:rPr>
-              <m:sty m:val="p"/>
-            </m:rPr>
-            <m:t>+</m:t>
-          </m:r>
-          <m:r>
-            <m:t>N</m:t>
-          </m:r>
-          <m:sSub>
-            <m:e>
-              <m:r>
-                <m:t>b</m:t>
-              </m:r>
-            </m:e>
-            <m:sub>
-              <m:r>
-                <m:t>i</m:t>
-              </m:r>
-              <m:r>
-                <m:rPr>
-                  <m:sty m:val="p"/>
-                </m:rPr>
-                <m:t>−</m:t>
-              </m:r>
-              <m:r>
-                <m:t>1</m:t>
-              </m:r>
-            </m:sub>
-          </m:sSub>
-        </m:oMath>
-      </m:oMathPara>
-    </w:p>
-    <w:p>
-      <w:pPr>
-        <w:pStyle w:val="FirstParagraph"/>
-      </w:pPr>
-      <w:r>
-        <w:t xml:space="preserve">Abundance estimates for the first occasion are derived by:</w:t>
-      </w:r>
-    </w:p>
-    <w:p>
-      <w:pPr>
-        <w:pStyle w:val="BodyText"/>
-      </w:pPr>
-      <m:oMathPara>
-        <m:oMathParaPr>
-          <m:jc m:val="center"/>
-        </m:oMathParaPr>
-        <m:oMath>
-          <m:sSub>
-            <m:e>
-              <m:r>
-                <m:t>N</m:t>
-              </m:r>
-            </m:e>
-            <m:sub>
-              <m:r>
-                <m:t>1</m:t>
-              </m:r>
-            </m:sub>
-          </m:sSub>
-          <m:r>
-            <m:rPr>
-              <m:sty m:val="p"/>
-            </m:rPr>
-            <m:t>=</m:t>
-          </m:r>
-          <m:r>
-            <m:t>N</m:t>
-          </m:r>
-          <m:sSub>
-            <m:e>
-              <m:r>
-                <m:t>b</m:t>
-              </m:r>
-            </m:e>
-            <m:sub>
-              <m:r>
-                <m:t>0</m:t>
-              </m:r>
-            </m:sub>
-          </m:sSub>
-        </m:oMath>
-      </m:oMathPara>
-    </w:p>
-    <w:p>
-      <w:pPr>
-        <w:pStyle w:val="FirstParagraph"/>
-      </w:pPr>
-      <w:r>
-        <w:t xml:space="preserve">where</w:t>
-      </w:r>
-      <w:r>
-        <w:t xml:space="preserve"> </w:t>
-      </w:r>
+        <w:pStyle w:val="Compact"/>
+        <w:numPr>
+          <w:ilvl w:val="0"/>
+          <w:numId w:val="1001"/>
+        </w:numPr>
+      </w:pPr>
       <m:oMath>
         <m:sSub>
           <m:e>
             <m:r>
-              <m:t>b</m:t>
-            </m:r>
-          </m:e>
-          <m:sub>
-            <m:r>
-              <m:t>0</m:t>
-            </m:r>
-          </m:sub>
-        </m:sSub>
-      </m:oMath>
-      <w:r>
-        <w:t xml:space="preserve"> </w:t>
-      </w:r>
-      <w:r>
-        <w:t xml:space="preserve">is the probability that a member of</w:t>
-      </w:r>
-      <w:r>
-        <w:t xml:space="preserve"> </w:t>
-      </w:r>
-      <m:oMath>
-        <m:r>
-          <m:t>N</m:t>
-        </m:r>
-      </m:oMath>
-      <w:r>
-        <w:t xml:space="preserve"> </w:t>
-      </w:r>
-      <w:r>
-        <w:t xml:space="preserve">will enter the population immediately prior to the first sampling occasion.</w:t>
-      </w:r>
-      <w:r>
-        <w:t xml:space="preserve"> </w:t>
-      </w:r>
-      <w:r>
-        <w:t xml:space="preserve">Because we assume</w:t>
-      </w:r>
-      <w:r>
-        <w:t xml:space="preserve"> </w:t>
-      </w:r>
-      <m:oMath>
-        <m:sSub>
-          <m:e>
-            <m:r>
-              <m:t>b</m:t>
+              <m:t>F</m:t>
             </m:r>
           </m:e>
           <m:sub>
@@ -661,47 +352,29 @@
         </m:sSub>
       </m:oMath>
       <w:r>
-        <w:t xml:space="preserve"> </w:t>
-      </w:r>
-      <w:r>
-        <w:t xml:space="preserve">is 0 for sampling intervals,</w:t>
+        <w:t xml:space="preserve">: probability of an individual remaining in the sample area (i.e., fidelity)</w:t>
+      </w:r>
+    </w:p>
+    <w:p>
+      <w:pPr>
+        <w:pStyle w:val="FirstParagraph"/>
+      </w:pPr>
+      <w:r>
+        <w:t xml:space="preserve">Because the area for dead and live recoveries was the same, we fixed</w:t>
       </w:r>
       <w:r>
         <w:t xml:space="preserve"> </w:t>
       </w:r>
       <m:oMath>
-        <m:sSub>
-          <m:e>
-            <m:r>
-              <m:t>b</m:t>
-            </m:r>
-          </m:e>
-          <m:sub>
-            <m:r>
-              <m:t>0</m:t>
-            </m:r>
-          </m:sub>
-        </m:sSub>
+        <m:r>
+          <m:t>F</m:t>
+        </m:r>
       </m:oMath>
       <w:r>
         <w:t xml:space="preserve"> </w:t>
       </w:r>
       <w:r>
-        <w:t xml:space="preserve">is equal to one, and the abundance estimate for the first occasion is the same as</w:t>
-      </w:r>
-      <w:r>
-        <w:t xml:space="preserve"> </w:t>
-      </w:r>
-      <m:oMath>
-        <m:r>
-          <m:t>N</m:t>
-        </m:r>
-      </m:oMath>
-      <w:r>
-        <w:t xml:space="preserve"> </w:t>
-      </w:r>
-      <w:r>
-        <w:t xml:space="preserve">(i.e., the initial release cohort).</w:t>
+        <w:t xml:space="preserve">to 1 for all occasions.</w:t>
       </w:r>
     </w:p>
     <w:bookmarkEnd w:id="21"/>
@@ -719,25 +392,39 @@
         <w:pStyle w:val="FirstParagraph"/>
       </w:pPr>
       <w:r>
-        <w:t xml:space="preserve">Data for uniquely tagged individuals released in 2023 were combined with data from the four sampling occasions in 2024.</w:t>
-      </w:r>
-      <w:r>
-        <w:t xml:space="preserve"> </w:t>
-      </w:r>
-      <w:r>
-        <w:t xml:space="preserve">A set of candidate models were developed under the POPAN framework for estimating abundance and apparent survival of the 2023 release cohort.</w:t>
-      </w:r>
-      <w:r>
-        <w:t xml:space="preserve"> </w:t>
-      </w:r>
-      <w:r>
-        <w:t xml:space="preserve">Each candidate model represents a set of hypotheses regarding the four model parameters of the POPAN model (e.g., survival varies over time or is constant).</w:t>
-      </w:r>
-      <w:r>
-        <w:t xml:space="preserve"> </w:t>
-      </w:r>
-      <w:r>
-        <w:t xml:space="preserve">For all models, the probability of entry into the super population between sampling occasions was fixed to 0.</w:t>
+        <w:t xml:space="preserve">Release data for the 2023 cohort were combined with data from the eight sampling occasions in 2024 and 2025.</w:t>
+      </w:r>
+      <w:r>
+        <w:t xml:space="preserve"> </w:t>
+      </w:r>
+      <w:r>
+        <w:t xml:space="preserve">A set of candidate models were developed under the Burnham model for estimating.</w:t>
+      </w:r>
+      <w:r>
+        <w:t xml:space="preserve"> </w:t>
+      </w:r>
+      <w:r>
+        <w:t xml:space="preserve">Each candidate model represents a set of hypotheses regarding the four model parameters of the Burnham model (e.g., survival varies over time or is constant).</w:t>
+      </w:r>
+      <w:r>
+        <w:t xml:space="preserve"> </w:t>
+      </w:r>
+      <w:r>
+        <w:t xml:space="preserve">For all models,</w:t>
+      </w:r>
+      <w:r>
+        <w:t xml:space="preserve"> </w:t>
+      </w:r>
+      <m:oMath>
+        <m:r>
+          <m:t>F</m:t>
+        </m:r>
+      </m:oMath>
+      <w:r>
+        <w:t xml:space="preserve"> </w:t>
+      </w:r>
+      <w:r>
+        <w:t xml:space="preserve">(fidelity) was fixed to 1.</w:t>
       </w:r>
       <w:r>
         <w:t xml:space="preserve"> </w:t>
@@ -751,11 +438,55 @@
         <w:pStyle w:val="Compact"/>
         <w:numPr>
           <w:ilvl w:val="0"/>
-          <w:numId w:val="1003"/>
+          <w:numId w:val="1002"/>
         </w:numPr>
       </w:pPr>
-      <w:r>
-        <w:t xml:space="preserve">super population was either constant or varied between facilities,</w:t>
+      <m:oMath>
+        <m:r>
+          <m:t>S</m:t>
+        </m:r>
+      </m:oMath>
+      <w:r>
+        <w:t xml:space="preserve"> </w:t>
+      </w:r>
+      <w:r>
+        <w:t xml:space="preserve">varied between each sampling occasion (</w:t>
+      </w:r>
+      <m:oMath>
+        <m:r>
+          <m:t>t</m:t>
+        </m:r>
+      </m:oMath>
+      <w:r>
+        <w:t xml:space="preserve">), was constant between all occasions(</w:t>
+      </w:r>
+      <m:oMath>
+        <m:r>
+          <m:rPr>
+            <m:sty m:val="p"/>
+          </m:rPr>
+          <m:t>.</m:t>
+        </m:r>
+      </m:oMath>
+      <w:r>
+        <w:t xml:space="preserve">), or was constant between occasions for the same year but varied between years (</w:t>
+      </w:r>
+      <m:oMath>
+        <m:r>
+          <m:t>y</m:t>
+        </m:r>
+        <m:r>
+          <m:t>e</m:t>
+        </m:r>
+        <m:r>
+          <m:t>a</m:t>
+        </m:r>
+        <m:r>
+          <m:t>r</m:t>
+        </m:r>
+      </m:oMath>
+      <w:r>
+        <w:t xml:space="preserve">),</w:t>
       </w:r>
     </w:p>
     <w:p>
@@ -763,11 +494,47 @@
         <w:pStyle w:val="Compact"/>
         <w:numPr>
           <w:ilvl w:val="0"/>
-          <w:numId w:val="1003"/>
+          <w:numId w:val="1002"/>
         </w:numPr>
       </w:pPr>
-      <w:r>
-        <w:t xml:space="preserve">apparent survival was either constant, varied over time, varied by facility, or varied over time and by facility,</w:t>
+      <m:oMath>
+        <m:r>
+          <m:t>p</m:t>
+        </m:r>
+      </m:oMath>
+      <w:r>
+        <w:t xml:space="preserve"> </w:t>
+      </w:r>
+      <w:r>
+        <w:t xml:space="preserve">was constant over all occasions(</w:t>
+      </w:r>
+      <m:oMath>
+        <m:r>
+          <m:rPr>
+            <m:sty m:val="p"/>
+          </m:rPr>
+          <m:t>.</m:t>
+        </m:r>
+      </m:oMath>
+      <w:r>
+        <w:t xml:space="preserve">) or was constant between occasions for the same year but varied between years (</w:t>
+      </w:r>
+      <m:oMath>
+        <m:r>
+          <m:t>y</m:t>
+        </m:r>
+        <m:r>
+          <m:t>e</m:t>
+        </m:r>
+        <m:r>
+          <m:t>a</m:t>
+        </m:r>
+        <m:r>
+          <m:t>r</m:t>
+        </m:r>
+      </m:oMath>
+      <w:r>
+        <w:t xml:space="preserve">),</w:t>
       </w:r>
     </w:p>
     <w:p>
@@ -775,11 +542,47 @@
         <w:pStyle w:val="Compact"/>
         <w:numPr>
           <w:ilvl w:val="0"/>
-          <w:numId w:val="1003"/>
+          <w:numId w:val="1002"/>
         </w:numPr>
       </w:pPr>
-      <w:r>
-        <w:t xml:space="preserve">capture probability was either constant, varied over time, or varied by facility.</w:t>
+      <m:oMath>
+        <m:r>
+          <m:t>r</m:t>
+        </m:r>
+      </m:oMath>
+      <w:r>
+        <w:t xml:space="preserve"> </w:t>
+      </w:r>
+      <w:r>
+        <w:t xml:space="preserve">was constant over all occasions(</w:t>
+      </w:r>
+      <m:oMath>
+        <m:r>
+          <m:rPr>
+            <m:sty m:val="p"/>
+          </m:rPr>
+          <m:t>.</m:t>
+        </m:r>
+      </m:oMath>
+      <w:r>
+        <w:t xml:space="preserve">) or was constant between occasions for the same year but varied between years (</w:t>
+      </w:r>
+      <m:oMath>
+        <m:r>
+          <m:t>y</m:t>
+        </m:r>
+        <m:r>
+          <m:t>e</m:t>
+        </m:r>
+        <m:r>
+          <m:t>a</m:t>
+        </m:r>
+        <m:r>
+          <m:t>r</m:t>
+        </m:r>
+      </m:oMath>
+      <w:r>
+        <w:t xml:space="preserve">).</w:t>
       </w:r>
     </w:p>
     <w:p>
@@ -787,13 +590,13 @@
         <w:pStyle w:val="FirstParagraph"/>
       </w:pPr>
       <w:r>
-        <w:t xml:space="preserve">This resulted in X total models in the candidate model set for each species.</w:t>
-      </w:r>
-      <w:r>
-        <w:t xml:space="preserve"> </w:t>
-      </w:r>
-      <w:r>
-        <w:t xml:space="preserve">To avoid introducing species as a factor in our models, we analyzed each of the four species released in 2023 separately rather than as a combined data set.</w:t>
+        <w:t xml:space="preserve">This resulted in 12 total models in the candidate model set.</w:t>
+      </w:r>
+      <w:r>
+        <w:t xml:space="preserve"> </w:t>
+      </w:r>
+      <w:r>
+        <w:t xml:space="preserve">We analyzed each site separately because there was limited connectivity between sites.</w:t>
       </w:r>
     </w:p>
     <w:p>
@@ -801,7 +604,7 @@
         <w:pStyle w:val="BodyText"/>
       </w:pPr>
       <w:r>
-        <w:t xml:space="preserve">We analyzed our set of candidate models using Program MARK (</w:t>
+        <w:t xml:space="preserve">For each site, we analyzed our set of candidate models using Program MARK (</w:t>
       </w:r>
       <w:r>
         <w:t xml:space="preserve">White and Burnham (1999)</w:t>
@@ -1128,25 +931,7 @@
         <w:t xml:space="preserve"> </w:t>
       </w:r>
       <w:r>
-        <w:t xml:space="preserve">However, top models for both species had issues estimating survival, especially on the last occasion.</w:t>
-      </w:r>
-      <w:r>
-        <w:t xml:space="preserve"> </w:t>
-      </w:r>
-      <w:r>
-        <w:t xml:space="preserve">This is not uncommon in parameters that are modeled as fully time-dependent, especially when capture rates are relatively low.</w:t>
-      </w:r>
-      <w:r>
-        <w:t xml:space="preserve"> </w:t>
-      </w:r>
-      <w:r>
-        <w:t xml:space="preserve">For purposes of estimating survival and abundance, we decided to use the subset of the top model where time was removed as a factor for apparent survival (i.e, survival does not vary with time).</w:t>
-      </w:r>
-      <w:r>
-        <w:t xml:space="preserve"> </w:t>
-      </w:r>
-      <w:r>
-        <w:t xml:space="preserve">We based all estimates of survival and abundance on this model for each species.</w:t>
+        <w:t xml:space="preserve">Based on this analysis, we selected the preferred model.</w:t>
       </w:r>
     </w:p>
     <w:p>
@@ -1154,20 +939,124 @@
         <w:pStyle w:val="BodyText"/>
       </w:pPr>
       <w:r>
-        <w:t xml:space="preserve">Finally, many of the mussels released by FMCC in 2023 were either untagged or tagged in a manner that did not allow for the specific mussel to be identified in the future (e.g., green squares with no unique identifier).</w:t>
-      </w:r>
-      <w:r>
-        <w:t xml:space="preserve"> </w:t>
-      </w:r>
-      <w:r>
-        <w:t xml:space="preserve">We assumed that the survival estimates for uniquely tagged mussels was the same for non-uniquely tagged and untagged mussels released by FMCC.</w:t>
-      </w:r>
-      <w:r>
-        <w:t xml:space="preserve"> </w:t>
-      </w:r>
-      <w:r>
-        <w:t xml:space="preserve">Thus, we applied the estimated survival rates to the entire release cohort for FMCC (unique, non-unique, and untagged) to estimate abundance for all mussels for each species.</w:t>
-      </w:r>
+        <w:t xml:space="preserve">Finally, we calculated the expected abundance using survival estimates for the selected model of each site.</w:t>
+      </w:r>
+      <w:r>
+        <w:t xml:space="preserve"> </w:t>
+      </w:r>
+      <w:r>
+        <w:t xml:space="preserve">The Burnham model does not directly calculate abundance as either a real or derived parameter.</w:t>
+      </w:r>
+      <w:r>
+        <w:t xml:space="preserve"> </w:t>
+      </w:r>
+      <w:r>
+        <w:t xml:space="preserve">For this study, we were tracking a single release cohort over time.</w:t>
+      </w:r>
+      <w:r>
+        <w:t xml:space="preserve"> </w:t>
+      </w:r>
+      <w:r>
+        <w:t xml:space="preserve">Consequently we calculated the expected abundance using survival estimates from the selected model of each site.</w:t>
+      </w:r>
+      <w:r>
+        <w:t xml:space="preserve"> </w:t>
+      </w:r>
+      <m:oMath>
+        <m:sSub>
+          <m:e>
+            <m:r>
+              <m:t>S</m:t>
+            </m:r>
+          </m:e>
+          <m:sub>
+            <m:d>
+              <m:dPr>
+                <m:begChr m:val="("/>
+                <m:sepChr m:val=""/>
+                <m:endChr m:val=")"/>
+                <m:grow/>
+              </m:dPr>
+              <m:e>
+                <m:r>
+                  <m:t>t</m:t>
+                </m:r>
+                <m:r>
+                  <m:t>i</m:t>
+                </m:r>
+                <m:r>
+                  <m:t>m</m:t>
+                </m:r>
+                <m:r>
+                  <m:t>e</m:t>
+                </m:r>
+              </m:e>
+            </m:d>
+          </m:sub>
+        </m:sSub>
+        <m:sSub>
+          <m:e>
+            <m:r>
+              <m:t>p</m:t>
+            </m:r>
+          </m:e>
+          <m:sub>
+            <m:d>
+              <m:dPr>
+                <m:begChr m:val="("/>
+                <m:sepChr m:val=""/>
+                <m:endChr m:val=")"/>
+                <m:grow/>
+              </m:dPr>
+              <m:e>
+                <m:r>
+                  <m:t>y</m:t>
+                </m:r>
+                <m:r>
+                  <m:t>e</m:t>
+                </m:r>
+                <m:r>
+                  <m:t>a</m:t>
+                </m:r>
+                <m:r>
+                  <m:t>r</m:t>
+                </m:r>
+              </m:e>
+            </m:d>
+          </m:sub>
+        </m:sSub>
+        <m:sSub>
+          <m:e>
+            <m:r>
+              <m:t>r</m:t>
+            </m:r>
+          </m:e>
+          <m:sub>
+            <m:d>
+              <m:dPr>
+                <m:begChr m:val="("/>
+                <m:sepChr m:val=""/>
+                <m:endChr m:val=")"/>
+                <m:grow/>
+              </m:dPr>
+              <m:e>
+                <m:r>
+                  <m:t>y</m:t>
+                </m:r>
+                <m:r>
+                  <m:t>e</m:t>
+                </m:r>
+                <m:r>
+                  <m:t>a</m:t>
+                </m:r>
+                <m:r>
+                  <m:t>r</m:t>
+                </m:r>
+              </m:e>
+            </m:d>
+          </m:sub>
+        </m:sSub>
+      </m:oMath>
     </w:p>
     <w:p>
       <w:r>
@@ -1176,7 +1065,7 @@
     </w:p>
     <w:bookmarkEnd w:id="22"/>
     <w:bookmarkEnd w:id="23"/>
-    <w:bookmarkStart w:id="31" w:name="references"/>
+    <w:bookmarkStart w:id="29" w:name="references"/>
     <w:p>
       <w:pPr>
         <w:pStyle w:val="Heading1"/>
@@ -1185,7 +1074,7 @@
         <w:t xml:space="preserve">2. References</w:t>
       </w:r>
     </w:p>
-    <w:bookmarkStart w:id="30" w:name="refs"/>
+    <w:bookmarkStart w:id="28" w:name="refs"/>
     <w:bookmarkStart w:id="24" w:name="X437bd82681b6244afc723f1058a320799156d9d"/>
     <w:p>
       <w:pPr>
@@ -1346,98 +1235,7 @@
       </w:r>
     </w:p>
     <w:bookmarkEnd w:id="25"/>
-    <w:bookmarkStart w:id="27" w:name="X3254a0e48116d81b135d4cb78a384358a506e8f"/>
-    <w:p>
-      <w:pPr>
-        <w:pStyle w:val="Bibliography"/>
-      </w:pPr>
-      <w:r>
-        <w:t xml:space="preserve">Schwarz, Carl James, and A. Neil Arnason. 1996.</w:t>
-      </w:r>
-      <w:r>
-        <w:t xml:space="preserve"> </w:t>
-      </w:r>
-      <w:r>
-        <w:t xml:space="preserve">“A</w:t>
-      </w:r>
-      <w:r>
-        <w:t xml:space="preserve"> </w:t>
-      </w:r>
-      <w:r>
-        <w:t xml:space="preserve">General Methodology</w:t>
-      </w:r>
-      <w:r>
-        <w:t xml:space="preserve"> </w:t>
-      </w:r>
-      <w:r>
-        <w:t xml:space="preserve">for the</w:t>
-      </w:r>
-      <w:r>
-        <w:t xml:space="preserve"> </w:t>
-      </w:r>
-      <w:r>
-        <w:t xml:space="preserve">Analysis</w:t>
-      </w:r>
-      <w:r>
-        <w:t xml:space="preserve"> </w:t>
-      </w:r>
-      <w:r>
-        <w:t xml:space="preserve">of</w:t>
-      </w:r>
-      <w:r>
-        <w:t xml:space="preserve"> </w:t>
-      </w:r>
-      <w:r>
-        <w:t xml:space="preserve">Capture-Recapture Experiments</w:t>
-      </w:r>
-      <w:r>
-        <w:t xml:space="preserve"> </w:t>
-      </w:r>
-      <w:r>
-        <w:t xml:space="preserve">in</w:t>
-      </w:r>
-      <w:r>
-        <w:t xml:space="preserve"> </w:t>
-      </w:r>
-      <w:r>
-        <w:t xml:space="preserve">Open Populations</w:t>
-      </w:r>
-      <w:r>
-        <w:t xml:space="preserve">.”</w:t>
-      </w:r>
-      <w:r>
-        <w:t xml:space="preserve"> </w:t>
-      </w:r>
-      <w:r>
-        <w:rPr>
-          <w:i/>
-          <w:iCs/>
-        </w:rPr>
-        <w:t xml:space="preserve">Biometrics</w:t>
-      </w:r>
-      <w:r>
-        <w:t xml:space="preserve"> </w:t>
-      </w:r>
-      <w:r>
-        <w:t xml:space="preserve">52 (3): 860–73.</w:t>
-      </w:r>
-      <w:r>
-        <w:t xml:space="preserve"> </w:t>
-      </w:r>
-      <w:hyperlink r:id="rId26">
-        <w:r>
-          <w:rPr>
-            <w:rStyle w:val="Hyperlink"/>
-          </w:rPr>
-          <w:t xml:space="preserve">https://doi.org/10.2307/2533048</w:t>
-        </w:r>
-      </w:hyperlink>
-      <w:r>
-        <w:t xml:space="preserve">.</w:t>
-      </w:r>
-    </w:p>
-    <w:bookmarkEnd w:id="27"/>
-    <w:bookmarkStart w:id="28" w:name="ref-sugiura_1978_FurtherAnalysisData"/>
+    <w:bookmarkStart w:id="26" w:name="ref-sugiura_1978_FurtherAnalysisData"/>
     <w:p>
       <w:pPr>
         <w:pStyle w:val="Bibliography"/>
@@ -1486,8 +1284,8 @@
         <w:t xml:space="preserve">7 (1): 13–26.</w:t>
       </w:r>
     </w:p>
-    <w:bookmarkEnd w:id="28"/>
-    <w:bookmarkStart w:id="29" w:name="Xe040a3ee9170c3970aba188ecc23934f91c03aa"/>
+    <w:bookmarkEnd w:id="26"/>
+    <w:bookmarkStart w:id="27" w:name="Xe040a3ee9170c3970aba188ecc23934f91c03aa"/>
     <w:p>
       <w:pPr>
         <w:pStyle w:val="Bibliography"/>
@@ -1527,9 +1325,9 @@
         <w:t xml:space="preserve">46 (S1): S120–39.</w:t>
       </w:r>
     </w:p>
+    <w:bookmarkEnd w:id="27"/>
+    <w:bookmarkEnd w:id="28"/>
     <w:bookmarkEnd w:id="29"/>
-    <w:bookmarkEnd w:id="30"/>
-    <w:bookmarkEnd w:id="31"/>
     <w:sectPr>
       <w:pgSz w:h="15840" w:w="12240"/>
       <w:pgMar w:bottom="1440" w:footer="720" w:gutter="0" w:header="720" w:left="1440" w:right="1440" w:top="1440"/>
@@ -1760,36 +1558,6 @@
     </w:lvlOverride>
   </w:num>
   <w:num w:numId="1002">
-    <w:abstractNumId w:val="99421"/>
-    <w:lvlOverride w:ilvl="0">
-      <w:startOverride w:val="1"/>
-    </w:lvlOverride>
-    <w:lvlOverride w:ilvl="1">
-      <w:startOverride w:val="1"/>
-    </w:lvlOverride>
-    <w:lvlOverride w:ilvl="2">
-      <w:startOverride w:val="1"/>
-    </w:lvlOverride>
-    <w:lvlOverride w:ilvl="3">
-      <w:startOverride w:val="1"/>
-    </w:lvlOverride>
-    <w:lvlOverride w:ilvl="4">
-      <w:startOverride w:val="1"/>
-    </w:lvlOverride>
-    <w:lvlOverride w:ilvl="5">
-      <w:startOverride w:val="1"/>
-    </w:lvlOverride>
-    <w:lvlOverride w:ilvl="6">
-      <w:startOverride w:val="1"/>
-    </w:lvlOverride>
-    <w:lvlOverride w:ilvl="7">
-      <w:startOverride w:val="1"/>
-    </w:lvlOverride>
-    <w:lvlOverride w:ilvl="8">
-      <w:startOverride w:val="1"/>
-    </w:lvlOverride>
-  </w:num>
-  <w:num w:numId="1003">
     <w:abstractNumId w:val="99421"/>
     <w:lvlOverride w:ilvl="0">
       <w:startOverride w:val="1"/>

</xml_diff>

<commit_message>
doc: add figures to report
</commit_message>
<xml_diff>
--- a/doc/Report/reston_mark_recapture_methods_results_v0.1.docx
+++ b/doc/Report/reston_mark_recapture_methods_results_v0.1.docx
@@ -959,6 +959,54 @@
       <w:r>
         <w:t xml:space="preserve">Consequently we calculated the expected abundance using survival estimates from the selected model of each site.</w:t>
       </w:r>
+    </w:p>
+    <w:bookmarkEnd w:id="22"/>
+    <w:bookmarkEnd w:id="23"/>
+    <w:bookmarkStart w:id="24" w:name="results"/>
+    <w:p>
+      <w:pPr>
+        <w:pStyle w:val="Heading1"/>
+      </w:pPr>
+      <w:r>
+        <w:t xml:space="preserve">2. Results</w:t>
+      </w:r>
+    </w:p>
+    <w:p>
+      <w:pPr>
+        <w:pStyle w:val="FirstParagraph"/>
+      </w:pPr>
+      <w:r>
+        <w:t xml:space="preserve">The top model for Snakeden Run based on</w:t>
+      </w:r>
+      <w:r>
+        <w:t xml:space="preserve"> </w:t>
+      </w:r>
+      <m:oMath>
+        <m:r>
+          <m:t>A</m:t>
+        </m:r>
+        <m:r>
+          <m:t>I</m:t>
+        </m:r>
+        <m:sSub>
+          <m:e>
+            <m:r>
+              <m:t>C</m:t>
+            </m:r>
+          </m:e>
+          <m:sub>
+            <m:r>
+              <m:t>c</m:t>
+            </m:r>
+          </m:sub>
+        </m:sSub>
+      </m:oMath>
+      <w:r>
+        <w:t xml:space="preserve"> </w:t>
+      </w:r>
+      <w:r>
+        <w:t xml:space="preserve">was</w:t>
+      </w:r>
       <w:r>
         <w:t xml:space="preserve"> </w:t>
       </w:r>
@@ -1057,25 +1105,897 @@
           </m:sub>
         </m:sSub>
       </m:oMath>
+      <w:r>
+        <w:t xml:space="preserve">.</w:t>
+      </w:r>
+      <w:r>
+        <w:t xml:space="preserve"> </w:t>
+      </w:r>
+      <w:r>
+        <w:t xml:space="preserve">However, estimates for several</w:t>
+      </w:r>
+      <w:r>
+        <w:t xml:space="preserve"> </w:t>
+      </w:r>
+      <m:oMath>
+        <m:r>
+          <m:t>r</m:t>
+        </m:r>
+      </m:oMath>
+      <w:r>
+        <w:t xml:space="preserve"> </w:t>
+      </w:r>
+      <w:r>
+        <w:t xml:space="preserve">parameters failed to converge.</w:t>
+      </w:r>
+      <w:r>
+        <w:t xml:space="preserve"> </w:t>
+      </w:r>
+      <w:r>
+        <w:t xml:space="preserve">Similarly, the second model (S_(time) p_(.) r_(year)), had similar convergence issues for some</w:t>
+      </w:r>
+      <w:r>
+        <w:t xml:space="preserve"> </w:t>
+      </w:r>
+      <m:oMath>
+        <m:r>
+          <m:t>r</m:t>
+        </m:r>
+      </m:oMath>
+      <w:r>
+        <w:t xml:space="preserve"> </w:t>
+      </w:r>
+      <w:r>
+        <w:t xml:space="preserve">parameters.</w:t>
+      </w:r>
+      <w:r>
+        <w:t xml:space="preserve"> </w:t>
+      </w:r>
+      <w:r>
+        <w:t xml:space="preserve">Consequently, we selected the third model (</w:t>
+      </w:r>
+      <m:oMath>
+        <m:sSub>
+          <m:e>
+            <m:r>
+              <m:t>S</m:t>
+            </m:r>
+          </m:e>
+          <m:sub>
+            <m:d>
+              <m:dPr>
+                <m:begChr m:val="("/>
+                <m:sepChr m:val=""/>
+                <m:endChr m:val=")"/>
+                <m:grow/>
+              </m:dPr>
+              <m:e>
+                <m:r>
+                  <m:t>t</m:t>
+                </m:r>
+                <m:r>
+                  <m:t>i</m:t>
+                </m:r>
+                <m:r>
+                  <m:t>m</m:t>
+                </m:r>
+                <m:r>
+                  <m:t>e</m:t>
+                </m:r>
+              </m:e>
+            </m:d>
+          </m:sub>
+        </m:sSub>
+        <m:sSub>
+          <m:e>
+            <m:r>
+              <m:t>p</m:t>
+            </m:r>
+          </m:e>
+          <m:sub>
+            <m:d>
+              <m:dPr>
+                <m:begChr m:val="("/>
+                <m:sepChr m:val=""/>
+                <m:endChr m:val=")"/>
+                <m:grow/>
+              </m:dPr>
+              <m:e>
+                <m:r>
+                  <m:rPr>
+                    <m:sty m:val="p"/>
+                  </m:rPr>
+                  <m:t>.</m:t>
+                </m:r>
+              </m:e>
+            </m:d>
+          </m:sub>
+        </m:sSub>
+        <m:sSub>
+          <m:e>
+            <m:r>
+              <m:t>r</m:t>
+            </m:r>
+          </m:e>
+          <m:sub>
+            <m:d>
+              <m:dPr>
+                <m:begChr m:val="("/>
+                <m:sepChr m:val=""/>
+                <m:endChr m:val=")"/>
+                <m:grow/>
+              </m:dPr>
+              <m:e>
+                <m:r>
+                  <m:rPr>
+                    <m:sty m:val="p"/>
+                  </m:rPr>
+                  <m:t>.</m:t>
+                </m:r>
+              </m:e>
+            </m:d>
+          </m:sub>
+        </m:sSub>
+      </m:oMath>
+      <w:r>
+        <w:t xml:space="preserve">) for estimating survival and abundance at Snakeden Run.</w:t>
+      </w:r>
     </w:p>
     <w:p>
+      <w:pPr>
+        <w:pStyle w:val="BodyText"/>
+      </w:pPr>
+      <w:r>
+        <w:t xml:space="preserve">The top model for Glade Run was (</w:t>
+      </w:r>
+      <m:oMath>
+        <m:sSub>
+          <m:e>
+            <m:r>
+              <m:t>S</m:t>
+            </m:r>
+          </m:e>
+          <m:sub>
+            <m:d>
+              <m:dPr>
+                <m:begChr m:val="("/>
+                <m:sepChr m:val=""/>
+                <m:endChr m:val=")"/>
+                <m:grow/>
+              </m:dPr>
+              <m:e>
+                <m:r>
+                  <m:t>t</m:t>
+                </m:r>
+                <m:r>
+                  <m:t>i</m:t>
+                </m:r>
+                <m:r>
+                  <m:t>m</m:t>
+                </m:r>
+                <m:r>
+                  <m:t>e</m:t>
+                </m:r>
+              </m:e>
+            </m:d>
+          </m:sub>
+        </m:sSub>
+        <m:sSub>
+          <m:e>
+            <m:r>
+              <m:t>p</m:t>
+            </m:r>
+          </m:e>
+          <m:sub>
+            <m:d>
+              <m:dPr>
+                <m:begChr m:val="("/>
+                <m:sepChr m:val=""/>
+                <m:endChr m:val=")"/>
+                <m:grow/>
+              </m:dPr>
+              <m:e>
+                <m:r>
+                  <m:t>y</m:t>
+                </m:r>
+                <m:r>
+                  <m:t>e</m:t>
+                </m:r>
+                <m:r>
+                  <m:t>a</m:t>
+                </m:r>
+                <m:r>
+                  <m:t>r</m:t>
+                </m:r>
+              </m:e>
+            </m:d>
+          </m:sub>
+        </m:sSub>
+        <m:sSub>
+          <m:e>
+            <m:r>
+              <m:t>r</m:t>
+            </m:r>
+          </m:e>
+          <m:sub>
+            <m:d>
+              <m:dPr>
+                <m:begChr m:val="("/>
+                <m:sepChr m:val=""/>
+                <m:endChr m:val=")"/>
+                <m:grow/>
+              </m:dPr>
+              <m:e>
+                <m:r>
+                  <m:t>y</m:t>
+                </m:r>
+                <m:r>
+                  <m:t>e</m:t>
+                </m:r>
+                <m:r>
+                  <m:t>a</m:t>
+                </m:r>
+                <m:r>
+                  <m:t>r</m:t>
+                </m:r>
+              </m:e>
+            </m:d>
+          </m:sub>
+        </m:sSub>
+      </m:oMath>
+      <w:r>
+        <w:t xml:space="preserve">).</w:t>
+      </w:r>
+      <w:r>
+        <w:t xml:space="preserve"> </w:t>
+      </w:r>
+      <w:r>
+        <w:t xml:space="preserve">Some estimates of both</w:t>
+      </w:r>
+      <w:r>
+        <w:t xml:space="preserve"> </w:t>
+      </w:r>
+      <m:oMath>
+        <m:r>
+          <m:t>S</m:t>
+        </m:r>
+      </m:oMath>
+      <w:r>
+        <w:t xml:space="preserve"> </w:t>
+      </w:r>
+      <w:r>
+        <w:t xml:space="preserve">and</w:t>
+      </w:r>
+      <w:r>
+        <w:t xml:space="preserve"> </w:t>
+      </w:r>
+      <m:oMath>
+        <m:r>
+          <m:t>r</m:t>
+        </m:r>
+      </m:oMath>
+      <w:r>
+        <w:t xml:space="preserve"> </w:t>
+      </w:r>
+      <w:r>
+        <w:t xml:space="preserve">parameters failed to converge.</w:t>
+      </w:r>
+      <w:r>
+        <w:t xml:space="preserve"> </w:t>
+      </w:r>
+      <w:r>
+        <w:t xml:space="preserve">Consequently we selected the second model (</w:t>
+      </w:r>
+      <m:oMath>
+        <m:sSub>
+          <m:e>
+            <m:r>
+              <m:t>S</m:t>
+            </m:r>
+          </m:e>
+          <m:sub>
+            <m:d>
+              <m:dPr>
+                <m:begChr m:val="("/>
+                <m:sepChr m:val=""/>
+                <m:endChr m:val=")"/>
+                <m:grow/>
+              </m:dPr>
+              <m:e>
+                <m:r>
+                  <m:t>t</m:t>
+                </m:r>
+                <m:r>
+                  <m:t>i</m:t>
+                </m:r>
+                <m:r>
+                  <m:t>m</m:t>
+                </m:r>
+                <m:r>
+                  <m:t>e</m:t>
+                </m:r>
+              </m:e>
+            </m:d>
+          </m:sub>
+        </m:sSub>
+        <m:sSub>
+          <m:e>
+            <m:r>
+              <m:t>p</m:t>
+            </m:r>
+          </m:e>
+          <m:sub>
+            <m:d>
+              <m:dPr>
+                <m:begChr m:val="("/>
+                <m:sepChr m:val=""/>
+                <m:endChr m:val=")"/>
+                <m:grow/>
+              </m:dPr>
+              <m:e>
+                <m:r>
+                  <m:t>y</m:t>
+                </m:r>
+                <m:r>
+                  <m:t>e</m:t>
+                </m:r>
+                <m:r>
+                  <m:t>a</m:t>
+                </m:r>
+                <m:r>
+                  <m:t>r</m:t>
+                </m:r>
+              </m:e>
+            </m:d>
+          </m:sub>
+        </m:sSub>
+        <m:sSub>
+          <m:e>
+            <m:r>
+              <m:t>r</m:t>
+            </m:r>
+          </m:e>
+          <m:sub>
+            <m:d>
+              <m:dPr>
+                <m:begChr m:val="("/>
+                <m:sepChr m:val=""/>
+                <m:endChr m:val=")"/>
+                <m:grow/>
+              </m:dPr>
+              <m:e>
+                <m:r>
+                  <m:rPr>
+                    <m:sty m:val="p"/>
+                  </m:rPr>
+                  <m:t>.</m:t>
+                </m:r>
+              </m:e>
+            </m:d>
+          </m:sub>
+        </m:sSub>
+      </m:oMath>
+      <w:r>
+        <w:t xml:space="preserve">) for estimating survival and abundance at Glade Run.</w:t>
+      </w:r>
+    </w:p>
+    <w:p>
+      <w:pPr>
+        <w:pStyle w:val="BodyText"/>
+      </w:pPr>
+      <w:r>
+        <w:t xml:space="preserve">Survival estimates ranged from X to Y at Snakeden Run and X to Y at Glade Run (Table reference and</w:t>
+      </w:r>
+      <w:r>
+        <w:t xml:space="preserve"> </w:t>
+      </w:r>
+      <w:hyperlink w:anchor="fig-survival">
+        <w:r>
+          <w:rPr>
+            <w:rStyle w:val="Hyperlink"/>
+          </w:rPr>
+          <w:t xml:space="preserve">Figure 1</w:t>
+        </w:r>
+      </w:hyperlink>
+      <w:r>
+        <w:t xml:space="preserve">).</w:t>
+      </w:r>
+    </w:p>
+    <w:p>
+      <w:pPr>
+        <w:pStyle w:val="BodyText"/>
+      </w:pPr>
+      <w:r>
+        <w:t xml:space="preserve">Abundance estimates ranged from X to Y at Snakeden Run and X to Y at Glade Run.</w:t>
+      </w:r>
+      <w:r>
+        <w:br/>
+      </w:r>
+      <w:r>
+        <w:t xml:space="preserve">These estimates were directly derived from the release cohort and survival estimates of each site.</w:t>
+      </w:r>
+    </w:p>
+    <w:p>
+      <w:pPr>
+        <w:pStyle w:val="BodyText"/>
+      </w:pPr>
+      <w:r>
+        <w:t xml:space="preserve">Similar to apparent survival, abundance estimates were higher for the Harrison Lake cohorts for both species.</w:t>
+      </w:r>
+      <w:r>
+        <w:t xml:space="preserve"> </w:t>
+      </w:r>
+      <w:r>
+        <w:t xml:space="preserve">This difference was less pronounced when reporting abundance estimates as a percentage of the size of the release cohort (</w:t>
+      </w:r>
+      <w:hyperlink w:anchor="fig-abundance">
+        <w:r>
+          <w:rPr>
+            <w:rStyle w:val="Hyperlink"/>
+          </w:rPr>
+          <w:t xml:space="preserve">Figure 2</w:t>
+        </w:r>
+      </w:hyperlink>
+      <w:r>
+        <w:t xml:space="preserve">).</w:t>
+      </w:r>
+      <w:r>
+        <w:t xml:space="preserve"> </w:t>
+      </w:r>
+      <w:r>
+        <w:t xml:space="preserve">In either case, abundance estimates of the uniquely tagged FMCC cohorts were substantially lower than Harrison Lake cohorts.</w:t>
+      </w:r>
+      <w:r>
+        <w:t xml:space="preserve"> </w:t>
+      </w:r>
+      <w:r>
+        <w:t xml:space="preserve">However, FMCC released a substantial number of non-uniquely tagged and untagged mussels.</w:t>
+      </w:r>
+      <w:r>
+        <w:t xml:space="preserve"> </w:t>
+      </w:r>
+      <w:r>
+        <w:t xml:space="preserve">Applying the estimated survival to the entire release cohort of FMCC mussels resulted in abundance estimates ranging from X to Y for</w:t>
+      </w:r>
+      <w:r>
+        <w:t xml:space="preserve"> </w:t>
+      </w:r>
+      <w:r>
+        <w:rPr>
+          <w:i/>
+          <w:iCs/>
+        </w:rPr>
+        <w:t xml:space="preserve">A. varicosa</w:t>
+      </w:r>
+      <w:r>
+        <w:t xml:space="preserve"> </w:t>
+      </w:r>
+      <w:r>
+        <w:t xml:space="preserve">and X to Y for</w:t>
+      </w:r>
+      <w:r>
+        <w:t xml:space="preserve"> </w:t>
+      </w:r>
+      <w:r>
+        <w:rPr>
+          <w:i/>
+          <w:iCs/>
+        </w:rPr>
+        <w:t xml:space="preserve">E. complanata</w:t>
+      </w:r>
+      <w:r>
+        <w:t xml:space="preserve"> </w:t>
+      </w:r>
+      <w:r>
+        <w:t xml:space="preserve">(tbl-abundance_all and fig-abundance-all).</w:t>
+      </w:r>
+    </w:p>
+    <w:bookmarkEnd w:id="24"/>
+    <w:bookmarkStart w:id="25" w:name="discussion"/>
+    <w:p>
+      <w:pPr>
+        <w:pStyle w:val="Heading1"/>
+      </w:pPr>
+      <w:r>
+        <w:t xml:space="preserve">3. Discussion</w:t>
+      </w:r>
+    </w:p>
+    <w:p>
+      <w:pPr>
+        <w:pStyle w:val="FirstParagraph"/>
+      </w:pPr>
+      <w:r>
+        <w:t xml:space="preserve">Survival was higher at Glade Run for all occasions. This is possibly due to the higher gradient</w:t>
+      </w:r>
+      <w:r>
+        <w:t xml:space="preserve"> </w:t>
+      </w:r>
+      <w:r>
+        <w:rPr>
+          <w:b/>
+          <w:bCs/>
+        </w:rPr>
+        <w:t xml:space="preserve">See report for description here</w:t>
+      </w:r>
+      <w:r>
+        <w:t xml:space="preserve">.</w:t>
+      </w:r>
+      <w:r>
+        <w:t xml:space="preserve"> </w:t>
+      </w:r>
+      <w:r>
+        <w:t xml:space="preserve">Abundance estimates seem to match naive estimates of abundance based on raw number of mussels observed alive at each occasion.</w:t>
+      </w:r>
+      <w:r>
+        <w:t xml:space="preserve"> </w:t>
+      </w:r>
+      <w:r>
+        <w:t xml:space="preserve">However, it is possible that our survival estimates are slightly underestimated compared to true survival.</w:t>
+      </w:r>
+      <w:r>
+        <w:t xml:space="preserve"> </w:t>
+      </w:r>
+      <w:r>
+        <w:t xml:space="preserve">There was high tag loss (</w:t>
+      </w:r>
+      <w:r>
+        <w:rPr>
+          <w:b/>
+          <w:bCs/>
+        </w:rPr>
+        <w:t xml:space="preserve">%here</w:t>
+      </w:r>
+      <w:r>
+        <w:t xml:space="preserve">) at each site.</w:t>
+      </w:r>
+      <w:r>
+        <w:t xml:space="preserve"> </w:t>
+      </w:r>
+      <w:r>
+        <w:t xml:space="preserve">Individuals with lost tags are modeled as if they were not seen again, which has the effect of underestiamting survival (</w:t>
+      </w:r>
+      <w:r>
+        <w:rPr>
+          <w:b/>
+          <w:bCs/>
+        </w:rPr>
+        <w:t xml:space="preserve">reference</w:t>
+      </w:r>
+      <w:r>
+        <w:t xml:space="preserve">)</w:t>
+      </w:r>
+    </w:p>
+    <w:p>
+      <w:pPr>
+        <w:pStyle w:val="BodyText"/>
+      </w:pPr>
+      <w:r>
+        <w:t xml:space="preserve">Survival was generally higher for Harrison Lake cohorts compared to FMCC for each species.</w:t>
+      </w:r>
+      <w:r>
+        <w:t xml:space="preserve"> </w:t>
+      </w:r>
+      <w:r>
+        <w:t xml:space="preserve">One possible reason for this is because FMCC released smaller individuals than Harrison Lake.</w:t>
+      </w:r>
+      <w:r>
+        <w:t xml:space="preserve"> </w:t>
+      </w:r>
+      <w:r>
+        <w:t xml:space="preserve">We would expect these smaller mussels to have a lower survival rate than older, larger mussels.</w:t>
+      </w:r>
+      <w:r>
+        <w:t xml:space="preserve"> </w:t>
+      </w:r>
+      <w:r>
+        <w:t xml:space="preserve">This effect was more pronounced for</w:t>
+      </w:r>
+      <w:r>
+        <w:t xml:space="preserve"> </w:t>
+      </w:r>
+      <w:r>
+        <w:rPr>
+          <w:i/>
+          <w:iCs/>
+        </w:rPr>
+        <w:t xml:space="preserve">A. varicosa</w:t>
+      </w:r>
+      <w:r>
+        <w:t xml:space="preserve">.</w:t>
+      </w:r>
+      <w:r>
+        <w:t xml:space="preserve"> </w:t>
+      </w:r>
+      <w:r>
+        <w:t xml:space="preserve">While smaller sizes likely contributed to this, it is also possible that the small size and low recapture rate of the FMCC release cohort of</w:t>
+      </w:r>
+      <w:r>
+        <w:t xml:space="preserve"> </w:t>
+      </w:r>
+      <w:r>
+        <w:rPr>
+          <w:i/>
+          <w:iCs/>
+        </w:rPr>
+        <w:t xml:space="preserve">A. varicosa</w:t>
+      </w:r>
+      <w:r>
+        <w:t xml:space="preserve"> </w:t>
+      </w:r>
+      <w:r>
+        <w:t xml:space="preserve">affected estimates of survival.</w:t>
+      </w:r>
+      <w:r>
+        <w:t xml:space="preserve"> </w:t>
+      </w:r>
+      <w:r>
+        <w:t xml:space="preserve">The model used for estimation did not allow detectability to vary between facilities.</w:t>
+      </w:r>
+      <w:r>
+        <w:t xml:space="preserve"> </w:t>
+      </w:r>
+      <w:r>
+        <w:t xml:space="preserve">However, of the 34 uniquely tagged mussels released by FMCC, we observed only 4 at least once over all sampling occasions, whereas 211 of the 245 Harrison Lake releases were observed.</w:t>
+      </w:r>
+      <w:r>
+        <w:t xml:space="preserve"> </w:t>
+      </w:r>
+      <w:r>
+        <w:t xml:space="preserve">It is more likely that the data for uniquely tagged, FMCC</w:t>
+      </w:r>
+      <w:r>
+        <w:t xml:space="preserve"> </w:t>
+      </w:r>
+      <w:r>
+        <w:rPr>
+          <w:i/>
+          <w:iCs/>
+        </w:rPr>
+        <w:t xml:space="preserve">A. varicosa</w:t>
+      </w:r>
+      <w:r>
+        <w:t xml:space="preserve"> </w:t>
+      </w:r>
+      <w:r>
+        <w:t xml:space="preserve">were too sparse for our selected model to estimate their detectability separately from Harrison Lake releases.</w:t>
+      </w:r>
+      <w:r>
+        <w:t xml:space="preserve"> </w:t>
+      </w:r>
+      <w:r>
+        <w:t xml:space="preserve">Given that the selected model assumes detectability is high and that survival estimates are linked to detectability, we expect that the true survival for FMCC</w:t>
+      </w:r>
+      <w:r>
+        <w:t xml:space="preserve"> </w:t>
+      </w:r>
+      <w:r>
+        <w:rPr>
+          <w:i/>
+          <w:iCs/>
+        </w:rPr>
+        <w:t xml:space="preserve">A. varicosa</w:t>
+      </w:r>
+      <w:r>
+        <w:t xml:space="preserve"> </w:t>
+      </w:r>
+      <w:r>
+        <w:t xml:space="preserve">is likely somewhat higher than estimated here.</w:t>
+      </w:r>
+      <w:r>
+        <w:t xml:space="preserve"> </w:t>
+      </w:r>
+      <w:r>
+        <w:t xml:space="preserve">Essentially, if detectability is high and the data indicates very few mussels were observed, then survival must by necessity be low.</w:t>
+      </w:r>
+    </w:p>
+    <w:bookmarkEnd w:id="25"/>
+    <w:bookmarkStart w:id="34" w:name="figures"/>
+    <w:p>
+      <w:pPr>
+        <w:pStyle w:val="Heading1"/>
+      </w:pPr>
+      <w:r>
+        <w:t xml:space="preserve">4. Figures</w:t>
+      </w:r>
+    </w:p>
+    <w:tbl>
+      <w:tblPr>
+        <w:tblStyle w:val="Table"/>
+        <w:tblW w:type="pct" w:w="5000"/>
+        <w:tblLayout w:type="fixed"/>
+        <w:tblLook w:firstRow="0" w:lastRow="0" w:firstColumn="0" w:lastColumn="0" w:noHBand="0" w:noVBand="0" w:val="0000"/>
+      </w:tblPr>
+      <w:tblGrid>
+        <w:gridCol w:w="7920"/>
+      </w:tblGrid>
+      <w:tr>
+        <w:tc>
+          <w:tcPr/>
+          <w:bookmarkStart w:id="29" w:name="fig-survival"/>
+          <w:p>
+            <w:pPr>
+              <w:pStyle w:val="Compact"/>
+              <w:jc w:val="center"/>
+            </w:pPr>
+            <w:r>
+              <w:drawing>
+                <wp:inline>
+                  <wp:extent cx="3810000" cy="2540000"/>
+                  <wp:effectExtent b="0" l="0" r="0" t="0"/>
+                  <wp:docPr descr="" title="" id="27" name="Picture"/>
+                  <a:graphic>
+                    <a:graphicData uri="http://schemas.openxmlformats.org/drawingml/2006/picture">
+                      <pic:pic>
+                        <pic:nvPicPr>
+                          <pic:cNvPr descr="../../results/figures/05a_alt_model_results/Figure_1_survival_selected_model.jpg" id="28" name="Picture"/>
+                          <pic:cNvPicPr>
+                            <a:picLocks noChangeArrowheads="1" noChangeAspect="1"/>
+                          </pic:cNvPicPr>
+                        </pic:nvPicPr>
+                        <pic:blipFill>
+                          <a:blip r:embed="rId26"/>
+                          <a:stretch>
+                            <a:fillRect/>
+                          </a:stretch>
+                        </pic:blipFill>
+                        <pic:spPr bwMode="auto">
+                          <a:xfrm>
+                            <a:off x="0" y="0"/>
+                            <a:ext cx="3810000" cy="2540000"/>
+                          </a:xfrm>
+                          <a:prstGeom prst="rect">
+                            <a:avLst/>
+                          </a:prstGeom>
+                          <a:noFill/>
+                          <a:ln w="9525">
+                            <a:noFill/>
+                            <a:headEnd/>
+                            <a:tailEnd/>
+                          </a:ln>
+                        </pic:spPr>
+                      </pic:pic>
+                    </a:graphicData>
+                  </a:graphic>
+                </wp:inline>
+              </w:drawing>
+            </w:r>
+          </w:p>
+          <w:p>
+            <w:pPr>
+              <w:jc w:val="center"/>
+            </w:pPr>
+            <w:pPr>
+              <w:jc w:val="left"/>
+              <w:spacing w:before="200"/>
+              <w:pStyle w:val="ImageCaption"/>
+            </w:pPr>
+            <w:r>
+              <w:t xml:space="preserve">Figure 1: Survival estimates from the selected Burnham joint model. Error bars indicate 95% CIs. Note that intervals are unequal. Estimates are the actual survival from one occasion to the next and cannot be directly compared.</w:t>
+            </w:r>
+          </w:p>
+          <w:bookmarkEnd w:id="29"/>
+        </w:tc>
+      </w:tr>
+    </w:tbl>
+    <w:p>
+      <w:pPr>
+        <w:pStyle w:val="BodyText"/>
+      </w:pPr>
+      <w:r>
+        <w:t xml:space="preserve"> </w:t>
+      </w:r>
+    </w:p>
+    <w:tbl>
+      <w:tblPr>
+        <w:tblStyle w:val="Table"/>
+        <w:tblW w:type="pct" w:w="5000"/>
+        <w:tblLayout w:type="fixed"/>
+        <w:tblLook w:firstRow="0" w:lastRow="0" w:firstColumn="0" w:lastColumn="0" w:noHBand="0" w:noVBand="0" w:val="0000"/>
+      </w:tblPr>
+      <w:tblGrid>
+        <w:gridCol w:w="7920"/>
+      </w:tblGrid>
+      <w:tr>
+        <w:tc>
+          <w:tcPr/>
+          <w:bookmarkStart w:id="33" w:name="fig-abundance"/>
+          <w:p>
+            <w:pPr>
+              <w:pStyle w:val="Compact"/>
+              <w:jc w:val="center"/>
+            </w:pPr>
+            <w:r>
+              <w:drawing>
+                <wp:inline>
+                  <wp:extent cx="3810000" cy="2540000"/>
+                  <wp:effectExtent b="0" l="0" r="0" t="0"/>
+                  <wp:docPr descr="" title="" id="31" name="Picture"/>
+                  <a:graphic>
+                    <a:graphicData uri="http://schemas.openxmlformats.org/drawingml/2006/picture">
+                      <pic:pic>
+                        <pic:nvPicPr>
+                          <pic:cNvPr descr="../../results/figures/05a_alt_model_results/Figure_2_abundance_selected_model.jpg" id="32" name="Picture"/>
+                          <pic:cNvPicPr>
+                            <a:picLocks noChangeArrowheads="1" noChangeAspect="1"/>
+                          </pic:cNvPicPr>
+                        </pic:nvPicPr>
+                        <pic:blipFill>
+                          <a:blip r:embed="rId30"/>
+                          <a:stretch>
+                            <a:fillRect/>
+                          </a:stretch>
+                        </pic:blipFill>
+                        <pic:spPr bwMode="auto">
+                          <a:xfrm>
+                            <a:off x="0" y="0"/>
+                            <a:ext cx="3810000" cy="2540000"/>
+                          </a:xfrm>
+                          <a:prstGeom prst="rect">
+                            <a:avLst/>
+                          </a:prstGeom>
+                          <a:noFill/>
+                          <a:ln w="9525">
+                            <a:noFill/>
+                            <a:headEnd/>
+                            <a:tailEnd/>
+                          </a:ln>
+                        </pic:spPr>
+                      </pic:pic>
+                    </a:graphicData>
+                  </a:graphic>
+                </wp:inline>
+              </w:drawing>
+            </w:r>
+          </w:p>
+          <w:p>
+            <w:pPr>
+              <w:jc w:val="center"/>
+            </w:pPr>
+            <w:pPr>
+              <w:jc w:val="left"/>
+              <w:spacing w:before="200"/>
+              <w:pStyle w:val="ImageCaption"/>
+            </w:pPr>
+            <w:r>
+              <w:t xml:space="preserve">Figure 2: Abundance estimates from the selected Burnham joint model. Error bars indicate 95% CIs.</w:t>
+            </w:r>
+          </w:p>
+          <w:bookmarkEnd w:id="33"/>
+        </w:tc>
+      </w:tr>
+    </w:tbl>
+    <w:bookmarkEnd w:id="34"/>
+    <w:bookmarkStart w:id="35" w:name="tables"/>
+    <w:p>
+      <w:pPr>
+        <w:pStyle w:val="Heading1"/>
+      </w:pPr>
+      <w:r>
+        <w:t xml:space="preserve">5. Tables</w:t>
+      </w:r>
+    </w:p>
+    <w:p>
       <w:r>
         <w:br w:type="page"/>
       </w:r>
     </w:p>
-    <w:bookmarkEnd w:id="22"/>
-    <w:bookmarkEnd w:id="23"/>
-    <w:bookmarkStart w:id="29" w:name="references"/>
     <w:p>
+      <w:r>
+        <w:br w:type="page"/>
+      </w:r>
+    </w:p>
+    <w:bookmarkEnd w:id="35"/>
+    <w:bookmarkStart w:id="41" w:name="references"/>
+    <w:p>
       <w:pPr>
         <w:pStyle w:val="Heading1"/>
       </w:pPr>
       <w:r>
-        <w:t xml:space="preserve">2. References</w:t>
+        <w:t xml:space="preserve">6. References</w:t>
       </w:r>
     </w:p>
-    <w:bookmarkStart w:id="28" w:name="refs"/>
-    <w:bookmarkStart w:id="24" w:name="X437bd82681b6244afc723f1058a320799156d9d"/>
+    <w:bookmarkStart w:id="40" w:name="refs"/>
+    <w:bookmarkStart w:id="36" w:name="X437bd82681b6244afc723f1058a320799156d9d"/>
     <w:p>
       <w:pPr>
         <w:pStyle w:val="Bibliography"/>
@@ -1148,8 +2068,8 @@
         <w:t xml:space="preserve">, edited by B N Petrov and F Cazakil, 267–81. Budapest, Hungary: Akademiai Kidao.</w:t>
       </w:r>
     </w:p>
-    <w:bookmarkEnd w:id="24"/>
-    <w:bookmarkStart w:id="25" w:name="X3d765049c0b9d139b2bf4c37083a4031b8ade27"/>
+    <w:bookmarkEnd w:id="36"/>
+    <w:bookmarkStart w:id="37" w:name="X3d765049c0b9d139b2bf4c37083a4031b8ade27"/>
     <w:p>
       <w:pPr>
         <w:pStyle w:val="Bibliography"/>
@@ -1234,8 +2154,8 @@
         <w:t xml:space="preserve">. 2nd ed. New York: Springer-Verlag.</w:t>
       </w:r>
     </w:p>
-    <w:bookmarkEnd w:id="25"/>
-    <w:bookmarkStart w:id="26" w:name="ref-sugiura_1978_FurtherAnalysisData"/>
+    <w:bookmarkEnd w:id="37"/>
+    <w:bookmarkStart w:id="38" w:name="ref-sugiura_1978_FurtherAnalysisData"/>
     <w:p>
       <w:pPr>
         <w:pStyle w:val="Bibliography"/>
@@ -1284,8 +2204,8 @@
         <w:t xml:space="preserve">7 (1): 13–26.</w:t>
       </w:r>
     </w:p>
-    <w:bookmarkEnd w:id="26"/>
-    <w:bookmarkStart w:id="27" w:name="Xe040a3ee9170c3970aba188ecc23934f91c03aa"/>
+    <w:bookmarkEnd w:id="38"/>
+    <w:bookmarkStart w:id="39" w:name="Xe040a3ee9170c3970aba188ecc23934f91c03aa"/>
     <w:p>
       <w:pPr>
         <w:pStyle w:val="Bibliography"/>
@@ -1325,9 +2245,9 @@
         <w:t xml:space="preserve">46 (S1): S120–39.</w:t>
       </w:r>
     </w:p>
-    <w:bookmarkEnd w:id="27"/>
-    <w:bookmarkEnd w:id="28"/>
-    <w:bookmarkEnd w:id="29"/>
+    <w:bookmarkEnd w:id="39"/>
+    <w:bookmarkEnd w:id="40"/>
+    <w:bookmarkEnd w:id="41"/>
     <w:sectPr>
       <w:pgSz w:h="15840" w:w="12240"/>
       <w:pgMar w:bottom="1440" w:footer="720" w:gutter="0" w:header="720" w:left="1440" w:right="1440" w:top="1440"/>

</xml_diff>

<commit_message>
doc: add occasion info table to report
</commit_message>
<xml_diff>
--- a/doc/Report/reston_mark_recapture_methods_results_v0.1.docx
+++ b/doc/Report/reston_mark_recapture_methods_results_v0.1.docx
@@ -1596,7 +1596,7 @@
           <w:rPr>
             <w:rStyle w:val="Hyperlink"/>
           </w:rPr>
-          <w:t xml:space="preserve">Table 1</w:t>
+          <w:t xml:space="preserve">Table 2</w:t>
         </w:r>
       </w:hyperlink>
       <w:r>
@@ -1613,7 +1613,7 @@
           <w:rPr>
             <w:rStyle w:val="Hyperlink"/>
           </w:rPr>
-          <w:t xml:space="preserve">Table 1</w:t>
+          <w:t xml:space="preserve">Table 2</w:t>
         </w:r>
       </w:hyperlink>
       <w:r>
@@ -1661,7 +1661,7 @@
           <w:rPr>
             <w:rStyle w:val="Hyperlink"/>
           </w:rPr>
-          <w:t xml:space="preserve">Table 2</w:t>
+          <w:t xml:space="preserve">Table 3</w:t>
         </w:r>
       </w:hyperlink>
       <w:r>
@@ -2054,7 +2054,7 @@
       </w:tr>
     </w:tbl>
     <w:bookmarkEnd w:id="34"/>
-    <w:bookmarkStart w:id="37" w:name="tables"/>
+    <w:bookmarkStart w:id="38" w:name="tables"/>
     <w:p>
       <w:pPr>
         <w:pStyle w:val="Heading1"/>
@@ -2076,7 +2076,7 @@
       <w:tr>
         <w:tc>
           <w:tcPr/>
-          <w:bookmarkStart w:id="35" w:name="tbl-survival"/>
+          <w:bookmarkStart w:id="35" w:name="tbl-occasions"/>
           <w:p>
             <w:pPr>
               <w:jc w:val="center"/>
@@ -2088,6 +2088,3033 @@
             </w:pPr>
             <w:r>
               <w:t xml:space="preserve">Table 1: Abundance estimates from the selected POPAN model. Each row (i.e., species) represents results from a single analysis/model.</w:t>
+            </w:r>
+          </w:p>
+          <w:tbl xmlns:w="http://schemas.openxmlformats.org/wordprocessingml/2006/main" xmlns:r="http://schemas.openxmlformats.org/officeDocument/2006/relationships" xmlns:w14="http://schemas.microsoft.com/office/word/2010/wordml" xmlns:wp="http://schemas.openxmlformats.org/drawingml/2006/wordprocessingDrawing" xmlns:a="http://schemas.openxmlformats.org/drawingml/2006/main" xmlns:pic="http://schemas.openxmlformats.org/drawingml/2006/picture">
+            <w:tblPr>
+              <w:tblLayout w:type="fixed"/>
+              <w:jc w:val="center"/>
+              <w:tblLook w:firstRow="1" w:lastRow="0" w:firstColumn="0" w:lastColumn="0" w:noHBand="0" w:noVBand="1"/>
+            </w:tblPr>
+            <w:tblGrid>
+              <w:gridCol w:w="1152"/>
+              <w:gridCol w:w="821"/>
+              <w:gridCol w:w="821"/>
+            </w:tblGrid>
+            <w:tr>
+              <w:trPr>
+                <w:trHeight w:val="360" w:hRule="auto"/>
+                <w:tblHeader/>
+              </w:trPr>
+              <w:tc>
+                <w:tcPr>
+                  <w:tcBorders>
+                    <w:bottom w:val="single" w:sz="12" w:space="0" w:color="666666"/>
+                    <w:top w:val="single" w:sz="12" w:space="0" w:color="666666"/>
+                    <w:left w:val="none" w:sz="0" w:space="0" w:color="000000"/>
+                    <w:right w:val="none" w:sz="0" w:space="0" w:color="000000"/>
+                  </w:tcBorders>
+                  <w:shd w:val="clear" w:color="auto" w:fill="FFFFFF"/>
+                  <w:tcMar>
+                    <w:top w:w="0" w:type="dxa"/>
+                    <w:bottom w:w="0" w:type="dxa"/>
+                    <w:left w:w="0" w:type="dxa"/>
+                    <w:right w:w="0" w:type="dxa"/>
+                  </w:tcMar>
+                  <w:vAlign w:val="center"/>
+                </w:tcPr>
+                <w:p>
+                  <w:pPr>
+                    <w:jc w:val="left"/>
+                    <w:pBdr>
+                      <w:bottom w:val="none" w:sz="0" w:space="0" w:color="000000"/>
+                      <w:top w:val="none" w:sz="0" w:space="0" w:color="000000"/>
+                      <w:left w:val="none" w:sz="0" w:space="0" w:color="000000"/>
+                      <w:right w:val="none" w:sz="0" w:space="0" w:color="000000"/>
+                    </w:pBdr>
+                    <w:spacing w:after="40" w:before="40" w:line="240"/>
+                    <w:ind w:left="60" w:right="60" w:firstLine="0" w:firstLineChars="0"/>
+                    <w:rPr>
+                      <w:rFonts w:ascii="Arial" w:hAnsi="Arial" w:eastAsia="Arial" w:cs="Arial"/>
+                      <w:i w:val="false"/>
+                      <w:b w:val="true"/>
+                      <w:u w:val="none"/>
+                      <w:strike w:val="false"/>
+                      <w:sz w:val="16"/>
+                      <w:szCs w:val="16"/>
+                      <w:color w:val="000000"/>
+                    </w:rPr>
+                  </w:pPr>
+                  <w:r xmlns:w="http://schemas.openxmlformats.org/wordprocessingml/2006/main" xmlns:wp="http://schemas.openxmlformats.org/drawingml/2006/wordprocessingDrawing" xmlns:r="http://schemas.openxmlformats.org/officeDocument/2006/relationships" xmlns:w14="http://schemas.microsoft.com/office/word/2010/wordml">
+                    <w:rPr>
+                      <w:rFonts w:ascii="Arial" w:hAnsi="Arial" w:eastAsia="Arial" w:cs="Arial"/>
+                      <w:i w:val="false"/>
+                      <w:b w:val="true"/>
+                      <w:u w:val="none"/>
+                      <w:strike w:val="false"/>
+                      <w:sz w:val="16"/>
+                      <w:szCs w:val="16"/>
+                      <w:color w:val="000000"/>
+                    </w:rPr>
+                    <w:t xml:space="preserve">Site</w:t>
+                  </w:r>
+                </w:p>
+              </w:tc>
+              <w:tc>
+                <w:tcPr>
+                  <w:tcBorders>
+                    <w:bottom w:val="single" w:sz="12" w:space="0" w:color="666666"/>
+                    <w:top w:val="single" w:sz="12" w:space="0" w:color="666666"/>
+                    <w:left w:val="none" w:sz="0" w:space="0" w:color="000000"/>
+                    <w:right w:val="none" w:sz="0" w:space="0" w:color="000000"/>
+                  </w:tcBorders>
+                  <w:shd w:val="clear" w:color="auto" w:fill="FFFFFF"/>
+                  <w:tcMar>
+                    <w:top w:w="0" w:type="dxa"/>
+                    <w:bottom w:w="0" w:type="dxa"/>
+                    <w:left w:w="0" w:type="dxa"/>
+                    <w:right w:w="0" w:type="dxa"/>
+                  </w:tcMar>
+                  <w:vAlign w:val="center"/>
+                </w:tcPr>
+                <w:p>
+                  <w:pPr>
+                    <w:jc w:val="center"/>
+                    <w:pBdr>
+                      <w:bottom w:val="none" w:sz="0" w:space="0" w:color="000000"/>
+                      <w:top w:val="none" w:sz="0" w:space="0" w:color="000000"/>
+                      <w:left w:val="none" w:sz="0" w:space="0" w:color="000000"/>
+                      <w:right w:val="none" w:sz="0" w:space="0" w:color="000000"/>
+                    </w:pBdr>
+                    <w:spacing w:after="40" w:before="40" w:line="240"/>
+                    <w:ind w:left="60" w:right="60" w:firstLine="0" w:firstLineChars="0"/>
+                    <w:rPr>
+                      <w:rFonts w:ascii="Arial" w:hAnsi="Arial" w:eastAsia="Arial" w:cs="Arial"/>
+                      <w:i w:val="false"/>
+                      <w:b w:val="true"/>
+                      <w:u w:val="none"/>
+                      <w:strike w:val="false"/>
+                      <w:sz w:val="16"/>
+                      <w:szCs w:val="16"/>
+                      <w:color w:val="000000"/>
+                    </w:rPr>
+                  </w:pPr>
+                  <w:r xmlns:w="http://schemas.openxmlformats.org/wordprocessingml/2006/main" xmlns:wp="http://schemas.openxmlformats.org/drawingml/2006/wordprocessingDrawing" xmlns:r="http://schemas.openxmlformats.org/officeDocument/2006/relationships" xmlns:w14="http://schemas.microsoft.com/office/word/2010/wordml">
+                    <w:rPr>
+                      <w:rFonts w:ascii="Arial" w:hAnsi="Arial" w:eastAsia="Arial" w:cs="Arial"/>
+                      <w:i w:val="false"/>
+                      <w:b w:val="true"/>
+                      <w:u w:val="none"/>
+                      <w:strike w:val="false"/>
+                      <w:sz w:val="16"/>
+                      <w:szCs w:val="16"/>
+                      <w:color w:val="000000"/>
+                    </w:rPr>
+                    <w:t xml:space="preserve">Occasion</w:t>
+                  </w:r>
+                </w:p>
+              </w:tc>
+              <w:tc>
+                <w:tcPr>
+                  <w:tcBorders>
+                    <w:bottom w:val="single" w:sz="12" w:space="0" w:color="666666"/>
+                    <w:top w:val="single" w:sz="12" w:space="0" w:color="666666"/>
+                    <w:left w:val="none" w:sz="0" w:space="0" w:color="000000"/>
+                    <w:right w:val="none" w:sz="0" w:space="0" w:color="000000"/>
+                  </w:tcBorders>
+                  <w:shd w:val="clear" w:color="auto" w:fill="FFFFFF"/>
+                  <w:tcMar>
+                    <w:top w:w="0" w:type="dxa"/>
+                    <w:bottom w:w="0" w:type="dxa"/>
+                    <w:left w:w="0" w:type="dxa"/>
+                    <w:right w:w="0" w:type="dxa"/>
+                  </w:tcMar>
+                  <w:vAlign w:val="center"/>
+                </w:tcPr>
+                <w:p>
+                  <w:pPr>
+                    <w:jc w:val="center"/>
+                    <w:pBdr>
+                      <w:bottom w:val="none" w:sz="0" w:space="0" w:color="000000"/>
+                      <w:top w:val="none" w:sz="0" w:space="0" w:color="000000"/>
+                      <w:left w:val="none" w:sz="0" w:space="0" w:color="000000"/>
+                      <w:right w:val="none" w:sz="0" w:space="0" w:color="000000"/>
+                    </w:pBdr>
+                    <w:spacing w:after="40" w:before="40" w:line="240"/>
+                    <w:ind w:left="60" w:right="60" w:firstLine="0" w:firstLineChars="0"/>
+                    <w:rPr>
+                      <w:rFonts w:ascii="Arial" w:hAnsi="Arial" w:eastAsia="Arial" w:cs="Arial"/>
+                      <w:i w:val="false"/>
+                      <w:b w:val="true"/>
+                      <w:u w:val="none"/>
+                      <w:strike w:val="false"/>
+                      <w:sz w:val="16"/>
+                      <w:szCs w:val="16"/>
+                      <w:color w:val="000000"/>
+                    </w:rPr>
+                  </w:pPr>
+                  <w:r xmlns:w="http://schemas.openxmlformats.org/wordprocessingml/2006/main" xmlns:wp="http://schemas.openxmlformats.org/drawingml/2006/wordprocessingDrawing" xmlns:r="http://schemas.openxmlformats.org/officeDocument/2006/relationships" xmlns:w14="http://schemas.microsoft.com/office/word/2010/wordml">
+                    <w:rPr>
+                      <w:rFonts w:ascii="Arial" w:hAnsi="Arial" w:eastAsia="Arial" w:cs="Arial"/>
+                      <w:i w:val="false"/>
+                      <w:b w:val="true"/>
+                      <w:u w:val="none"/>
+                      <w:strike w:val="false"/>
+                      <w:sz w:val="16"/>
+                      <w:szCs w:val="16"/>
+                      <w:color w:val="000000"/>
+                    </w:rPr>
+                    <w:t xml:space="preserve">Sampling Date</w:t>
+                  </w:r>
+                </w:p>
+              </w:tc>
+            </w:tr>
+            <w:tr>
+              <w:trPr>
+                <w:trHeight w:val="360" w:hRule="auto"/>
+              </w:trPr>
+              <w:tc>
+                <w:tcPr>
+                  <w:vMerge w:val="restart"/>
+                  <w:tcBorders>
+                    <w:bottom w:val="single" w:sz="6" w:space="0" w:color="666666"/>
+                    <w:top w:val="single" w:sz="12" w:space="0" w:color="666666"/>
+                    <w:left w:val="none" w:sz="0" w:space="0" w:color="000000"/>
+                    <w:right w:val="none" w:sz="0" w:space="0" w:color="000000"/>
+                  </w:tcBorders>
+                  <w:shd w:val="clear" w:color="auto" w:fill="FFFFFF"/>
+                  <w:tcMar>
+                    <w:top w:w="0" w:type="dxa"/>
+                    <w:bottom w:w="0" w:type="dxa"/>
+                    <w:left w:w="0" w:type="dxa"/>
+                    <w:right w:w="0" w:type="dxa"/>
+                  </w:tcMar>
+                  <w:vAlign w:val="center"/>
+                </w:tcPr>
+                <w:p>
+                  <w:pPr>
+                    <w:jc w:val="left"/>
+                    <w:pBdr>
+                      <w:bottom w:val="none" w:sz="0" w:space="0" w:color="000000"/>
+                      <w:top w:val="none" w:sz="0" w:space="0" w:color="000000"/>
+                      <w:left w:val="none" w:sz="0" w:space="0" w:color="000000"/>
+                      <w:right w:val="none" w:sz="0" w:space="0" w:color="000000"/>
+                    </w:pBdr>
+                    <w:spacing w:after="40" w:before="40" w:line="240"/>
+                    <w:ind w:left="60" w:right="60" w:firstLine="0" w:firstLineChars="0"/>
+                    <w:rPr>
+                      <w:rFonts w:ascii="Arial" w:hAnsi="Arial" w:eastAsia="Arial" w:cs="Arial"/>
+                      <w:i w:val="false"/>
+                      <w:b w:val="false"/>
+                      <w:u w:val="none"/>
+                      <w:strike w:val="false"/>
+                      <w:sz w:val="16"/>
+                      <w:szCs w:val="16"/>
+                      <w:color w:val="000000"/>
+                    </w:rPr>
+                  </w:pPr>
+                  <w:r xmlns:w="http://schemas.openxmlformats.org/wordprocessingml/2006/main" xmlns:wp="http://schemas.openxmlformats.org/drawingml/2006/wordprocessingDrawing" xmlns:r="http://schemas.openxmlformats.org/officeDocument/2006/relationships" xmlns:w14="http://schemas.microsoft.com/office/word/2010/wordml">
+                    <w:rPr>
+                      <w:rFonts w:ascii="Arial" w:hAnsi="Arial" w:eastAsia="Arial" w:cs="Arial"/>
+                      <w:i w:val="false"/>
+                      <w:b w:val="false"/>
+                      <w:u w:val="none"/>
+                      <w:strike w:val="false"/>
+                      <w:sz w:val="16"/>
+                      <w:szCs w:val="16"/>
+                      <w:color w:val="000000"/>
+                    </w:rPr>
+                    <w:t xml:space="preserve">Snakeden</w:t>
+                  </w:r>
+                </w:p>
+              </w:tc>
+              <w:tc>
+                <w:tcPr>
+                  <w:tcBorders>
+                    <w:bottom w:val="single" w:sz="6" w:space="0" w:color="666666"/>
+                    <w:top w:val="single" w:sz="12" w:space="0" w:color="666666"/>
+                    <w:left w:val="none" w:sz="0" w:space="0" w:color="000000"/>
+                    <w:right w:val="none" w:sz="0" w:space="0" w:color="000000"/>
+                  </w:tcBorders>
+                  <w:shd w:val="clear" w:color="auto" w:fill="FFFFFF"/>
+                  <w:tcMar>
+                    <w:top w:w="0" w:type="dxa"/>
+                    <w:bottom w:w="0" w:type="dxa"/>
+                    <w:left w:w="0" w:type="dxa"/>
+                    <w:right w:w="0" w:type="dxa"/>
+                  </w:tcMar>
+                  <w:vAlign w:val="center"/>
+                </w:tcPr>
+                <w:p>
+                  <w:pPr>
+                    <w:jc w:val="center"/>
+                    <w:pBdr>
+                      <w:bottom w:val="none" w:sz="0" w:space="0" w:color="000000"/>
+                      <w:top w:val="none" w:sz="0" w:space="0" w:color="000000"/>
+                      <w:left w:val="none" w:sz="0" w:space="0" w:color="000000"/>
+                      <w:right w:val="none" w:sz="0" w:space="0" w:color="000000"/>
+                    </w:pBdr>
+                    <w:spacing w:after="40" w:before="40" w:line="240"/>
+                    <w:ind w:left="60" w:right="60" w:firstLine="0" w:firstLineChars="0"/>
+                    <w:rPr>
+                      <w:rFonts w:ascii="Arial" w:hAnsi="Arial" w:eastAsia="Arial" w:cs="Arial"/>
+                      <w:i w:val="false"/>
+                      <w:b w:val="false"/>
+                      <w:u w:val="none"/>
+                      <w:strike w:val="false"/>
+                      <w:sz w:val="16"/>
+                      <w:szCs w:val="16"/>
+                      <w:color w:val="000000"/>
+                    </w:rPr>
+                  </w:pPr>
+                  <w:r xmlns:w="http://schemas.openxmlformats.org/wordprocessingml/2006/main" xmlns:wp="http://schemas.openxmlformats.org/drawingml/2006/wordprocessingDrawing" xmlns:r="http://schemas.openxmlformats.org/officeDocument/2006/relationships" xmlns:w14="http://schemas.microsoft.com/office/word/2010/wordml">
+                    <w:rPr>
+                      <w:rFonts w:ascii="Arial" w:hAnsi="Arial" w:eastAsia="Arial" w:cs="Arial"/>
+                      <w:i w:val="false"/>
+                      <w:b w:val="false"/>
+                      <w:u w:val="none"/>
+                      <w:strike w:val="false"/>
+                      <w:sz w:val="16"/>
+                      <w:szCs w:val="16"/>
+                      <w:color w:val="000000"/>
+                    </w:rPr>
+                    <w:t xml:space="preserve">0</w:t>
+                  </w:r>
+                </w:p>
+              </w:tc>
+              <w:tc>
+                <w:tcPr>
+                  <w:tcBorders>
+                    <w:bottom w:val="single" w:sz="6" w:space="0" w:color="666666"/>
+                    <w:top w:val="single" w:sz="12" w:space="0" w:color="666666"/>
+                    <w:left w:val="none" w:sz="0" w:space="0" w:color="000000"/>
+                    <w:right w:val="none" w:sz="0" w:space="0" w:color="000000"/>
+                  </w:tcBorders>
+                  <w:shd w:val="clear" w:color="auto" w:fill="FFFFFF"/>
+                  <w:tcMar>
+                    <w:top w:w="0" w:type="dxa"/>
+                    <w:bottom w:w="0" w:type="dxa"/>
+                    <w:left w:w="0" w:type="dxa"/>
+                    <w:right w:w="0" w:type="dxa"/>
+                  </w:tcMar>
+                  <w:vAlign w:val="center"/>
+                </w:tcPr>
+                <w:p>
+                  <w:pPr>
+                    <w:jc w:val="center"/>
+                    <w:pBdr>
+                      <w:bottom w:val="none" w:sz="0" w:space="0" w:color="000000"/>
+                      <w:top w:val="none" w:sz="0" w:space="0" w:color="000000"/>
+                      <w:left w:val="none" w:sz="0" w:space="0" w:color="000000"/>
+                      <w:right w:val="none" w:sz="0" w:space="0" w:color="000000"/>
+                    </w:pBdr>
+                    <w:spacing w:after="40" w:before="40" w:line="240"/>
+                    <w:ind w:left="60" w:right="60" w:firstLine="0" w:firstLineChars="0"/>
+                    <w:rPr>
+                      <w:rFonts w:ascii="Arial" w:hAnsi="Arial" w:eastAsia="Arial" w:cs="Arial"/>
+                      <w:i w:val="false"/>
+                      <w:b w:val="false"/>
+                      <w:u w:val="none"/>
+                      <w:strike w:val="false"/>
+                      <w:sz w:val="16"/>
+                      <w:szCs w:val="16"/>
+                      <w:color w:val="000000"/>
+                    </w:rPr>
+                  </w:pPr>
+                  <w:r xmlns:w="http://schemas.openxmlformats.org/wordprocessingml/2006/main" xmlns:wp="http://schemas.openxmlformats.org/drawingml/2006/wordprocessingDrawing" xmlns:r="http://schemas.openxmlformats.org/officeDocument/2006/relationships" xmlns:w14="http://schemas.microsoft.com/office/word/2010/wordml">
+                    <w:rPr>
+                      <w:rFonts w:ascii="Arial" w:hAnsi="Arial" w:eastAsia="Arial" w:cs="Arial"/>
+                      <w:i w:val="false"/>
+                      <w:b w:val="false"/>
+                      <w:u w:val="none"/>
+                      <w:strike w:val="false"/>
+                      <w:sz w:val="16"/>
+                      <w:szCs w:val="16"/>
+                      <w:color w:val="000000"/>
+                    </w:rPr>
+                    <w:t xml:space="preserve">2023-07-27</w:t>
+                  </w:r>
+                </w:p>
+              </w:tc>
+            </w:tr>
+            <w:tr>
+              <w:trPr>
+                <w:trHeight w:val="360" w:hRule="auto"/>
+              </w:trPr>
+              <w:tc>
+                <w:tcPr>
+                  <w:vMerge/>
+                  <w:tcBorders>
+                    <w:bottom w:val="single" w:sz="6" w:space="0" w:color="666666"/>
+                    <w:top w:val="single" w:sz="6" w:space="0" w:color="666666"/>
+                    <w:left w:val="none" w:sz="0" w:space="0" w:color="000000"/>
+                    <w:right w:val="none" w:sz="0" w:space="0" w:color="000000"/>
+                  </w:tcBorders>
+                  <w:shd w:val="clear" w:color="auto" w:fill="FFFFFF"/>
+                  <w:tcMar>
+                    <w:top w:w="0" w:type="dxa"/>
+                    <w:bottom w:w="0" w:type="dxa"/>
+                    <w:left w:w="0" w:type="dxa"/>
+                    <w:right w:w="0" w:type="dxa"/>
+                  </w:tcMar>
+                  <w:vAlign w:val="center"/>
+                </w:tcPr>
+                <w:p>
+                  <w:pPr>
+                    <w:jc w:val="left"/>
+                    <w:pBdr>
+                      <w:bottom w:val="none" w:sz="0" w:space="0" w:color="000000"/>
+                      <w:top w:val="none" w:sz="0" w:space="0" w:color="000000"/>
+                      <w:left w:val="none" w:sz="0" w:space="0" w:color="000000"/>
+                      <w:right w:val="none" w:sz="0" w:space="0" w:color="000000"/>
+                    </w:pBdr>
+                    <w:spacing w:after="40" w:before="40" w:line="240"/>
+                    <w:ind w:left="60" w:right="60" w:firstLine="0" w:firstLineChars="0"/>
+                    <w:rPr>
+                      <w:rFonts w:ascii="Arial" w:hAnsi="Arial" w:eastAsia="Arial" w:cs="Arial"/>
+                      <w:i w:val="false"/>
+                      <w:b w:val="false"/>
+                      <w:u w:val="none"/>
+                      <w:strike w:val="false"/>
+                      <w:sz w:val="16"/>
+                      <w:szCs w:val="16"/>
+                      <w:color w:val="000000"/>
+                    </w:rPr>
+                  </w:pPr>
+                </w:p>
+              </w:tc>
+              <w:tc>
+                <w:tcPr>
+                  <w:tcBorders>
+                    <w:bottom w:val="single" w:sz="6" w:space="0" w:color="666666"/>
+                    <w:top w:val="single" w:sz="6" w:space="0" w:color="666666"/>
+                    <w:left w:val="none" w:sz="0" w:space="0" w:color="000000"/>
+                    <w:right w:val="none" w:sz="0" w:space="0" w:color="000000"/>
+                  </w:tcBorders>
+                  <w:shd w:val="clear" w:color="auto" w:fill="FFFFFF"/>
+                  <w:tcMar>
+                    <w:top w:w="0" w:type="dxa"/>
+                    <w:bottom w:w="0" w:type="dxa"/>
+                    <w:left w:w="0" w:type="dxa"/>
+                    <w:right w:w="0" w:type="dxa"/>
+                  </w:tcMar>
+                  <w:vAlign w:val="center"/>
+                </w:tcPr>
+                <w:p>
+                  <w:pPr>
+                    <w:jc w:val="center"/>
+                    <w:pBdr>
+                      <w:bottom w:val="none" w:sz="0" w:space="0" w:color="000000"/>
+                      <w:top w:val="none" w:sz="0" w:space="0" w:color="000000"/>
+                      <w:left w:val="none" w:sz="0" w:space="0" w:color="000000"/>
+                      <w:right w:val="none" w:sz="0" w:space="0" w:color="000000"/>
+                    </w:pBdr>
+                    <w:spacing w:after="40" w:before="40" w:line="240"/>
+                    <w:ind w:left="60" w:right="60" w:firstLine="0" w:firstLineChars="0"/>
+                    <w:rPr>
+                      <w:rFonts w:ascii="Arial" w:hAnsi="Arial" w:eastAsia="Arial" w:cs="Arial"/>
+                      <w:i w:val="false"/>
+                      <w:b w:val="false"/>
+                      <w:u w:val="none"/>
+                      <w:strike w:val="false"/>
+                      <w:sz w:val="16"/>
+                      <w:szCs w:val="16"/>
+                      <w:color w:val="000000"/>
+                    </w:rPr>
+                  </w:pPr>
+                  <w:r xmlns:w="http://schemas.openxmlformats.org/wordprocessingml/2006/main" xmlns:wp="http://schemas.openxmlformats.org/drawingml/2006/wordprocessingDrawing" xmlns:r="http://schemas.openxmlformats.org/officeDocument/2006/relationships" xmlns:w14="http://schemas.microsoft.com/office/word/2010/wordml">
+                    <w:rPr>
+                      <w:rFonts w:ascii="Arial" w:hAnsi="Arial" w:eastAsia="Arial" w:cs="Arial"/>
+                      <w:i w:val="false"/>
+                      <w:b w:val="false"/>
+                      <w:u w:val="none"/>
+                      <w:strike w:val="false"/>
+                      <w:sz w:val="16"/>
+                      <w:szCs w:val="16"/>
+                      <w:color w:val="000000"/>
+                    </w:rPr>
+                    <w:t xml:space="preserve">1</w:t>
+                  </w:r>
+                </w:p>
+              </w:tc>
+              <w:tc>
+                <w:tcPr>
+                  <w:tcBorders>
+                    <w:bottom w:val="single" w:sz="6" w:space="0" w:color="666666"/>
+                    <w:top w:val="single" w:sz="6" w:space="0" w:color="666666"/>
+                    <w:left w:val="none" w:sz="0" w:space="0" w:color="000000"/>
+                    <w:right w:val="none" w:sz="0" w:space="0" w:color="000000"/>
+                  </w:tcBorders>
+                  <w:shd w:val="clear" w:color="auto" w:fill="FFFFFF"/>
+                  <w:tcMar>
+                    <w:top w:w="0" w:type="dxa"/>
+                    <w:bottom w:w="0" w:type="dxa"/>
+                    <w:left w:w="0" w:type="dxa"/>
+                    <w:right w:w="0" w:type="dxa"/>
+                  </w:tcMar>
+                  <w:vAlign w:val="center"/>
+                </w:tcPr>
+                <w:p>
+                  <w:pPr>
+                    <w:jc w:val="center"/>
+                    <w:pBdr>
+                      <w:bottom w:val="none" w:sz="0" w:space="0" w:color="000000"/>
+                      <w:top w:val="none" w:sz="0" w:space="0" w:color="000000"/>
+                      <w:left w:val="none" w:sz="0" w:space="0" w:color="000000"/>
+                      <w:right w:val="none" w:sz="0" w:space="0" w:color="000000"/>
+                    </w:pBdr>
+                    <w:spacing w:after="40" w:before="40" w:line="240"/>
+                    <w:ind w:left="60" w:right="60" w:firstLine="0" w:firstLineChars="0"/>
+                    <w:rPr>
+                      <w:rFonts w:ascii="Arial" w:hAnsi="Arial" w:eastAsia="Arial" w:cs="Arial"/>
+                      <w:i w:val="false"/>
+                      <w:b w:val="false"/>
+                      <w:u w:val="none"/>
+                      <w:strike w:val="false"/>
+                      <w:sz w:val="16"/>
+                      <w:szCs w:val="16"/>
+                      <w:color w:val="000000"/>
+                    </w:rPr>
+                  </w:pPr>
+                  <w:r xmlns:w="http://schemas.openxmlformats.org/wordprocessingml/2006/main" xmlns:wp="http://schemas.openxmlformats.org/drawingml/2006/wordprocessingDrawing" xmlns:r="http://schemas.openxmlformats.org/officeDocument/2006/relationships" xmlns:w14="http://schemas.microsoft.com/office/word/2010/wordml">
+                    <w:rPr>
+                      <w:rFonts w:ascii="Arial" w:hAnsi="Arial" w:eastAsia="Arial" w:cs="Arial"/>
+                      <w:i w:val="false"/>
+                      <w:b w:val="false"/>
+                      <w:u w:val="none"/>
+                      <w:strike w:val="false"/>
+                      <w:sz w:val="16"/>
+                      <w:szCs w:val="16"/>
+                      <w:color w:val="000000"/>
+                    </w:rPr>
+                    <w:t xml:space="preserve">2024-07-25</w:t>
+                  </w:r>
+                </w:p>
+              </w:tc>
+            </w:tr>
+            <w:tr>
+              <w:trPr>
+                <w:trHeight w:val="360" w:hRule="auto"/>
+              </w:trPr>
+              <w:tc>
+                <w:tcPr>
+                  <w:vMerge/>
+                  <w:tcBorders>
+                    <w:bottom w:val="single" w:sz="6" w:space="0" w:color="666666"/>
+                    <w:top w:val="single" w:sz="6" w:space="0" w:color="666666"/>
+                    <w:left w:val="none" w:sz="0" w:space="0" w:color="000000"/>
+                    <w:right w:val="none" w:sz="0" w:space="0" w:color="000000"/>
+                  </w:tcBorders>
+                  <w:shd w:val="clear" w:color="auto" w:fill="FFFFFF"/>
+                  <w:tcMar>
+                    <w:top w:w="0" w:type="dxa"/>
+                    <w:bottom w:w="0" w:type="dxa"/>
+                    <w:left w:w="0" w:type="dxa"/>
+                    <w:right w:w="0" w:type="dxa"/>
+                  </w:tcMar>
+                  <w:vAlign w:val="center"/>
+                </w:tcPr>
+                <w:p>
+                  <w:pPr>
+                    <w:jc w:val="left"/>
+                    <w:pBdr>
+                      <w:bottom w:val="none" w:sz="0" w:space="0" w:color="000000"/>
+                      <w:top w:val="none" w:sz="0" w:space="0" w:color="000000"/>
+                      <w:left w:val="none" w:sz="0" w:space="0" w:color="000000"/>
+                      <w:right w:val="none" w:sz="0" w:space="0" w:color="000000"/>
+                    </w:pBdr>
+                    <w:spacing w:after="40" w:before="40" w:line="240"/>
+                    <w:ind w:left="60" w:right="60" w:firstLine="0" w:firstLineChars="0"/>
+                    <w:rPr>
+                      <w:rFonts w:ascii="Arial" w:hAnsi="Arial" w:eastAsia="Arial" w:cs="Arial"/>
+                      <w:i w:val="false"/>
+                      <w:b w:val="false"/>
+                      <w:u w:val="none"/>
+                      <w:strike w:val="false"/>
+                      <w:sz w:val="16"/>
+                      <w:szCs w:val="16"/>
+                      <w:color w:val="000000"/>
+                    </w:rPr>
+                  </w:pPr>
+                </w:p>
+              </w:tc>
+              <w:tc>
+                <w:tcPr>
+                  <w:tcBorders>
+                    <w:bottom w:val="single" w:sz="6" w:space="0" w:color="666666"/>
+                    <w:top w:val="single" w:sz="6" w:space="0" w:color="666666"/>
+                    <w:left w:val="none" w:sz="0" w:space="0" w:color="000000"/>
+                    <w:right w:val="none" w:sz="0" w:space="0" w:color="000000"/>
+                  </w:tcBorders>
+                  <w:shd w:val="clear" w:color="auto" w:fill="FFFFFF"/>
+                  <w:tcMar>
+                    <w:top w:w="0" w:type="dxa"/>
+                    <w:bottom w:w="0" w:type="dxa"/>
+                    <w:left w:w="0" w:type="dxa"/>
+                    <w:right w:w="0" w:type="dxa"/>
+                  </w:tcMar>
+                  <w:vAlign w:val="center"/>
+                </w:tcPr>
+                <w:p>
+                  <w:pPr>
+                    <w:jc w:val="center"/>
+                    <w:pBdr>
+                      <w:bottom w:val="none" w:sz="0" w:space="0" w:color="000000"/>
+                      <w:top w:val="none" w:sz="0" w:space="0" w:color="000000"/>
+                      <w:left w:val="none" w:sz="0" w:space="0" w:color="000000"/>
+                      <w:right w:val="none" w:sz="0" w:space="0" w:color="000000"/>
+                    </w:pBdr>
+                    <w:spacing w:after="40" w:before="40" w:line="240"/>
+                    <w:ind w:left="60" w:right="60" w:firstLine="0" w:firstLineChars="0"/>
+                    <w:rPr>
+                      <w:rFonts w:ascii="Arial" w:hAnsi="Arial" w:eastAsia="Arial" w:cs="Arial"/>
+                      <w:i w:val="false"/>
+                      <w:b w:val="false"/>
+                      <w:u w:val="none"/>
+                      <w:strike w:val="false"/>
+                      <w:sz w:val="16"/>
+                      <w:szCs w:val="16"/>
+                      <w:color w:val="000000"/>
+                    </w:rPr>
+                  </w:pPr>
+                  <w:r xmlns:w="http://schemas.openxmlformats.org/wordprocessingml/2006/main" xmlns:wp="http://schemas.openxmlformats.org/drawingml/2006/wordprocessingDrawing" xmlns:r="http://schemas.openxmlformats.org/officeDocument/2006/relationships" xmlns:w14="http://schemas.microsoft.com/office/word/2010/wordml">
+                    <w:rPr>
+                      <w:rFonts w:ascii="Arial" w:hAnsi="Arial" w:eastAsia="Arial" w:cs="Arial"/>
+                      <w:i w:val="false"/>
+                      <w:b w:val="false"/>
+                      <w:u w:val="none"/>
+                      <w:strike w:val="false"/>
+                      <w:sz w:val="16"/>
+                      <w:szCs w:val="16"/>
+                      <w:color w:val="000000"/>
+                    </w:rPr>
+                    <w:t xml:space="preserve">2</w:t>
+                  </w:r>
+                </w:p>
+              </w:tc>
+              <w:tc>
+                <w:tcPr>
+                  <w:tcBorders>
+                    <w:bottom w:val="single" w:sz="6" w:space="0" w:color="666666"/>
+                    <w:top w:val="single" w:sz="6" w:space="0" w:color="666666"/>
+                    <w:left w:val="none" w:sz="0" w:space="0" w:color="000000"/>
+                    <w:right w:val="none" w:sz="0" w:space="0" w:color="000000"/>
+                  </w:tcBorders>
+                  <w:shd w:val="clear" w:color="auto" w:fill="FFFFFF"/>
+                  <w:tcMar>
+                    <w:top w:w="0" w:type="dxa"/>
+                    <w:bottom w:w="0" w:type="dxa"/>
+                    <w:left w:w="0" w:type="dxa"/>
+                    <w:right w:w="0" w:type="dxa"/>
+                  </w:tcMar>
+                  <w:vAlign w:val="center"/>
+                </w:tcPr>
+                <w:p>
+                  <w:pPr>
+                    <w:jc w:val="center"/>
+                    <w:pBdr>
+                      <w:bottom w:val="none" w:sz="0" w:space="0" w:color="000000"/>
+                      <w:top w:val="none" w:sz="0" w:space="0" w:color="000000"/>
+                      <w:left w:val="none" w:sz="0" w:space="0" w:color="000000"/>
+                      <w:right w:val="none" w:sz="0" w:space="0" w:color="000000"/>
+                    </w:pBdr>
+                    <w:spacing w:after="40" w:before="40" w:line="240"/>
+                    <w:ind w:left="60" w:right="60" w:firstLine="0" w:firstLineChars="0"/>
+                    <w:rPr>
+                      <w:rFonts w:ascii="Arial" w:hAnsi="Arial" w:eastAsia="Arial" w:cs="Arial"/>
+                      <w:i w:val="false"/>
+                      <w:b w:val="false"/>
+                      <w:u w:val="none"/>
+                      <w:strike w:val="false"/>
+                      <w:sz w:val="16"/>
+                      <w:szCs w:val="16"/>
+                      <w:color w:val="000000"/>
+                    </w:rPr>
+                  </w:pPr>
+                  <w:r xmlns:w="http://schemas.openxmlformats.org/wordprocessingml/2006/main" xmlns:wp="http://schemas.openxmlformats.org/drawingml/2006/wordprocessingDrawing" xmlns:r="http://schemas.openxmlformats.org/officeDocument/2006/relationships" xmlns:w14="http://schemas.microsoft.com/office/word/2010/wordml">
+                    <w:rPr>
+                      <w:rFonts w:ascii="Arial" w:hAnsi="Arial" w:eastAsia="Arial" w:cs="Arial"/>
+                      <w:i w:val="false"/>
+                      <w:b w:val="false"/>
+                      <w:u w:val="none"/>
+                      <w:strike w:val="false"/>
+                      <w:sz w:val="16"/>
+                      <w:szCs w:val="16"/>
+                      <w:color w:val="000000"/>
+                    </w:rPr>
+                    <w:t xml:space="preserve">2024-08-29</w:t>
+                  </w:r>
+                </w:p>
+              </w:tc>
+            </w:tr>
+            <w:tr>
+              <w:trPr>
+                <w:trHeight w:val="360" w:hRule="auto"/>
+              </w:trPr>
+              <w:tc>
+                <w:tcPr>
+                  <w:vMerge/>
+                  <w:tcBorders>
+                    <w:bottom w:val="single" w:sz="6" w:space="0" w:color="666666"/>
+                    <w:top w:val="single" w:sz="6" w:space="0" w:color="666666"/>
+                    <w:left w:val="none" w:sz="0" w:space="0" w:color="000000"/>
+                    <w:right w:val="none" w:sz="0" w:space="0" w:color="000000"/>
+                  </w:tcBorders>
+                  <w:shd w:val="clear" w:color="auto" w:fill="FFFFFF"/>
+                  <w:tcMar>
+                    <w:top w:w="0" w:type="dxa"/>
+                    <w:bottom w:w="0" w:type="dxa"/>
+                    <w:left w:w="0" w:type="dxa"/>
+                    <w:right w:w="0" w:type="dxa"/>
+                  </w:tcMar>
+                  <w:vAlign w:val="center"/>
+                </w:tcPr>
+                <w:p>
+                  <w:pPr>
+                    <w:jc w:val="left"/>
+                    <w:pBdr>
+                      <w:bottom w:val="none" w:sz="0" w:space="0" w:color="000000"/>
+                      <w:top w:val="none" w:sz="0" w:space="0" w:color="000000"/>
+                      <w:left w:val="none" w:sz="0" w:space="0" w:color="000000"/>
+                      <w:right w:val="none" w:sz="0" w:space="0" w:color="000000"/>
+                    </w:pBdr>
+                    <w:spacing w:after="40" w:before="40" w:line="240"/>
+                    <w:ind w:left="60" w:right="60" w:firstLine="0" w:firstLineChars="0"/>
+                    <w:rPr>
+                      <w:rFonts w:ascii="Arial" w:hAnsi="Arial" w:eastAsia="Arial" w:cs="Arial"/>
+                      <w:i w:val="false"/>
+                      <w:b w:val="false"/>
+                      <w:u w:val="none"/>
+                      <w:strike w:val="false"/>
+                      <w:sz w:val="16"/>
+                      <w:szCs w:val="16"/>
+                      <w:color w:val="000000"/>
+                    </w:rPr>
+                  </w:pPr>
+                </w:p>
+              </w:tc>
+              <w:tc>
+                <w:tcPr>
+                  <w:tcBorders>
+                    <w:bottom w:val="single" w:sz="6" w:space="0" w:color="666666"/>
+                    <w:top w:val="single" w:sz="6" w:space="0" w:color="666666"/>
+                    <w:left w:val="none" w:sz="0" w:space="0" w:color="000000"/>
+                    <w:right w:val="none" w:sz="0" w:space="0" w:color="000000"/>
+                  </w:tcBorders>
+                  <w:shd w:val="clear" w:color="auto" w:fill="FFFFFF"/>
+                  <w:tcMar>
+                    <w:top w:w="0" w:type="dxa"/>
+                    <w:bottom w:w="0" w:type="dxa"/>
+                    <w:left w:w="0" w:type="dxa"/>
+                    <w:right w:w="0" w:type="dxa"/>
+                  </w:tcMar>
+                  <w:vAlign w:val="center"/>
+                </w:tcPr>
+                <w:p>
+                  <w:pPr>
+                    <w:jc w:val="center"/>
+                    <w:pBdr>
+                      <w:bottom w:val="none" w:sz="0" w:space="0" w:color="000000"/>
+                      <w:top w:val="none" w:sz="0" w:space="0" w:color="000000"/>
+                      <w:left w:val="none" w:sz="0" w:space="0" w:color="000000"/>
+                      <w:right w:val="none" w:sz="0" w:space="0" w:color="000000"/>
+                    </w:pBdr>
+                    <w:spacing w:after="40" w:before="40" w:line="240"/>
+                    <w:ind w:left="60" w:right="60" w:firstLine="0" w:firstLineChars="0"/>
+                    <w:rPr>
+                      <w:rFonts w:ascii="Arial" w:hAnsi="Arial" w:eastAsia="Arial" w:cs="Arial"/>
+                      <w:i w:val="false"/>
+                      <w:b w:val="false"/>
+                      <w:u w:val="none"/>
+                      <w:strike w:val="false"/>
+                      <w:sz w:val="16"/>
+                      <w:szCs w:val="16"/>
+                      <w:color w:val="000000"/>
+                    </w:rPr>
+                  </w:pPr>
+                  <w:r xmlns:w="http://schemas.openxmlformats.org/wordprocessingml/2006/main" xmlns:wp="http://schemas.openxmlformats.org/drawingml/2006/wordprocessingDrawing" xmlns:r="http://schemas.openxmlformats.org/officeDocument/2006/relationships" xmlns:w14="http://schemas.microsoft.com/office/word/2010/wordml">
+                    <w:rPr>
+                      <w:rFonts w:ascii="Arial" w:hAnsi="Arial" w:eastAsia="Arial" w:cs="Arial"/>
+                      <w:i w:val="false"/>
+                      <w:b w:val="false"/>
+                      <w:u w:val="none"/>
+                      <w:strike w:val="false"/>
+                      <w:sz w:val="16"/>
+                      <w:szCs w:val="16"/>
+                      <w:color w:val="000000"/>
+                    </w:rPr>
+                    <w:t xml:space="preserve">3</w:t>
+                  </w:r>
+                </w:p>
+              </w:tc>
+              <w:tc>
+                <w:tcPr>
+                  <w:tcBorders>
+                    <w:bottom w:val="single" w:sz="6" w:space="0" w:color="666666"/>
+                    <w:top w:val="single" w:sz="6" w:space="0" w:color="666666"/>
+                    <w:left w:val="none" w:sz="0" w:space="0" w:color="000000"/>
+                    <w:right w:val="none" w:sz="0" w:space="0" w:color="000000"/>
+                  </w:tcBorders>
+                  <w:shd w:val="clear" w:color="auto" w:fill="FFFFFF"/>
+                  <w:tcMar>
+                    <w:top w:w="0" w:type="dxa"/>
+                    <w:bottom w:w="0" w:type="dxa"/>
+                    <w:left w:w="0" w:type="dxa"/>
+                    <w:right w:w="0" w:type="dxa"/>
+                  </w:tcMar>
+                  <w:vAlign w:val="center"/>
+                </w:tcPr>
+                <w:p>
+                  <w:pPr>
+                    <w:jc w:val="center"/>
+                    <w:pBdr>
+                      <w:bottom w:val="none" w:sz="0" w:space="0" w:color="000000"/>
+                      <w:top w:val="none" w:sz="0" w:space="0" w:color="000000"/>
+                      <w:left w:val="none" w:sz="0" w:space="0" w:color="000000"/>
+                      <w:right w:val="none" w:sz="0" w:space="0" w:color="000000"/>
+                    </w:pBdr>
+                    <w:spacing w:after="40" w:before="40" w:line="240"/>
+                    <w:ind w:left="60" w:right="60" w:firstLine="0" w:firstLineChars="0"/>
+                    <w:rPr>
+                      <w:rFonts w:ascii="Arial" w:hAnsi="Arial" w:eastAsia="Arial" w:cs="Arial"/>
+                      <w:i w:val="false"/>
+                      <w:b w:val="false"/>
+                      <w:u w:val="none"/>
+                      <w:strike w:val="false"/>
+                      <w:sz w:val="16"/>
+                      <w:szCs w:val="16"/>
+                      <w:color w:val="000000"/>
+                    </w:rPr>
+                  </w:pPr>
+                  <w:r xmlns:w="http://schemas.openxmlformats.org/wordprocessingml/2006/main" xmlns:wp="http://schemas.openxmlformats.org/drawingml/2006/wordprocessingDrawing" xmlns:r="http://schemas.openxmlformats.org/officeDocument/2006/relationships" xmlns:w14="http://schemas.microsoft.com/office/word/2010/wordml">
+                    <w:rPr>
+                      <w:rFonts w:ascii="Arial" w:hAnsi="Arial" w:eastAsia="Arial" w:cs="Arial"/>
+                      <w:i w:val="false"/>
+                      <w:b w:val="false"/>
+                      <w:u w:val="none"/>
+                      <w:strike w:val="false"/>
+                      <w:sz w:val="16"/>
+                      <w:szCs w:val="16"/>
+                      <w:color w:val="000000"/>
+                    </w:rPr>
+                    <w:t xml:space="preserve">2024-10-10</w:t>
+                  </w:r>
+                </w:p>
+              </w:tc>
+            </w:tr>
+            <w:tr>
+              <w:trPr>
+                <w:trHeight w:val="360" w:hRule="auto"/>
+              </w:trPr>
+              <w:tc>
+                <w:tcPr>
+                  <w:vMerge/>
+                  <w:tcBorders>
+                    <w:bottom w:val="single" w:sz="6" w:space="0" w:color="666666"/>
+                    <w:top w:val="single" w:sz="6" w:space="0" w:color="666666"/>
+                    <w:left w:val="none" w:sz="0" w:space="0" w:color="000000"/>
+                    <w:right w:val="none" w:sz="0" w:space="0" w:color="000000"/>
+                  </w:tcBorders>
+                  <w:shd w:val="clear" w:color="auto" w:fill="FFFFFF"/>
+                  <w:tcMar>
+                    <w:top w:w="0" w:type="dxa"/>
+                    <w:bottom w:w="0" w:type="dxa"/>
+                    <w:left w:w="0" w:type="dxa"/>
+                    <w:right w:w="0" w:type="dxa"/>
+                  </w:tcMar>
+                  <w:vAlign w:val="center"/>
+                </w:tcPr>
+                <w:p>
+                  <w:pPr>
+                    <w:jc w:val="left"/>
+                    <w:pBdr>
+                      <w:bottom w:val="none" w:sz="0" w:space="0" w:color="000000"/>
+                      <w:top w:val="none" w:sz="0" w:space="0" w:color="000000"/>
+                      <w:left w:val="none" w:sz="0" w:space="0" w:color="000000"/>
+                      <w:right w:val="none" w:sz="0" w:space="0" w:color="000000"/>
+                    </w:pBdr>
+                    <w:spacing w:after="40" w:before="40" w:line="240"/>
+                    <w:ind w:left="60" w:right="60" w:firstLine="0" w:firstLineChars="0"/>
+                    <w:rPr>
+                      <w:rFonts w:ascii="Arial" w:hAnsi="Arial" w:eastAsia="Arial" w:cs="Arial"/>
+                      <w:i w:val="false"/>
+                      <w:b w:val="false"/>
+                      <w:u w:val="none"/>
+                      <w:strike w:val="false"/>
+                      <w:sz w:val="16"/>
+                      <w:szCs w:val="16"/>
+                      <w:color w:val="000000"/>
+                    </w:rPr>
+                  </w:pPr>
+                </w:p>
+              </w:tc>
+              <w:tc>
+                <w:tcPr>
+                  <w:tcBorders>
+                    <w:bottom w:val="single" w:sz="6" w:space="0" w:color="666666"/>
+                    <w:top w:val="single" w:sz="6" w:space="0" w:color="666666"/>
+                    <w:left w:val="none" w:sz="0" w:space="0" w:color="000000"/>
+                    <w:right w:val="none" w:sz="0" w:space="0" w:color="000000"/>
+                  </w:tcBorders>
+                  <w:shd w:val="clear" w:color="auto" w:fill="FFFFFF"/>
+                  <w:tcMar>
+                    <w:top w:w="0" w:type="dxa"/>
+                    <w:bottom w:w="0" w:type="dxa"/>
+                    <w:left w:w="0" w:type="dxa"/>
+                    <w:right w:w="0" w:type="dxa"/>
+                  </w:tcMar>
+                  <w:vAlign w:val="center"/>
+                </w:tcPr>
+                <w:p>
+                  <w:pPr>
+                    <w:jc w:val="center"/>
+                    <w:pBdr>
+                      <w:bottom w:val="none" w:sz="0" w:space="0" w:color="000000"/>
+                      <w:top w:val="none" w:sz="0" w:space="0" w:color="000000"/>
+                      <w:left w:val="none" w:sz="0" w:space="0" w:color="000000"/>
+                      <w:right w:val="none" w:sz="0" w:space="0" w:color="000000"/>
+                    </w:pBdr>
+                    <w:spacing w:after="40" w:before="40" w:line="240"/>
+                    <w:ind w:left="60" w:right="60" w:firstLine="0" w:firstLineChars="0"/>
+                    <w:rPr>
+                      <w:rFonts w:ascii="Arial" w:hAnsi="Arial" w:eastAsia="Arial" w:cs="Arial"/>
+                      <w:i w:val="false"/>
+                      <w:b w:val="false"/>
+                      <w:u w:val="none"/>
+                      <w:strike w:val="false"/>
+                      <w:sz w:val="16"/>
+                      <w:szCs w:val="16"/>
+                      <w:color w:val="000000"/>
+                    </w:rPr>
+                  </w:pPr>
+                  <w:r xmlns:w="http://schemas.openxmlformats.org/wordprocessingml/2006/main" xmlns:wp="http://schemas.openxmlformats.org/drawingml/2006/wordprocessingDrawing" xmlns:r="http://schemas.openxmlformats.org/officeDocument/2006/relationships" xmlns:w14="http://schemas.microsoft.com/office/word/2010/wordml">
+                    <w:rPr>
+                      <w:rFonts w:ascii="Arial" w:hAnsi="Arial" w:eastAsia="Arial" w:cs="Arial"/>
+                      <w:i w:val="false"/>
+                      <w:b w:val="false"/>
+                      <w:u w:val="none"/>
+                      <w:strike w:val="false"/>
+                      <w:sz w:val="16"/>
+                      <w:szCs w:val="16"/>
+                      <w:color w:val="000000"/>
+                    </w:rPr>
+                    <w:t xml:space="preserve">4</w:t>
+                  </w:r>
+                </w:p>
+              </w:tc>
+              <w:tc>
+                <w:tcPr>
+                  <w:tcBorders>
+                    <w:bottom w:val="single" w:sz="6" w:space="0" w:color="666666"/>
+                    <w:top w:val="single" w:sz="6" w:space="0" w:color="666666"/>
+                    <w:left w:val="none" w:sz="0" w:space="0" w:color="000000"/>
+                    <w:right w:val="none" w:sz="0" w:space="0" w:color="000000"/>
+                  </w:tcBorders>
+                  <w:shd w:val="clear" w:color="auto" w:fill="FFFFFF"/>
+                  <w:tcMar>
+                    <w:top w:w="0" w:type="dxa"/>
+                    <w:bottom w:w="0" w:type="dxa"/>
+                    <w:left w:w="0" w:type="dxa"/>
+                    <w:right w:w="0" w:type="dxa"/>
+                  </w:tcMar>
+                  <w:vAlign w:val="center"/>
+                </w:tcPr>
+                <w:p>
+                  <w:pPr>
+                    <w:jc w:val="center"/>
+                    <w:pBdr>
+                      <w:bottom w:val="none" w:sz="0" w:space="0" w:color="000000"/>
+                      <w:top w:val="none" w:sz="0" w:space="0" w:color="000000"/>
+                      <w:left w:val="none" w:sz="0" w:space="0" w:color="000000"/>
+                      <w:right w:val="none" w:sz="0" w:space="0" w:color="000000"/>
+                    </w:pBdr>
+                    <w:spacing w:after="40" w:before="40" w:line="240"/>
+                    <w:ind w:left="60" w:right="60" w:firstLine="0" w:firstLineChars="0"/>
+                    <w:rPr>
+                      <w:rFonts w:ascii="Arial" w:hAnsi="Arial" w:eastAsia="Arial" w:cs="Arial"/>
+                      <w:i w:val="false"/>
+                      <w:b w:val="false"/>
+                      <w:u w:val="none"/>
+                      <w:strike w:val="false"/>
+                      <w:sz w:val="16"/>
+                      <w:szCs w:val="16"/>
+                      <w:color w:val="000000"/>
+                    </w:rPr>
+                  </w:pPr>
+                  <w:r xmlns:w="http://schemas.openxmlformats.org/wordprocessingml/2006/main" xmlns:wp="http://schemas.openxmlformats.org/drawingml/2006/wordprocessingDrawing" xmlns:r="http://schemas.openxmlformats.org/officeDocument/2006/relationships" xmlns:w14="http://schemas.microsoft.com/office/word/2010/wordml">
+                    <w:rPr>
+                      <w:rFonts w:ascii="Arial" w:hAnsi="Arial" w:eastAsia="Arial" w:cs="Arial"/>
+                      <w:i w:val="false"/>
+                      <w:b w:val="false"/>
+                      <w:u w:val="none"/>
+                      <w:strike w:val="false"/>
+                      <w:sz w:val="16"/>
+                      <w:szCs w:val="16"/>
+                      <w:color w:val="000000"/>
+                    </w:rPr>
+                    <w:t xml:space="preserve">2025-03-12</w:t>
+                  </w:r>
+                </w:p>
+              </w:tc>
+            </w:tr>
+            <w:tr>
+              <w:trPr>
+                <w:trHeight w:val="360" w:hRule="auto"/>
+              </w:trPr>
+              <w:tc>
+                <w:tcPr>
+                  <w:vMerge/>
+                  <w:tcBorders>
+                    <w:bottom w:val="single" w:sz="6" w:space="0" w:color="666666"/>
+                    <w:top w:val="single" w:sz="6" w:space="0" w:color="666666"/>
+                    <w:left w:val="none" w:sz="0" w:space="0" w:color="000000"/>
+                    <w:right w:val="none" w:sz="0" w:space="0" w:color="000000"/>
+                  </w:tcBorders>
+                  <w:shd w:val="clear" w:color="auto" w:fill="FFFFFF"/>
+                  <w:tcMar>
+                    <w:top w:w="0" w:type="dxa"/>
+                    <w:bottom w:w="0" w:type="dxa"/>
+                    <w:left w:w="0" w:type="dxa"/>
+                    <w:right w:w="0" w:type="dxa"/>
+                  </w:tcMar>
+                  <w:vAlign w:val="center"/>
+                </w:tcPr>
+                <w:p>
+                  <w:pPr>
+                    <w:jc w:val="left"/>
+                    <w:pBdr>
+                      <w:bottom w:val="none" w:sz="0" w:space="0" w:color="000000"/>
+                      <w:top w:val="none" w:sz="0" w:space="0" w:color="000000"/>
+                      <w:left w:val="none" w:sz="0" w:space="0" w:color="000000"/>
+                      <w:right w:val="none" w:sz="0" w:space="0" w:color="000000"/>
+                    </w:pBdr>
+                    <w:spacing w:after="40" w:before="40" w:line="240"/>
+                    <w:ind w:left="60" w:right="60" w:firstLine="0" w:firstLineChars="0"/>
+                    <w:rPr>
+                      <w:rFonts w:ascii="Arial" w:hAnsi="Arial" w:eastAsia="Arial" w:cs="Arial"/>
+                      <w:i w:val="false"/>
+                      <w:b w:val="false"/>
+                      <w:u w:val="none"/>
+                      <w:strike w:val="false"/>
+                      <w:sz w:val="16"/>
+                      <w:szCs w:val="16"/>
+                      <w:color w:val="000000"/>
+                    </w:rPr>
+                  </w:pPr>
+                </w:p>
+              </w:tc>
+              <w:tc>
+                <w:tcPr>
+                  <w:tcBorders>
+                    <w:bottom w:val="single" w:sz="6" w:space="0" w:color="666666"/>
+                    <w:top w:val="single" w:sz="6" w:space="0" w:color="666666"/>
+                    <w:left w:val="none" w:sz="0" w:space="0" w:color="000000"/>
+                    <w:right w:val="none" w:sz="0" w:space="0" w:color="000000"/>
+                  </w:tcBorders>
+                  <w:shd w:val="clear" w:color="auto" w:fill="FFFFFF"/>
+                  <w:tcMar>
+                    <w:top w:w="0" w:type="dxa"/>
+                    <w:bottom w:w="0" w:type="dxa"/>
+                    <w:left w:w="0" w:type="dxa"/>
+                    <w:right w:w="0" w:type="dxa"/>
+                  </w:tcMar>
+                  <w:vAlign w:val="center"/>
+                </w:tcPr>
+                <w:p>
+                  <w:pPr>
+                    <w:jc w:val="center"/>
+                    <w:pBdr>
+                      <w:bottom w:val="none" w:sz="0" w:space="0" w:color="000000"/>
+                      <w:top w:val="none" w:sz="0" w:space="0" w:color="000000"/>
+                      <w:left w:val="none" w:sz="0" w:space="0" w:color="000000"/>
+                      <w:right w:val="none" w:sz="0" w:space="0" w:color="000000"/>
+                    </w:pBdr>
+                    <w:spacing w:after="40" w:before="40" w:line="240"/>
+                    <w:ind w:left="60" w:right="60" w:firstLine="0" w:firstLineChars="0"/>
+                    <w:rPr>
+                      <w:rFonts w:ascii="Arial" w:hAnsi="Arial" w:eastAsia="Arial" w:cs="Arial"/>
+                      <w:i w:val="false"/>
+                      <w:b w:val="false"/>
+                      <w:u w:val="none"/>
+                      <w:strike w:val="false"/>
+                      <w:sz w:val="16"/>
+                      <w:szCs w:val="16"/>
+                      <w:color w:val="000000"/>
+                    </w:rPr>
+                  </w:pPr>
+                  <w:r xmlns:w="http://schemas.openxmlformats.org/wordprocessingml/2006/main" xmlns:wp="http://schemas.openxmlformats.org/drawingml/2006/wordprocessingDrawing" xmlns:r="http://schemas.openxmlformats.org/officeDocument/2006/relationships" xmlns:w14="http://schemas.microsoft.com/office/word/2010/wordml">
+                    <w:rPr>
+                      <w:rFonts w:ascii="Arial" w:hAnsi="Arial" w:eastAsia="Arial" w:cs="Arial"/>
+                      <w:i w:val="false"/>
+                      <w:b w:val="false"/>
+                      <w:u w:val="none"/>
+                      <w:strike w:val="false"/>
+                      <w:sz w:val="16"/>
+                      <w:szCs w:val="16"/>
+                      <w:color w:val="000000"/>
+                    </w:rPr>
+                    <w:t xml:space="preserve">5</w:t>
+                  </w:r>
+                </w:p>
+              </w:tc>
+              <w:tc>
+                <w:tcPr>
+                  <w:tcBorders>
+                    <w:bottom w:val="single" w:sz="6" w:space="0" w:color="666666"/>
+                    <w:top w:val="single" w:sz="6" w:space="0" w:color="666666"/>
+                    <w:left w:val="none" w:sz="0" w:space="0" w:color="000000"/>
+                    <w:right w:val="none" w:sz="0" w:space="0" w:color="000000"/>
+                  </w:tcBorders>
+                  <w:shd w:val="clear" w:color="auto" w:fill="FFFFFF"/>
+                  <w:tcMar>
+                    <w:top w:w="0" w:type="dxa"/>
+                    <w:bottom w:w="0" w:type="dxa"/>
+                    <w:left w:w="0" w:type="dxa"/>
+                    <w:right w:w="0" w:type="dxa"/>
+                  </w:tcMar>
+                  <w:vAlign w:val="center"/>
+                </w:tcPr>
+                <w:p>
+                  <w:pPr>
+                    <w:jc w:val="center"/>
+                    <w:pBdr>
+                      <w:bottom w:val="none" w:sz="0" w:space="0" w:color="000000"/>
+                      <w:top w:val="none" w:sz="0" w:space="0" w:color="000000"/>
+                      <w:left w:val="none" w:sz="0" w:space="0" w:color="000000"/>
+                      <w:right w:val="none" w:sz="0" w:space="0" w:color="000000"/>
+                    </w:pBdr>
+                    <w:spacing w:after="40" w:before="40" w:line="240"/>
+                    <w:ind w:left="60" w:right="60" w:firstLine="0" w:firstLineChars="0"/>
+                    <w:rPr>
+                      <w:rFonts w:ascii="Arial" w:hAnsi="Arial" w:eastAsia="Arial" w:cs="Arial"/>
+                      <w:i w:val="false"/>
+                      <w:b w:val="false"/>
+                      <w:u w:val="none"/>
+                      <w:strike w:val="false"/>
+                      <w:sz w:val="16"/>
+                      <w:szCs w:val="16"/>
+                      <w:color w:val="000000"/>
+                    </w:rPr>
+                  </w:pPr>
+                  <w:r xmlns:w="http://schemas.openxmlformats.org/wordprocessingml/2006/main" xmlns:wp="http://schemas.openxmlformats.org/drawingml/2006/wordprocessingDrawing" xmlns:r="http://schemas.openxmlformats.org/officeDocument/2006/relationships" xmlns:w14="http://schemas.microsoft.com/office/word/2010/wordml">
+                    <w:rPr>
+                      <w:rFonts w:ascii="Arial" w:hAnsi="Arial" w:eastAsia="Arial" w:cs="Arial"/>
+                      <w:i w:val="false"/>
+                      <w:b w:val="false"/>
+                      <w:u w:val="none"/>
+                      <w:strike w:val="false"/>
+                      <w:sz w:val="16"/>
+                      <w:szCs w:val="16"/>
+                      <w:color w:val="000000"/>
+                    </w:rPr>
+                    <w:t xml:space="preserve">2025-07-17</w:t>
+                  </w:r>
+                </w:p>
+              </w:tc>
+            </w:tr>
+            <w:tr>
+              <w:trPr>
+                <w:trHeight w:val="360" w:hRule="auto"/>
+              </w:trPr>
+              <w:tc>
+                <w:tcPr>
+                  <w:vMerge/>
+                  <w:tcBorders>
+                    <w:bottom w:val="single" w:sz="6" w:space="0" w:color="666666"/>
+                    <w:top w:val="single" w:sz="6" w:space="0" w:color="666666"/>
+                    <w:left w:val="none" w:sz="0" w:space="0" w:color="000000"/>
+                    <w:right w:val="none" w:sz="0" w:space="0" w:color="000000"/>
+                  </w:tcBorders>
+                  <w:shd w:val="clear" w:color="auto" w:fill="FFFFFF"/>
+                  <w:tcMar>
+                    <w:top w:w="0" w:type="dxa"/>
+                    <w:bottom w:w="0" w:type="dxa"/>
+                    <w:left w:w="0" w:type="dxa"/>
+                    <w:right w:w="0" w:type="dxa"/>
+                  </w:tcMar>
+                  <w:vAlign w:val="center"/>
+                </w:tcPr>
+                <w:p>
+                  <w:pPr>
+                    <w:jc w:val="left"/>
+                    <w:pBdr>
+                      <w:bottom w:val="none" w:sz="0" w:space="0" w:color="000000"/>
+                      <w:top w:val="none" w:sz="0" w:space="0" w:color="000000"/>
+                      <w:left w:val="none" w:sz="0" w:space="0" w:color="000000"/>
+                      <w:right w:val="none" w:sz="0" w:space="0" w:color="000000"/>
+                    </w:pBdr>
+                    <w:spacing w:after="40" w:before="40" w:line="240"/>
+                    <w:ind w:left="60" w:right="60" w:firstLine="0" w:firstLineChars="0"/>
+                    <w:rPr>
+                      <w:rFonts w:ascii="Arial" w:hAnsi="Arial" w:eastAsia="Arial" w:cs="Arial"/>
+                      <w:i w:val="false"/>
+                      <w:b w:val="false"/>
+                      <w:u w:val="none"/>
+                      <w:strike w:val="false"/>
+                      <w:sz w:val="16"/>
+                      <w:szCs w:val="16"/>
+                      <w:color w:val="000000"/>
+                    </w:rPr>
+                  </w:pPr>
+                </w:p>
+              </w:tc>
+              <w:tc>
+                <w:tcPr>
+                  <w:tcBorders>
+                    <w:bottom w:val="single" w:sz="6" w:space="0" w:color="666666"/>
+                    <w:top w:val="single" w:sz="6" w:space="0" w:color="666666"/>
+                    <w:left w:val="none" w:sz="0" w:space="0" w:color="000000"/>
+                    <w:right w:val="none" w:sz="0" w:space="0" w:color="000000"/>
+                  </w:tcBorders>
+                  <w:shd w:val="clear" w:color="auto" w:fill="FFFFFF"/>
+                  <w:tcMar>
+                    <w:top w:w="0" w:type="dxa"/>
+                    <w:bottom w:w="0" w:type="dxa"/>
+                    <w:left w:w="0" w:type="dxa"/>
+                    <w:right w:w="0" w:type="dxa"/>
+                  </w:tcMar>
+                  <w:vAlign w:val="center"/>
+                </w:tcPr>
+                <w:p>
+                  <w:pPr>
+                    <w:jc w:val="center"/>
+                    <w:pBdr>
+                      <w:bottom w:val="none" w:sz="0" w:space="0" w:color="000000"/>
+                      <w:top w:val="none" w:sz="0" w:space="0" w:color="000000"/>
+                      <w:left w:val="none" w:sz="0" w:space="0" w:color="000000"/>
+                      <w:right w:val="none" w:sz="0" w:space="0" w:color="000000"/>
+                    </w:pBdr>
+                    <w:spacing w:after="40" w:before="40" w:line="240"/>
+                    <w:ind w:left="60" w:right="60" w:firstLine="0" w:firstLineChars="0"/>
+                    <w:rPr>
+                      <w:rFonts w:ascii="Arial" w:hAnsi="Arial" w:eastAsia="Arial" w:cs="Arial"/>
+                      <w:i w:val="false"/>
+                      <w:b w:val="false"/>
+                      <w:u w:val="none"/>
+                      <w:strike w:val="false"/>
+                      <w:sz w:val="16"/>
+                      <w:szCs w:val="16"/>
+                      <w:color w:val="000000"/>
+                    </w:rPr>
+                  </w:pPr>
+                  <w:r xmlns:w="http://schemas.openxmlformats.org/wordprocessingml/2006/main" xmlns:wp="http://schemas.openxmlformats.org/drawingml/2006/wordprocessingDrawing" xmlns:r="http://schemas.openxmlformats.org/officeDocument/2006/relationships" xmlns:w14="http://schemas.microsoft.com/office/word/2010/wordml">
+                    <w:rPr>
+                      <w:rFonts w:ascii="Arial" w:hAnsi="Arial" w:eastAsia="Arial" w:cs="Arial"/>
+                      <w:i w:val="false"/>
+                      <w:b w:val="false"/>
+                      <w:u w:val="none"/>
+                      <w:strike w:val="false"/>
+                      <w:sz w:val="16"/>
+                      <w:szCs w:val="16"/>
+                      <w:color w:val="000000"/>
+                    </w:rPr>
+                    <w:t xml:space="preserve">6</w:t>
+                  </w:r>
+                </w:p>
+              </w:tc>
+              <w:tc>
+                <w:tcPr>
+                  <w:tcBorders>
+                    <w:bottom w:val="single" w:sz="6" w:space="0" w:color="666666"/>
+                    <w:top w:val="single" w:sz="6" w:space="0" w:color="666666"/>
+                    <w:left w:val="none" w:sz="0" w:space="0" w:color="000000"/>
+                    <w:right w:val="none" w:sz="0" w:space="0" w:color="000000"/>
+                  </w:tcBorders>
+                  <w:shd w:val="clear" w:color="auto" w:fill="FFFFFF"/>
+                  <w:tcMar>
+                    <w:top w:w="0" w:type="dxa"/>
+                    <w:bottom w:w="0" w:type="dxa"/>
+                    <w:left w:w="0" w:type="dxa"/>
+                    <w:right w:w="0" w:type="dxa"/>
+                  </w:tcMar>
+                  <w:vAlign w:val="center"/>
+                </w:tcPr>
+                <w:p>
+                  <w:pPr>
+                    <w:jc w:val="center"/>
+                    <w:pBdr>
+                      <w:bottom w:val="none" w:sz="0" w:space="0" w:color="000000"/>
+                      <w:top w:val="none" w:sz="0" w:space="0" w:color="000000"/>
+                      <w:left w:val="none" w:sz="0" w:space="0" w:color="000000"/>
+                      <w:right w:val="none" w:sz="0" w:space="0" w:color="000000"/>
+                    </w:pBdr>
+                    <w:spacing w:after="40" w:before="40" w:line="240"/>
+                    <w:ind w:left="60" w:right="60" w:firstLine="0" w:firstLineChars="0"/>
+                    <w:rPr>
+                      <w:rFonts w:ascii="Arial" w:hAnsi="Arial" w:eastAsia="Arial" w:cs="Arial"/>
+                      <w:i w:val="false"/>
+                      <w:b w:val="false"/>
+                      <w:u w:val="none"/>
+                      <w:strike w:val="false"/>
+                      <w:sz w:val="16"/>
+                      <w:szCs w:val="16"/>
+                      <w:color w:val="000000"/>
+                    </w:rPr>
+                  </w:pPr>
+                  <w:r xmlns:w="http://schemas.openxmlformats.org/wordprocessingml/2006/main" xmlns:wp="http://schemas.openxmlformats.org/drawingml/2006/wordprocessingDrawing" xmlns:r="http://schemas.openxmlformats.org/officeDocument/2006/relationships" xmlns:w14="http://schemas.microsoft.com/office/word/2010/wordml">
+                    <w:rPr>
+                      <w:rFonts w:ascii="Arial" w:hAnsi="Arial" w:eastAsia="Arial" w:cs="Arial"/>
+                      <w:i w:val="false"/>
+                      <w:b w:val="false"/>
+                      <w:u w:val="none"/>
+                      <w:strike w:val="false"/>
+                      <w:sz w:val="16"/>
+                      <w:szCs w:val="16"/>
+                      <w:color w:val="000000"/>
+                    </w:rPr>
+                    <w:t xml:space="preserve">2025-08-29</w:t>
+                  </w:r>
+                </w:p>
+              </w:tc>
+            </w:tr>
+            <w:tr>
+              <w:trPr>
+                <w:trHeight w:val="360" w:hRule="auto"/>
+              </w:trPr>
+              <w:tc>
+                <w:tcPr>
+                  <w:vMerge/>
+                  <w:tcBorders>
+                    <w:bottom w:val="single" w:sz="6" w:space="0" w:color="666666"/>
+                    <w:top w:val="single" w:sz="6" w:space="0" w:color="666666"/>
+                    <w:left w:val="none" w:sz="0" w:space="0" w:color="000000"/>
+                    <w:right w:val="none" w:sz="0" w:space="0" w:color="000000"/>
+                  </w:tcBorders>
+                  <w:shd w:val="clear" w:color="auto" w:fill="FFFFFF"/>
+                  <w:tcMar>
+                    <w:top w:w="0" w:type="dxa"/>
+                    <w:bottom w:w="0" w:type="dxa"/>
+                    <w:left w:w="0" w:type="dxa"/>
+                    <w:right w:w="0" w:type="dxa"/>
+                  </w:tcMar>
+                  <w:vAlign w:val="center"/>
+                </w:tcPr>
+                <w:p>
+                  <w:pPr>
+                    <w:jc w:val="left"/>
+                    <w:pBdr>
+                      <w:bottom w:val="none" w:sz="0" w:space="0" w:color="000000"/>
+                      <w:top w:val="none" w:sz="0" w:space="0" w:color="000000"/>
+                      <w:left w:val="none" w:sz="0" w:space="0" w:color="000000"/>
+                      <w:right w:val="none" w:sz="0" w:space="0" w:color="000000"/>
+                    </w:pBdr>
+                    <w:spacing w:after="40" w:before="40" w:line="240"/>
+                    <w:ind w:left="60" w:right="60" w:firstLine="0" w:firstLineChars="0"/>
+                    <w:rPr>
+                      <w:rFonts w:ascii="Arial" w:hAnsi="Arial" w:eastAsia="Arial" w:cs="Arial"/>
+                      <w:i w:val="false"/>
+                      <w:b w:val="false"/>
+                      <w:u w:val="none"/>
+                      <w:strike w:val="false"/>
+                      <w:sz w:val="16"/>
+                      <w:szCs w:val="16"/>
+                      <w:color w:val="000000"/>
+                    </w:rPr>
+                  </w:pPr>
+                </w:p>
+              </w:tc>
+              <w:tc>
+                <w:tcPr>
+                  <w:tcBorders>
+                    <w:bottom w:val="single" w:sz="6" w:space="0" w:color="666666"/>
+                    <w:top w:val="single" w:sz="6" w:space="0" w:color="666666"/>
+                    <w:left w:val="none" w:sz="0" w:space="0" w:color="000000"/>
+                    <w:right w:val="none" w:sz="0" w:space="0" w:color="000000"/>
+                  </w:tcBorders>
+                  <w:shd w:val="clear" w:color="auto" w:fill="FFFFFF"/>
+                  <w:tcMar>
+                    <w:top w:w="0" w:type="dxa"/>
+                    <w:bottom w:w="0" w:type="dxa"/>
+                    <w:left w:w="0" w:type="dxa"/>
+                    <w:right w:w="0" w:type="dxa"/>
+                  </w:tcMar>
+                  <w:vAlign w:val="center"/>
+                </w:tcPr>
+                <w:p>
+                  <w:pPr>
+                    <w:jc w:val="center"/>
+                    <w:pBdr>
+                      <w:bottom w:val="none" w:sz="0" w:space="0" w:color="000000"/>
+                      <w:top w:val="none" w:sz="0" w:space="0" w:color="000000"/>
+                      <w:left w:val="none" w:sz="0" w:space="0" w:color="000000"/>
+                      <w:right w:val="none" w:sz="0" w:space="0" w:color="000000"/>
+                    </w:pBdr>
+                    <w:spacing w:after="40" w:before="40" w:line="240"/>
+                    <w:ind w:left="60" w:right="60" w:firstLine="0" w:firstLineChars="0"/>
+                    <w:rPr>
+                      <w:rFonts w:ascii="Arial" w:hAnsi="Arial" w:eastAsia="Arial" w:cs="Arial"/>
+                      <w:i w:val="false"/>
+                      <w:b w:val="false"/>
+                      <w:u w:val="none"/>
+                      <w:strike w:val="false"/>
+                      <w:sz w:val="16"/>
+                      <w:szCs w:val="16"/>
+                      <w:color w:val="000000"/>
+                    </w:rPr>
+                  </w:pPr>
+                  <w:r xmlns:w="http://schemas.openxmlformats.org/wordprocessingml/2006/main" xmlns:wp="http://schemas.openxmlformats.org/drawingml/2006/wordprocessingDrawing" xmlns:r="http://schemas.openxmlformats.org/officeDocument/2006/relationships" xmlns:w14="http://schemas.microsoft.com/office/word/2010/wordml">
+                    <w:rPr>
+                      <w:rFonts w:ascii="Arial" w:hAnsi="Arial" w:eastAsia="Arial" w:cs="Arial"/>
+                      <w:i w:val="false"/>
+                      <w:b w:val="false"/>
+                      <w:u w:val="none"/>
+                      <w:strike w:val="false"/>
+                      <w:sz w:val="16"/>
+                      <w:szCs w:val="16"/>
+                      <w:color w:val="000000"/>
+                    </w:rPr>
+                    <w:t xml:space="preserve">7</w:t>
+                  </w:r>
+                </w:p>
+              </w:tc>
+              <w:tc>
+                <w:tcPr>
+                  <w:tcBorders>
+                    <w:bottom w:val="single" w:sz="6" w:space="0" w:color="666666"/>
+                    <w:top w:val="single" w:sz="6" w:space="0" w:color="666666"/>
+                    <w:left w:val="none" w:sz="0" w:space="0" w:color="000000"/>
+                    <w:right w:val="none" w:sz="0" w:space="0" w:color="000000"/>
+                  </w:tcBorders>
+                  <w:shd w:val="clear" w:color="auto" w:fill="FFFFFF"/>
+                  <w:tcMar>
+                    <w:top w:w="0" w:type="dxa"/>
+                    <w:bottom w:w="0" w:type="dxa"/>
+                    <w:left w:w="0" w:type="dxa"/>
+                    <w:right w:w="0" w:type="dxa"/>
+                  </w:tcMar>
+                  <w:vAlign w:val="center"/>
+                </w:tcPr>
+                <w:p>
+                  <w:pPr>
+                    <w:jc w:val="center"/>
+                    <w:pBdr>
+                      <w:bottom w:val="none" w:sz="0" w:space="0" w:color="000000"/>
+                      <w:top w:val="none" w:sz="0" w:space="0" w:color="000000"/>
+                      <w:left w:val="none" w:sz="0" w:space="0" w:color="000000"/>
+                      <w:right w:val="none" w:sz="0" w:space="0" w:color="000000"/>
+                    </w:pBdr>
+                    <w:spacing w:after="40" w:before="40" w:line="240"/>
+                    <w:ind w:left="60" w:right="60" w:firstLine="0" w:firstLineChars="0"/>
+                    <w:rPr>
+                      <w:rFonts w:ascii="Arial" w:hAnsi="Arial" w:eastAsia="Arial" w:cs="Arial"/>
+                      <w:i w:val="false"/>
+                      <w:b w:val="false"/>
+                      <w:u w:val="none"/>
+                      <w:strike w:val="false"/>
+                      <w:sz w:val="16"/>
+                      <w:szCs w:val="16"/>
+                      <w:color w:val="000000"/>
+                    </w:rPr>
+                  </w:pPr>
+                  <w:r xmlns:w="http://schemas.openxmlformats.org/wordprocessingml/2006/main" xmlns:wp="http://schemas.openxmlformats.org/drawingml/2006/wordprocessingDrawing" xmlns:r="http://schemas.openxmlformats.org/officeDocument/2006/relationships" xmlns:w14="http://schemas.microsoft.com/office/word/2010/wordml">
+                    <w:rPr>
+                      <w:rFonts w:ascii="Arial" w:hAnsi="Arial" w:eastAsia="Arial" w:cs="Arial"/>
+                      <w:i w:val="false"/>
+                      <w:b w:val="false"/>
+                      <w:u w:val="none"/>
+                      <w:strike w:val="false"/>
+                      <w:sz w:val="16"/>
+                      <w:szCs w:val="16"/>
+                      <w:color w:val="000000"/>
+                    </w:rPr>
+                    <w:t xml:space="preserve">2025-09-19</w:t>
+                  </w:r>
+                </w:p>
+              </w:tc>
+            </w:tr>
+            <w:tr>
+              <w:trPr>
+                <w:trHeight w:val="360" w:hRule="auto"/>
+              </w:trPr>
+              <w:tc>
+                <w:tcPr>
+                  <w:vMerge/>
+                  <w:tcBorders>
+                    <w:bottom w:val="single" w:sz="6" w:space="0" w:color="666666"/>
+                    <w:top w:val="single" w:sz="6" w:space="0" w:color="666666"/>
+                    <w:left w:val="none" w:sz="0" w:space="0" w:color="000000"/>
+                    <w:right w:val="none" w:sz="0" w:space="0" w:color="000000"/>
+                  </w:tcBorders>
+                  <w:shd w:val="clear" w:color="auto" w:fill="FFFFFF"/>
+                  <w:tcMar>
+                    <w:top w:w="0" w:type="dxa"/>
+                    <w:bottom w:w="0" w:type="dxa"/>
+                    <w:left w:w="0" w:type="dxa"/>
+                    <w:right w:w="0" w:type="dxa"/>
+                  </w:tcMar>
+                  <w:vAlign w:val="center"/>
+                </w:tcPr>
+                <w:p>
+                  <w:pPr>
+                    <w:jc w:val="left"/>
+                    <w:pBdr>
+                      <w:bottom w:val="none" w:sz="0" w:space="0" w:color="000000"/>
+                      <w:top w:val="none" w:sz="0" w:space="0" w:color="000000"/>
+                      <w:left w:val="none" w:sz="0" w:space="0" w:color="000000"/>
+                      <w:right w:val="none" w:sz="0" w:space="0" w:color="000000"/>
+                    </w:pBdr>
+                    <w:spacing w:after="40" w:before="40" w:line="240"/>
+                    <w:ind w:left="60" w:right="60" w:firstLine="0" w:firstLineChars="0"/>
+                    <w:rPr>
+                      <w:rFonts w:ascii="Arial" w:hAnsi="Arial" w:eastAsia="Arial" w:cs="Arial"/>
+                      <w:i w:val="false"/>
+                      <w:b w:val="false"/>
+                      <w:u w:val="none"/>
+                      <w:strike w:val="false"/>
+                      <w:sz w:val="16"/>
+                      <w:szCs w:val="16"/>
+                      <w:color w:val="000000"/>
+                    </w:rPr>
+                  </w:pPr>
+                </w:p>
+              </w:tc>
+              <w:tc>
+                <w:tcPr>
+                  <w:tcBorders>
+                    <w:bottom w:val="single" w:sz="6" w:space="0" w:color="666666"/>
+                    <w:top w:val="single" w:sz="6" w:space="0" w:color="666666"/>
+                    <w:left w:val="none" w:sz="0" w:space="0" w:color="000000"/>
+                    <w:right w:val="none" w:sz="0" w:space="0" w:color="000000"/>
+                  </w:tcBorders>
+                  <w:shd w:val="clear" w:color="auto" w:fill="FFFFFF"/>
+                  <w:tcMar>
+                    <w:top w:w="0" w:type="dxa"/>
+                    <w:bottom w:w="0" w:type="dxa"/>
+                    <w:left w:w="0" w:type="dxa"/>
+                    <w:right w:w="0" w:type="dxa"/>
+                  </w:tcMar>
+                  <w:vAlign w:val="center"/>
+                </w:tcPr>
+                <w:p>
+                  <w:pPr>
+                    <w:jc w:val="center"/>
+                    <w:pBdr>
+                      <w:bottom w:val="none" w:sz="0" w:space="0" w:color="000000"/>
+                      <w:top w:val="none" w:sz="0" w:space="0" w:color="000000"/>
+                      <w:left w:val="none" w:sz="0" w:space="0" w:color="000000"/>
+                      <w:right w:val="none" w:sz="0" w:space="0" w:color="000000"/>
+                    </w:pBdr>
+                    <w:spacing w:after="40" w:before="40" w:line="240"/>
+                    <w:ind w:left="60" w:right="60" w:firstLine="0" w:firstLineChars="0"/>
+                    <w:rPr>
+                      <w:rFonts w:ascii="Arial" w:hAnsi="Arial" w:eastAsia="Arial" w:cs="Arial"/>
+                      <w:i w:val="false"/>
+                      <w:b w:val="false"/>
+                      <w:u w:val="none"/>
+                      <w:strike w:val="false"/>
+                      <w:sz w:val="16"/>
+                      <w:szCs w:val="16"/>
+                      <w:color w:val="000000"/>
+                    </w:rPr>
+                  </w:pPr>
+                  <w:r xmlns:w="http://schemas.openxmlformats.org/wordprocessingml/2006/main" xmlns:wp="http://schemas.openxmlformats.org/drawingml/2006/wordprocessingDrawing" xmlns:r="http://schemas.openxmlformats.org/officeDocument/2006/relationships" xmlns:w14="http://schemas.microsoft.com/office/word/2010/wordml">
+                    <w:rPr>
+                      <w:rFonts w:ascii="Arial" w:hAnsi="Arial" w:eastAsia="Arial" w:cs="Arial"/>
+                      <w:i w:val="false"/>
+                      <w:b w:val="false"/>
+                      <w:u w:val="none"/>
+                      <w:strike w:val="false"/>
+                      <w:sz w:val="16"/>
+                      <w:szCs w:val="16"/>
+                      <w:color w:val="000000"/>
+                    </w:rPr>
+                    <w:t xml:space="preserve">8</w:t>
+                  </w:r>
+                </w:p>
+              </w:tc>
+              <w:tc>
+                <w:tcPr>
+                  <w:tcBorders>
+                    <w:bottom w:val="single" w:sz="6" w:space="0" w:color="666666"/>
+                    <w:top w:val="single" w:sz="6" w:space="0" w:color="666666"/>
+                    <w:left w:val="none" w:sz="0" w:space="0" w:color="000000"/>
+                    <w:right w:val="none" w:sz="0" w:space="0" w:color="000000"/>
+                  </w:tcBorders>
+                  <w:shd w:val="clear" w:color="auto" w:fill="FFFFFF"/>
+                  <w:tcMar>
+                    <w:top w:w="0" w:type="dxa"/>
+                    <w:bottom w:w="0" w:type="dxa"/>
+                    <w:left w:w="0" w:type="dxa"/>
+                    <w:right w:w="0" w:type="dxa"/>
+                  </w:tcMar>
+                  <w:vAlign w:val="center"/>
+                </w:tcPr>
+                <w:p>
+                  <w:pPr>
+                    <w:jc w:val="center"/>
+                    <w:pBdr>
+                      <w:bottom w:val="none" w:sz="0" w:space="0" w:color="000000"/>
+                      <w:top w:val="none" w:sz="0" w:space="0" w:color="000000"/>
+                      <w:left w:val="none" w:sz="0" w:space="0" w:color="000000"/>
+                      <w:right w:val="none" w:sz="0" w:space="0" w:color="000000"/>
+                    </w:pBdr>
+                    <w:spacing w:after="40" w:before="40" w:line="240"/>
+                    <w:ind w:left="60" w:right="60" w:firstLine="0" w:firstLineChars="0"/>
+                    <w:rPr>
+                      <w:rFonts w:ascii="Arial" w:hAnsi="Arial" w:eastAsia="Arial" w:cs="Arial"/>
+                      <w:i w:val="false"/>
+                      <w:b w:val="false"/>
+                      <w:u w:val="none"/>
+                      <w:strike w:val="false"/>
+                      <w:sz w:val="16"/>
+                      <w:szCs w:val="16"/>
+                      <w:color w:val="000000"/>
+                    </w:rPr>
+                  </w:pPr>
+                  <w:r xmlns:w="http://schemas.openxmlformats.org/wordprocessingml/2006/main" xmlns:wp="http://schemas.openxmlformats.org/drawingml/2006/wordprocessingDrawing" xmlns:r="http://schemas.openxmlformats.org/officeDocument/2006/relationships" xmlns:w14="http://schemas.microsoft.com/office/word/2010/wordml">
+                    <w:rPr>
+                      <w:rFonts w:ascii="Arial" w:hAnsi="Arial" w:eastAsia="Arial" w:cs="Arial"/>
+                      <w:i w:val="false"/>
+                      <w:b w:val="false"/>
+                      <w:u w:val="none"/>
+                      <w:strike w:val="false"/>
+                      <w:sz w:val="16"/>
+                      <w:szCs w:val="16"/>
+                      <w:color w:val="000000"/>
+                    </w:rPr>
+                    <w:t xml:space="preserve">2025-09-30</w:t>
+                  </w:r>
+                </w:p>
+              </w:tc>
+            </w:tr>
+            <w:tr>
+              <w:trPr>
+                <w:trHeight w:val="360" w:hRule="auto"/>
+              </w:trPr>
+              <w:tc>
+                <w:tcPr>
+                  <w:vMerge w:val="restart"/>
+                  <w:tcBorders>
+                    <w:bottom w:val="single" w:sz="12" w:space="0" w:color="666666"/>
+                    <w:top w:val="single" w:sz="6" w:space="0" w:color="666666"/>
+                    <w:left w:val="none" w:sz="0" w:space="0" w:color="000000"/>
+                    <w:right w:val="none" w:sz="0" w:space="0" w:color="000000"/>
+                  </w:tcBorders>
+                  <w:shd w:val="clear" w:color="auto" w:fill="FFFFFF"/>
+                  <w:tcMar>
+                    <w:top w:w="0" w:type="dxa"/>
+                    <w:bottom w:w="0" w:type="dxa"/>
+                    <w:left w:w="0" w:type="dxa"/>
+                    <w:right w:w="0" w:type="dxa"/>
+                  </w:tcMar>
+                  <w:vAlign w:val="center"/>
+                </w:tcPr>
+                <w:p>
+                  <w:pPr>
+                    <w:jc w:val="left"/>
+                    <w:pBdr>
+                      <w:bottom w:val="none" w:sz="0" w:space="0" w:color="000000"/>
+                      <w:top w:val="none" w:sz="0" w:space="0" w:color="000000"/>
+                      <w:left w:val="none" w:sz="0" w:space="0" w:color="000000"/>
+                      <w:right w:val="none" w:sz="0" w:space="0" w:color="000000"/>
+                    </w:pBdr>
+                    <w:spacing w:after="40" w:before="40" w:line="240"/>
+                    <w:ind w:left="60" w:right="60" w:firstLine="0" w:firstLineChars="0"/>
+                    <w:rPr>
+                      <w:rFonts w:ascii="Arial" w:hAnsi="Arial" w:eastAsia="Arial" w:cs="Arial"/>
+                      <w:i w:val="false"/>
+                      <w:b w:val="false"/>
+                      <w:u w:val="none"/>
+                      <w:strike w:val="false"/>
+                      <w:sz w:val="16"/>
+                      <w:szCs w:val="16"/>
+                      <w:color w:val="000000"/>
+                    </w:rPr>
+                  </w:pPr>
+                  <w:r xmlns:w="http://schemas.openxmlformats.org/wordprocessingml/2006/main" xmlns:wp="http://schemas.openxmlformats.org/drawingml/2006/wordprocessingDrawing" xmlns:r="http://schemas.openxmlformats.org/officeDocument/2006/relationships" xmlns:w14="http://schemas.microsoft.com/office/word/2010/wordml">
+                    <w:rPr>
+                      <w:rFonts w:ascii="Arial" w:hAnsi="Arial" w:eastAsia="Arial" w:cs="Arial"/>
+                      <w:i w:val="false"/>
+                      <w:b w:val="false"/>
+                      <w:u w:val="none"/>
+                      <w:strike w:val="false"/>
+                      <w:sz w:val="16"/>
+                      <w:szCs w:val="16"/>
+                      <w:color w:val="000000"/>
+                    </w:rPr>
+                    <w:t xml:space="preserve">Glade</w:t>
+                  </w:r>
+                </w:p>
+              </w:tc>
+              <w:tc>
+                <w:tcPr>
+                  <w:tcBorders>
+                    <w:bottom w:val="single" w:sz="6" w:space="0" w:color="666666"/>
+                    <w:top w:val="single" w:sz="6" w:space="0" w:color="666666"/>
+                    <w:left w:val="none" w:sz="0" w:space="0" w:color="000000"/>
+                    <w:right w:val="none" w:sz="0" w:space="0" w:color="000000"/>
+                  </w:tcBorders>
+                  <w:shd w:val="clear" w:color="auto" w:fill="FFFFFF"/>
+                  <w:tcMar>
+                    <w:top w:w="0" w:type="dxa"/>
+                    <w:bottom w:w="0" w:type="dxa"/>
+                    <w:left w:w="0" w:type="dxa"/>
+                    <w:right w:w="0" w:type="dxa"/>
+                  </w:tcMar>
+                  <w:vAlign w:val="center"/>
+                </w:tcPr>
+                <w:p>
+                  <w:pPr>
+                    <w:jc w:val="center"/>
+                    <w:pBdr>
+                      <w:bottom w:val="none" w:sz="0" w:space="0" w:color="000000"/>
+                      <w:top w:val="none" w:sz="0" w:space="0" w:color="000000"/>
+                      <w:left w:val="none" w:sz="0" w:space="0" w:color="000000"/>
+                      <w:right w:val="none" w:sz="0" w:space="0" w:color="000000"/>
+                    </w:pBdr>
+                    <w:spacing w:after="40" w:before="40" w:line="240"/>
+                    <w:ind w:left="60" w:right="60" w:firstLine="0" w:firstLineChars="0"/>
+                    <w:rPr>
+                      <w:rFonts w:ascii="Arial" w:hAnsi="Arial" w:eastAsia="Arial" w:cs="Arial"/>
+                      <w:i w:val="false"/>
+                      <w:b w:val="false"/>
+                      <w:u w:val="none"/>
+                      <w:strike w:val="false"/>
+                      <w:sz w:val="16"/>
+                      <w:szCs w:val="16"/>
+                      <w:color w:val="000000"/>
+                    </w:rPr>
+                  </w:pPr>
+                  <w:r xmlns:w="http://schemas.openxmlformats.org/wordprocessingml/2006/main" xmlns:wp="http://schemas.openxmlformats.org/drawingml/2006/wordprocessingDrawing" xmlns:r="http://schemas.openxmlformats.org/officeDocument/2006/relationships" xmlns:w14="http://schemas.microsoft.com/office/word/2010/wordml">
+                    <w:rPr>
+                      <w:rFonts w:ascii="Arial" w:hAnsi="Arial" w:eastAsia="Arial" w:cs="Arial"/>
+                      <w:i w:val="false"/>
+                      <w:b w:val="false"/>
+                      <w:u w:val="none"/>
+                      <w:strike w:val="false"/>
+                      <w:sz w:val="16"/>
+                      <w:szCs w:val="16"/>
+                      <w:color w:val="000000"/>
+                    </w:rPr>
+                    <w:t xml:space="preserve">0</w:t>
+                  </w:r>
+                </w:p>
+              </w:tc>
+              <w:tc>
+                <w:tcPr>
+                  <w:tcBorders>
+                    <w:bottom w:val="single" w:sz="6" w:space="0" w:color="666666"/>
+                    <w:top w:val="single" w:sz="6" w:space="0" w:color="666666"/>
+                    <w:left w:val="none" w:sz="0" w:space="0" w:color="000000"/>
+                    <w:right w:val="none" w:sz="0" w:space="0" w:color="000000"/>
+                  </w:tcBorders>
+                  <w:shd w:val="clear" w:color="auto" w:fill="FFFFFF"/>
+                  <w:tcMar>
+                    <w:top w:w="0" w:type="dxa"/>
+                    <w:bottom w:w="0" w:type="dxa"/>
+                    <w:left w:w="0" w:type="dxa"/>
+                    <w:right w:w="0" w:type="dxa"/>
+                  </w:tcMar>
+                  <w:vAlign w:val="center"/>
+                </w:tcPr>
+                <w:p>
+                  <w:pPr>
+                    <w:jc w:val="center"/>
+                    <w:pBdr>
+                      <w:bottom w:val="none" w:sz="0" w:space="0" w:color="000000"/>
+                      <w:top w:val="none" w:sz="0" w:space="0" w:color="000000"/>
+                      <w:left w:val="none" w:sz="0" w:space="0" w:color="000000"/>
+                      <w:right w:val="none" w:sz="0" w:space="0" w:color="000000"/>
+                    </w:pBdr>
+                    <w:spacing w:after="40" w:before="40" w:line="240"/>
+                    <w:ind w:left="60" w:right="60" w:firstLine="0" w:firstLineChars="0"/>
+                    <w:rPr>
+                      <w:rFonts w:ascii="Arial" w:hAnsi="Arial" w:eastAsia="Arial" w:cs="Arial"/>
+                      <w:i w:val="false"/>
+                      <w:b w:val="false"/>
+                      <w:u w:val="none"/>
+                      <w:strike w:val="false"/>
+                      <w:sz w:val="16"/>
+                      <w:szCs w:val="16"/>
+                      <w:color w:val="000000"/>
+                    </w:rPr>
+                  </w:pPr>
+                  <w:r xmlns:w="http://schemas.openxmlformats.org/wordprocessingml/2006/main" xmlns:wp="http://schemas.openxmlformats.org/drawingml/2006/wordprocessingDrawing" xmlns:r="http://schemas.openxmlformats.org/officeDocument/2006/relationships" xmlns:w14="http://schemas.microsoft.com/office/word/2010/wordml">
+                    <w:rPr>
+                      <w:rFonts w:ascii="Arial" w:hAnsi="Arial" w:eastAsia="Arial" w:cs="Arial"/>
+                      <w:i w:val="false"/>
+                      <w:b w:val="false"/>
+                      <w:u w:val="none"/>
+                      <w:strike w:val="false"/>
+                      <w:sz w:val="16"/>
+                      <w:szCs w:val="16"/>
+                      <w:color w:val="000000"/>
+                    </w:rPr>
+                    <w:t xml:space="preserve">2023-07-26</w:t>
+                  </w:r>
+                </w:p>
+              </w:tc>
+            </w:tr>
+            <w:tr>
+              <w:trPr>
+                <w:trHeight w:val="360" w:hRule="auto"/>
+              </w:trPr>
+              <w:tc>
+                <w:tcPr>
+                  <w:vMerge/>
+                  <w:tcBorders>
+                    <w:bottom w:val="single" w:sz="6" w:space="0" w:color="666666"/>
+                    <w:top w:val="single" w:sz="12" w:space="0" w:color="666666"/>
+                    <w:left w:val="none" w:sz="0" w:space="0" w:color="000000"/>
+                    <w:right w:val="none" w:sz="0" w:space="0" w:color="000000"/>
+                  </w:tcBorders>
+                  <w:shd w:val="clear" w:color="auto" w:fill="FFFFFF"/>
+                  <w:tcMar>
+                    <w:top w:w="0" w:type="dxa"/>
+                    <w:bottom w:w="0" w:type="dxa"/>
+                    <w:left w:w="0" w:type="dxa"/>
+                    <w:right w:w="0" w:type="dxa"/>
+                  </w:tcMar>
+                  <w:vAlign w:val="center"/>
+                </w:tcPr>
+                <w:p>
+                  <w:pPr>
+                    <w:jc w:val="left"/>
+                    <w:pBdr>
+                      <w:bottom w:val="none" w:sz="0" w:space="0" w:color="000000"/>
+                      <w:top w:val="none" w:sz="0" w:space="0" w:color="000000"/>
+                      <w:left w:val="none" w:sz="0" w:space="0" w:color="000000"/>
+                      <w:right w:val="none" w:sz="0" w:space="0" w:color="000000"/>
+                    </w:pBdr>
+                    <w:spacing w:after="40" w:before="40" w:line="240"/>
+                    <w:ind w:left="60" w:right="60" w:firstLine="0" w:firstLineChars="0"/>
+                    <w:rPr>
+                      <w:rFonts w:ascii="Arial" w:hAnsi="Arial" w:eastAsia="Arial" w:cs="Arial"/>
+                      <w:i w:val="false"/>
+                      <w:b w:val="false"/>
+                      <w:u w:val="none"/>
+                      <w:strike w:val="false"/>
+                      <w:sz w:val="16"/>
+                      <w:szCs w:val="16"/>
+                      <w:color w:val="000000"/>
+                    </w:rPr>
+                  </w:pPr>
+                </w:p>
+              </w:tc>
+              <w:tc>
+                <w:tcPr>
+                  <w:tcBorders>
+                    <w:bottom w:val="single" w:sz="6" w:space="0" w:color="666666"/>
+                    <w:top w:val="single" w:sz="6" w:space="0" w:color="666666"/>
+                    <w:left w:val="none" w:sz="0" w:space="0" w:color="000000"/>
+                    <w:right w:val="none" w:sz="0" w:space="0" w:color="000000"/>
+                  </w:tcBorders>
+                  <w:shd w:val="clear" w:color="auto" w:fill="FFFFFF"/>
+                  <w:tcMar>
+                    <w:top w:w="0" w:type="dxa"/>
+                    <w:bottom w:w="0" w:type="dxa"/>
+                    <w:left w:w="0" w:type="dxa"/>
+                    <w:right w:w="0" w:type="dxa"/>
+                  </w:tcMar>
+                  <w:vAlign w:val="center"/>
+                </w:tcPr>
+                <w:p>
+                  <w:pPr>
+                    <w:jc w:val="center"/>
+                    <w:pBdr>
+                      <w:bottom w:val="none" w:sz="0" w:space="0" w:color="000000"/>
+                      <w:top w:val="none" w:sz="0" w:space="0" w:color="000000"/>
+                      <w:left w:val="none" w:sz="0" w:space="0" w:color="000000"/>
+                      <w:right w:val="none" w:sz="0" w:space="0" w:color="000000"/>
+                    </w:pBdr>
+                    <w:spacing w:after="40" w:before="40" w:line="240"/>
+                    <w:ind w:left="60" w:right="60" w:firstLine="0" w:firstLineChars="0"/>
+                    <w:rPr>
+                      <w:rFonts w:ascii="Arial" w:hAnsi="Arial" w:eastAsia="Arial" w:cs="Arial"/>
+                      <w:i w:val="false"/>
+                      <w:b w:val="false"/>
+                      <w:u w:val="none"/>
+                      <w:strike w:val="false"/>
+                      <w:sz w:val="16"/>
+                      <w:szCs w:val="16"/>
+                      <w:color w:val="000000"/>
+                    </w:rPr>
+                  </w:pPr>
+                  <w:r xmlns:w="http://schemas.openxmlformats.org/wordprocessingml/2006/main" xmlns:wp="http://schemas.openxmlformats.org/drawingml/2006/wordprocessingDrawing" xmlns:r="http://schemas.openxmlformats.org/officeDocument/2006/relationships" xmlns:w14="http://schemas.microsoft.com/office/word/2010/wordml">
+                    <w:rPr>
+                      <w:rFonts w:ascii="Arial" w:hAnsi="Arial" w:eastAsia="Arial" w:cs="Arial"/>
+                      <w:i w:val="false"/>
+                      <w:b w:val="false"/>
+                      <w:u w:val="none"/>
+                      <w:strike w:val="false"/>
+                      <w:sz w:val="16"/>
+                      <w:szCs w:val="16"/>
+                      <w:color w:val="000000"/>
+                    </w:rPr>
+                    <w:t xml:space="preserve">1</w:t>
+                  </w:r>
+                </w:p>
+              </w:tc>
+              <w:tc>
+                <w:tcPr>
+                  <w:tcBorders>
+                    <w:bottom w:val="single" w:sz="6" w:space="0" w:color="666666"/>
+                    <w:top w:val="single" w:sz="6" w:space="0" w:color="666666"/>
+                    <w:left w:val="none" w:sz="0" w:space="0" w:color="000000"/>
+                    <w:right w:val="none" w:sz="0" w:space="0" w:color="000000"/>
+                  </w:tcBorders>
+                  <w:shd w:val="clear" w:color="auto" w:fill="FFFFFF"/>
+                  <w:tcMar>
+                    <w:top w:w="0" w:type="dxa"/>
+                    <w:bottom w:w="0" w:type="dxa"/>
+                    <w:left w:w="0" w:type="dxa"/>
+                    <w:right w:w="0" w:type="dxa"/>
+                  </w:tcMar>
+                  <w:vAlign w:val="center"/>
+                </w:tcPr>
+                <w:p>
+                  <w:pPr>
+                    <w:jc w:val="center"/>
+                    <w:pBdr>
+                      <w:bottom w:val="none" w:sz="0" w:space="0" w:color="000000"/>
+                      <w:top w:val="none" w:sz="0" w:space="0" w:color="000000"/>
+                      <w:left w:val="none" w:sz="0" w:space="0" w:color="000000"/>
+                      <w:right w:val="none" w:sz="0" w:space="0" w:color="000000"/>
+                    </w:pBdr>
+                    <w:spacing w:after="40" w:before="40" w:line="240"/>
+                    <w:ind w:left="60" w:right="60" w:firstLine="0" w:firstLineChars="0"/>
+                    <w:rPr>
+                      <w:rFonts w:ascii="Arial" w:hAnsi="Arial" w:eastAsia="Arial" w:cs="Arial"/>
+                      <w:i w:val="false"/>
+                      <w:b w:val="false"/>
+                      <w:u w:val="none"/>
+                      <w:strike w:val="false"/>
+                      <w:sz w:val="16"/>
+                      <w:szCs w:val="16"/>
+                      <w:color w:val="000000"/>
+                    </w:rPr>
+                  </w:pPr>
+                  <w:r xmlns:w="http://schemas.openxmlformats.org/wordprocessingml/2006/main" xmlns:wp="http://schemas.openxmlformats.org/drawingml/2006/wordprocessingDrawing" xmlns:r="http://schemas.openxmlformats.org/officeDocument/2006/relationships" xmlns:w14="http://schemas.microsoft.com/office/word/2010/wordml">
+                    <w:rPr>
+                      <w:rFonts w:ascii="Arial" w:hAnsi="Arial" w:eastAsia="Arial" w:cs="Arial"/>
+                      <w:i w:val="false"/>
+                      <w:b w:val="false"/>
+                      <w:u w:val="none"/>
+                      <w:strike w:val="false"/>
+                      <w:sz w:val="16"/>
+                      <w:szCs w:val="16"/>
+                      <w:color w:val="000000"/>
+                    </w:rPr>
+                    <w:t xml:space="preserve">2024-07-25</w:t>
+                  </w:r>
+                </w:p>
+              </w:tc>
+            </w:tr>
+            <w:tr>
+              <w:trPr>
+                <w:trHeight w:val="360" w:hRule="auto"/>
+              </w:trPr>
+              <w:tc>
+                <w:tcPr>
+                  <w:vMerge/>
+                  <w:tcBorders>
+                    <w:bottom w:val="single" w:sz="6" w:space="0" w:color="666666"/>
+                    <w:top w:val="single" w:sz="6" w:space="0" w:color="666666"/>
+                    <w:left w:val="none" w:sz="0" w:space="0" w:color="000000"/>
+                    <w:right w:val="none" w:sz="0" w:space="0" w:color="000000"/>
+                  </w:tcBorders>
+                  <w:shd w:val="clear" w:color="auto" w:fill="FFFFFF"/>
+                  <w:tcMar>
+                    <w:top w:w="0" w:type="dxa"/>
+                    <w:bottom w:w="0" w:type="dxa"/>
+                    <w:left w:w="0" w:type="dxa"/>
+                    <w:right w:w="0" w:type="dxa"/>
+                  </w:tcMar>
+                  <w:vAlign w:val="center"/>
+                </w:tcPr>
+                <w:p>
+                  <w:pPr>
+                    <w:jc w:val="left"/>
+                    <w:pBdr>
+                      <w:bottom w:val="none" w:sz="0" w:space="0" w:color="000000"/>
+                      <w:top w:val="none" w:sz="0" w:space="0" w:color="000000"/>
+                      <w:left w:val="none" w:sz="0" w:space="0" w:color="000000"/>
+                      <w:right w:val="none" w:sz="0" w:space="0" w:color="000000"/>
+                    </w:pBdr>
+                    <w:spacing w:after="40" w:before="40" w:line="240"/>
+                    <w:ind w:left="60" w:right="60" w:firstLine="0" w:firstLineChars="0"/>
+                    <w:rPr>
+                      <w:rFonts w:ascii="Arial" w:hAnsi="Arial" w:eastAsia="Arial" w:cs="Arial"/>
+                      <w:i w:val="false"/>
+                      <w:b w:val="false"/>
+                      <w:u w:val="none"/>
+                      <w:strike w:val="false"/>
+                      <w:sz w:val="16"/>
+                      <w:szCs w:val="16"/>
+                      <w:color w:val="000000"/>
+                    </w:rPr>
+                  </w:pPr>
+                </w:p>
+              </w:tc>
+              <w:tc>
+                <w:tcPr>
+                  <w:tcBorders>
+                    <w:bottom w:val="single" w:sz="6" w:space="0" w:color="666666"/>
+                    <w:top w:val="single" w:sz="6" w:space="0" w:color="666666"/>
+                    <w:left w:val="none" w:sz="0" w:space="0" w:color="000000"/>
+                    <w:right w:val="none" w:sz="0" w:space="0" w:color="000000"/>
+                  </w:tcBorders>
+                  <w:shd w:val="clear" w:color="auto" w:fill="FFFFFF"/>
+                  <w:tcMar>
+                    <w:top w:w="0" w:type="dxa"/>
+                    <w:bottom w:w="0" w:type="dxa"/>
+                    <w:left w:w="0" w:type="dxa"/>
+                    <w:right w:w="0" w:type="dxa"/>
+                  </w:tcMar>
+                  <w:vAlign w:val="center"/>
+                </w:tcPr>
+                <w:p>
+                  <w:pPr>
+                    <w:jc w:val="center"/>
+                    <w:pBdr>
+                      <w:bottom w:val="none" w:sz="0" w:space="0" w:color="000000"/>
+                      <w:top w:val="none" w:sz="0" w:space="0" w:color="000000"/>
+                      <w:left w:val="none" w:sz="0" w:space="0" w:color="000000"/>
+                      <w:right w:val="none" w:sz="0" w:space="0" w:color="000000"/>
+                    </w:pBdr>
+                    <w:spacing w:after="40" w:before="40" w:line="240"/>
+                    <w:ind w:left="60" w:right="60" w:firstLine="0" w:firstLineChars="0"/>
+                    <w:rPr>
+                      <w:rFonts w:ascii="Arial" w:hAnsi="Arial" w:eastAsia="Arial" w:cs="Arial"/>
+                      <w:i w:val="false"/>
+                      <w:b w:val="false"/>
+                      <w:u w:val="none"/>
+                      <w:strike w:val="false"/>
+                      <w:sz w:val="16"/>
+                      <w:szCs w:val="16"/>
+                      <w:color w:val="000000"/>
+                    </w:rPr>
+                  </w:pPr>
+                  <w:r xmlns:w="http://schemas.openxmlformats.org/wordprocessingml/2006/main" xmlns:wp="http://schemas.openxmlformats.org/drawingml/2006/wordprocessingDrawing" xmlns:r="http://schemas.openxmlformats.org/officeDocument/2006/relationships" xmlns:w14="http://schemas.microsoft.com/office/word/2010/wordml">
+                    <w:rPr>
+                      <w:rFonts w:ascii="Arial" w:hAnsi="Arial" w:eastAsia="Arial" w:cs="Arial"/>
+                      <w:i w:val="false"/>
+                      <w:b w:val="false"/>
+                      <w:u w:val="none"/>
+                      <w:strike w:val="false"/>
+                      <w:sz w:val="16"/>
+                      <w:szCs w:val="16"/>
+                      <w:color w:val="000000"/>
+                    </w:rPr>
+                    <w:t xml:space="preserve">2</w:t>
+                  </w:r>
+                </w:p>
+              </w:tc>
+              <w:tc>
+                <w:tcPr>
+                  <w:tcBorders>
+                    <w:bottom w:val="single" w:sz="6" w:space="0" w:color="666666"/>
+                    <w:top w:val="single" w:sz="6" w:space="0" w:color="666666"/>
+                    <w:left w:val="none" w:sz="0" w:space="0" w:color="000000"/>
+                    <w:right w:val="none" w:sz="0" w:space="0" w:color="000000"/>
+                  </w:tcBorders>
+                  <w:shd w:val="clear" w:color="auto" w:fill="FFFFFF"/>
+                  <w:tcMar>
+                    <w:top w:w="0" w:type="dxa"/>
+                    <w:bottom w:w="0" w:type="dxa"/>
+                    <w:left w:w="0" w:type="dxa"/>
+                    <w:right w:w="0" w:type="dxa"/>
+                  </w:tcMar>
+                  <w:vAlign w:val="center"/>
+                </w:tcPr>
+                <w:p>
+                  <w:pPr>
+                    <w:jc w:val="center"/>
+                    <w:pBdr>
+                      <w:bottom w:val="none" w:sz="0" w:space="0" w:color="000000"/>
+                      <w:top w:val="none" w:sz="0" w:space="0" w:color="000000"/>
+                      <w:left w:val="none" w:sz="0" w:space="0" w:color="000000"/>
+                      <w:right w:val="none" w:sz="0" w:space="0" w:color="000000"/>
+                    </w:pBdr>
+                    <w:spacing w:after="40" w:before="40" w:line="240"/>
+                    <w:ind w:left="60" w:right="60" w:firstLine="0" w:firstLineChars="0"/>
+                    <w:rPr>
+                      <w:rFonts w:ascii="Arial" w:hAnsi="Arial" w:eastAsia="Arial" w:cs="Arial"/>
+                      <w:i w:val="false"/>
+                      <w:b w:val="false"/>
+                      <w:u w:val="none"/>
+                      <w:strike w:val="false"/>
+                      <w:sz w:val="16"/>
+                      <w:szCs w:val="16"/>
+                      <w:color w:val="000000"/>
+                    </w:rPr>
+                  </w:pPr>
+                  <w:r xmlns:w="http://schemas.openxmlformats.org/wordprocessingml/2006/main" xmlns:wp="http://schemas.openxmlformats.org/drawingml/2006/wordprocessingDrawing" xmlns:r="http://schemas.openxmlformats.org/officeDocument/2006/relationships" xmlns:w14="http://schemas.microsoft.com/office/word/2010/wordml">
+                    <w:rPr>
+                      <w:rFonts w:ascii="Arial" w:hAnsi="Arial" w:eastAsia="Arial" w:cs="Arial"/>
+                      <w:i w:val="false"/>
+                      <w:b w:val="false"/>
+                      <w:u w:val="none"/>
+                      <w:strike w:val="false"/>
+                      <w:sz w:val="16"/>
+                      <w:szCs w:val="16"/>
+                      <w:color w:val="000000"/>
+                    </w:rPr>
+                    <w:t xml:space="preserve">2024-09-08</w:t>
+                  </w:r>
+                </w:p>
+              </w:tc>
+            </w:tr>
+            <w:tr>
+              <w:trPr>
+                <w:trHeight w:val="360" w:hRule="auto"/>
+              </w:trPr>
+              <w:tc>
+                <w:tcPr>
+                  <w:vMerge/>
+                  <w:tcBorders>
+                    <w:bottom w:val="single" w:sz="6" w:space="0" w:color="666666"/>
+                    <w:top w:val="single" w:sz="6" w:space="0" w:color="666666"/>
+                    <w:left w:val="none" w:sz="0" w:space="0" w:color="000000"/>
+                    <w:right w:val="none" w:sz="0" w:space="0" w:color="000000"/>
+                  </w:tcBorders>
+                  <w:shd w:val="clear" w:color="auto" w:fill="FFFFFF"/>
+                  <w:tcMar>
+                    <w:top w:w="0" w:type="dxa"/>
+                    <w:bottom w:w="0" w:type="dxa"/>
+                    <w:left w:w="0" w:type="dxa"/>
+                    <w:right w:w="0" w:type="dxa"/>
+                  </w:tcMar>
+                  <w:vAlign w:val="center"/>
+                </w:tcPr>
+                <w:p>
+                  <w:pPr>
+                    <w:jc w:val="left"/>
+                    <w:pBdr>
+                      <w:bottom w:val="none" w:sz="0" w:space="0" w:color="000000"/>
+                      <w:top w:val="none" w:sz="0" w:space="0" w:color="000000"/>
+                      <w:left w:val="none" w:sz="0" w:space="0" w:color="000000"/>
+                      <w:right w:val="none" w:sz="0" w:space="0" w:color="000000"/>
+                    </w:pBdr>
+                    <w:spacing w:after="40" w:before="40" w:line="240"/>
+                    <w:ind w:left="60" w:right="60" w:firstLine="0" w:firstLineChars="0"/>
+                    <w:rPr>
+                      <w:rFonts w:ascii="Arial" w:hAnsi="Arial" w:eastAsia="Arial" w:cs="Arial"/>
+                      <w:i w:val="false"/>
+                      <w:b w:val="false"/>
+                      <w:u w:val="none"/>
+                      <w:strike w:val="false"/>
+                      <w:sz w:val="16"/>
+                      <w:szCs w:val="16"/>
+                      <w:color w:val="000000"/>
+                    </w:rPr>
+                  </w:pPr>
+                </w:p>
+              </w:tc>
+              <w:tc>
+                <w:tcPr>
+                  <w:tcBorders>
+                    <w:bottom w:val="single" w:sz="6" w:space="0" w:color="666666"/>
+                    <w:top w:val="single" w:sz="6" w:space="0" w:color="666666"/>
+                    <w:left w:val="none" w:sz="0" w:space="0" w:color="000000"/>
+                    <w:right w:val="none" w:sz="0" w:space="0" w:color="000000"/>
+                  </w:tcBorders>
+                  <w:shd w:val="clear" w:color="auto" w:fill="FFFFFF"/>
+                  <w:tcMar>
+                    <w:top w:w="0" w:type="dxa"/>
+                    <w:bottom w:w="0" w:type="dxa"/>
+                    <w:left w:w="0" w:type="dxa"/>
+                    <w:right w:w="0" w:type="dxa"/>
+                  </w:tcMar>
+                  <w:vAlign w:val="center"/>
+                </w:tcPr>
+                <w:p>
+                  <w:pPr>
+                    <w:jc w:val="center"/>
+                    <w:pBdr>
+                      <w:bottom w:val="none" w:sz="0" w:space="0" w:color="000000"/>
+                      <w:top w:val="none" w:sz="0" w:space="0" w:color="000000"/>
+                      <w:left w:val="none" w:sz="0" w:space="0" w:color="000000"/>
+                      <w:right w:val="none" w:sz="0" w:space="0" w:color="000000"/>
+                    </w:pBdr>
+                    <w:spacing w:after="40" w:before="40" w:line="240"/>
+                    <w:ind w:left="60" w:right="60" w:firstLine="0" w:firstLineChars="0"/>
+                    <w:rPr>
+                      <w:rFonts w:ascii="Arial" w:hAnsi="Arial" w:eastAsia="Arial" w:cs="Arial"/>
+                      <w:i w:val="false"/>
+                      <w:b w:val="false"/>
+                      <w:u w:val="none"/>
+                      <w:strike w:val="false"/>
+                      <w:sz w:val="16"/>
+                      <w:szCs w:val="16"/>
+                      <w:color w:val="000000"/>
+                    </w:rPr>
+                  </w:pPr>
+                  <w:r xmlns:w="http://schemas.openxmlformats.org/wordprocessingml/2006/main" xmlns:wp="http://schemas.openxmlformats.org/drawingml/2006/wordprocessingDrawing" xmlns:r="http://schemas.openxmlformats.org/officeDocument/2006/relationships" xmlns:w14="http://schemas.microsoft.com/office/word/2010/wordml">
+                    <w:rPr>
+                      <w:rFonts w:ascii="Arial" w:hAnsi="Arial" w:eastAsia="Arial" w:cs="Arial"/>
+                      <w:i w:val="false"/>
+                      <w:b w:val="false"/>
+                      <w:u w:val="none"/>
+                      <w:strike w:val="false"/>
+                      <w:sz w:val="16"/>
+                      <w:szCs w:val="16"/>
+                      <w:color w:val="000000"/>
+                    </w:rPr>
+                    <w:t xml:space="preserve">3</w:t>
+                  </w:r>
+                </w:p>
+              </w:tc>
+              <w:tc>
+                <w:tcPr>
+                  <w:tcBorders>
+                    <w:bottom w:val="single" w:sz="6" w:space="0" w:color="666666"/>
+                    <w:top w:val="single" w:sz="6" w:space="0" w:color="666666"/>
+                    <w:left w:val="none" w:sz="0" w:space="0" w:color="000000"/>
+                    <w:right w:val="none" w:sz="0" w:space="0" w:color="000000"/>
+                  </w:tcBorders>
+                  <w:shd w:val="clear" w:color="auto" w:fill="FFFFFF"/>
+                  <w:tcMar>
+                    <w:top w:w="0" w:type="dxa"/>
+                    <w:bottom w:w="0" w:type="dxa"/>
+                    <w:left w:w="0" w:type="dxa"/>
+                    <w:right w:w="0" w:type="dxa"/>
+                  </w:tcMar>
+                  <w:vAlign w:val="center"/>
+                </w:tcPr>
+                <w:p>
+                  <w:pPr>
+                    <w:jc w:val="center"/>
+                    <w:pBdr>
+                      <w:bottom w:val="none" w:sz="0" w:space="0" w:color="000000"/>
+                      <w:top w:val="none" w:sz="0" w:space="0" w:color="000000"/>
+                      <w:left w:val="none" w:sz="0" w:space="0" w:color="000000"/>
+                      <w:right w:val="none" w:sz="0" w:space="0" w:color="000000"/>
+                    </w:pBdr>
+                    <w:spacing w:after="40" w:before="40" w:line="240"/>
+                    <w:ind w:left="60" w:right="60" w:firstLine="0" w:firstLineChars="0"/>
+                    <w:rPr>
+                      <w:rFonts w:ascii="Arial" w:hAnsi="Arial" w:eastAsia="Arial" w:cs="Arial"/>
+                      <w:i w:val="false"/>
+                      <w:b w:val="false"/>
+                      <w:u w:val="none"/>
+                      <w:strike w:val="false"/>
+                      <w:sz w:val="16"/>
+                      <w:szCs w:val="16"/>
+                      <w:color w:val="000000"/>
+                    </w:rPr>
+                  </w:pPr>
+                  <w:r xmlns:w="http://schemas.openxmlformats.org/wordprocessingml/2006/main" xmlns:wp="http://schemas.openxmlformats.org/drawingml/2006/wordprocessingDrawing" xmlns:r="http://schemas.openxmlformats.org/officeDocument/2006/relationships" xmlns:w14="http://schemas.microsoft.com/office/word/2010/wordml">
+                    <w:rPr>
+                      <w:rFonts w:ascii="Arial" w:hAnsi="Arial" w:eastAsia="Arial" w:cs="Arial"/>
+                      <w:i w:val="false"/>
+                      <w:b w:val="false"/>
+                      <w:u w:val="none"/>
+                      <w:strike w:val="false"/>
+                      <w:sz w:val="16"/>
+                      <w:szCs w:val="16"/>
+                      <w:color w:val="000000"/>
+                    </w:rPr>
+                    <w:t xml:space="preserve">2024-10-11</w:t>
+                  </w:r>
+                </w:p>
+              </w:tc>
+            </w:tr>
+            <w:tr>
+              <w:trPr>
+                <w:trHeight w:val="360" w:hRule="auto"/>
+              </w:trPr>
+              <w:tc>
+                <w:tcPr>
+                  <w:vMerge/>
+                  <w:tcBorders>
+                    <w:bottom w:val="single" w:sz="6" w:space="0" w:color="666666"/>
+                    <w:top w:val="single" w:sz="6" w:space="0" w:color="666666"/>
+                    <w:left w:val="none" w:sz="0" w:space="0" w:color="000000"/>
+                    <w:right w:val="none" w:sz="0" w:space="0" w:color="000000"/>
+                  </w:tcBorders>
+                  <w:shd w:val="clear" w:color="auto" w:fill="FFFFFF"/>
+                  <w:tcMar>
+                    <w:top w:w="0" w:type="dxa"/>
+                    <w:bottom w:w="0" w:type="dxa"/>
+                    <w:left w:w="0" w:type="dxa"/>
+                    <w:right w:w="0" w:type="dxa"/>
+                  </w:tcMar>
+                  <w:vAlign w:val="center"/>
+                </w:tcPr>
+                <w:p>
+                  <w:pPr>
+                    <w:jc w:val="left"/>
+                    <w:pBdr>
+                      <w:bottom w:val="none" w:sz="0" w:space="0" w:color="000000"/>
+                      <w:top w:val="none" w:sz="0" w:space="0" w:color="000000"/>
+                      <w:left w:val="none" w:sz="0" w:space="0" w:color="000000"/>
+                      <w:right w:val="none" w:sz="0" w:space="0" w:color="000000"/>
+                    </w:pBdr>
+                    <w:spacing w:after="40" w:before="40" w:line="240"/>
+                    <w:ind w:left="60" w:right="60" w:firstLine="0" w:firstLineChars="0"/>
+                    <w:rPr>
+                      <w:rFonts w:ascii="Arial" w:hAnsi="Arial" w:eastAsia="Arial" w:cs="Arial"/>
+                      <w:i w:val="false"/>
+                      <w:b w:val="false"/>
+                      <w:u w:val="none"/>
+                      <w:strike w:val="false"/>
+                      <w:sz w:val="16"/>
+                      <w:szCs w:val="16"/>
+                      <w:color w:val="000000"/>
+                    </w:rPr>
+                  </w:pPr>
+                </w:p>
+              </w:tc>
+              <w:tc>
+                <w:tcPr>
+                  <w:tcBorders>
+                    <w:bottom w:val="single" w:sz="6" w:space="0" w:color="666666"/>
+                    <w:top w:val="single" w:sz="6" w:space="0" w:color="666666"/>
+                    <w:left w:val="none" w:sz="0" w:space="0" w:color="000000"/>
+                    <w:right w:val="none" w:sz="0" w:space="0" w:color="000000"/>
+                  </w:tcBorders>
+                  <w:shd w:val="clear" w:color="auto" w:fill="FFFFFF"/>
+                  <w:tcMar>
+                    <w:top w:w="0" w:type="dxa"/>
+                    <w:bottom w:w="0" w:type="dxa"/>
+                    <w:left w:w="0" w:type="dxa"/>
+                    <w:right w:w="0" w:type="dxa"/>
+                  </w:tcMar>
+                  <w:vAlign w:val="center"/>
+                </w:tcPr>
+                <w:p>
+                  <w:pPr>
+                    <w:jc w:val="center"/>
+                    <w:pBdr>
+                      <w:bottom w:val="none" w:sz="0" w:space="0" w:color="000000"/>
+                      <w:top w:val="none" w:sz="0" w:space="0" w:color="000000"/>
+                      <w:left w:val="none" w:sz="0" w:space="0" w:color="000000"/>
+                      <w:right w:val="none" w:sz="0" w:space="0" w:color="000000"/>
+                    </w:pBdr>
+                    <w:spacing w:after="40" w:before="40" w:line="240"/>
+                    <w:ind w:left="60" w:right="60" w:firstLine="0" w:firstLineChars="0"/>
+                    <w:rPr>
+                      <w:rFonts w:ascii="Arial" w:hAnsi="Arial" w:eastAsia="Arial" w:cs="Arial"/>
+                      <w:i w:val="false"/>
+                      <w:b w:val="false"/>
+                      <w:u w:val="none"/>
+                      <w:strike w:val="false"/>
+                      <w:sz w:val="16"/>
+                      <w:szCs w:val="16"/>
+                      <w:color w:val="000000"/>
+                    </w:rPr>
+                  </w:pPr>
+                  <w:r xmlns:w="http://schemas.openxmlformats.org/wordprocessingml/2006/main" xmlns:wp="http://schemas.openxmlformats.org/drawingml/2006/wordprocessingDrawing" xmlns:r="http://schemas.openxmlformats.org/officeDocument/2006/relationships" xmlns:w14="http://schemas.microsoft.com/office/word/2010/wordml">
+                    <w:rPr>
+                      <w:rFonts w:ascii="Arial" w:hAnsi="Arial" w:eastAsia="Arial" w:cs="Arial"/>
+                      <w:i w:val="false"/>
+                      <w:b w:val="false"/>
+                      <w:u w:val="none"/>
+                      <w:strike w:val="false"/>
+                      <w:sz w:val="16"/>
+                      <w:szCs w:val="16"/>
+                      <w:color w:val="000000"/>
+                    </w:rPr>
+                    <w:t xml:space="preserve">4</w:t>
+                  </w:r>
+                </w:p>
+              </w:tc>
+              <w:tc>
+                <w:tcPr>
+                  <w:tcBorders>
+                    <w:bottom w:val="single" w:sz="6" w:space="0" w:color="666666"/>
+                    <w:top w:val="single" w:sz="6" w:space="0" w:color="666666"/>
+                    <w:left w:val="none" w:sz="0" w:space="0" w:color="000000"/>
+                    <w:right w:val="none" w:sz="0" w:space="0" w:color="000000"/>
+                  </w:tcBorders>
+                  <w:shd w:val="clear" w:color="auto" w:fill="FFFFFF"/>
+                  <w:tcMar>
+                    <w:top w:w="0" w:type="dxa"/>
+                    <w:bottom w:w="0" w:type="dxa"/>
+                    <w:left w:w="0" w:type="dxa"/>
+                    <w:right w:w="0" w:type="dxa"/>
+                  </w:tcMar>
+                  <w:vAlign w:val="center"/>
+                </w:tcPr>
+                <w:p>
+                  <w:pPr>
+                    <w:jc w:val="center"/>
+                    <w:pBdr>
+                      <w:bottom w:val="none" w:sz="0" w:space="0" w:color="000000"/>
+                      <w:top w:val="none" w:sz="0" w:space="0" w:color="000000"/>
+                      <w:left w:val="none" w:sz="0" w:space="0" w:color="000000"/>
+                      <w:right w:val="none" w:sz="0" w:space="0" w:color="000000"/>
+                    </w:pBdr>
+                    <w:spacing w:after="40" w:before="40" w:line="240"/>
+                    <w:ind w:left="60" w:right="60" w:firstLine="0" w:firstLineChars="0"/>
+                    <w:rPr>
+                      <w:rFonts w:ascii="Arial" w:hAnsi="Arial" w:eastAsia="Arial" w:cs="Arial"/>
+                      <w:i w:val="false"/>
+                      <w:b w:val="false"/>
+                      <w:u w:val="none"/>
+                      <w:strike w:val="false"/>
+                      <w:sz w:val="16"/>
+                      <w:szCs w:val="16"/>
+                      <w:color w:val="000000"/>
+                    </w:rPr>
+                  </w:pPr>
+                  <w:r xmlns:w="http://schemas.openxmlformats.org/wordprocessingml/2006/main" xmlns:wp="http://schemas.openxmlformats.org/drawingml/2006/wordprocessingDrawing" xmlns:r="http://schemas.openxmlformats.org/officeDocument/2006/relationships" xmlns:w14="http://schemas.microsoft.com/office/word/2010/wordml">
+                    <w:rPr>
+                      <w:rFonts w:ascii="Arial" w:hAnsi="Arial" w:eastAsia="Arial" w:cs="Arial"/>
+                      <w:i w:val="false"/>
+                      <w:b w:val="false"/>
+                      <w:u w:val="none"/>
+                      <w:strike w:val="false"/>
+                      <w:sz w:val="16"/>
+                      <w:szCs w:val="16"/>
+                      <w:color w:val="000000"/>
+                    </w:rPr>
+                    <w:t xml:space="preserve">2025-03-12</w:t>
+                  </w:r>
+                </w:p>
+              </w:tc>
+            </w:tr>
+            <w:tr>
+              <w:trPr>
+                <w:trHeight w:val="360" w:hRule="auto"/>
+              </w:trPr>
+              <w:tc>
+                <w:tcPr>
+                  <w:vMerge/>
+                  <w:tcBorders>
+                    <w:bottom w:val="single" w:sz="6" w:space="0" w:color="666666"/>
+                    <w:top w:val="single" w:sz="6" w:space="0" w:color="666666"/>
+                    <w:left w:val="none" w:sz="0" w:space="0" w:color="000000"/>
+                    <w:right w:val="none" w:sz="0" w:space="0" w:color="000000"/>
+                  </w:tcBorders>
+                  <w:shd w:val="clear" w:color="auto" w:fill="FFFFFF"/>
+                  <w:tcMar>
+                    <w:top w:w="0" w:type="dxa"/>
+                    <w:bottom w:w="0" w:type="dxa"/>
+                    <w:left w:w="0" w:type="dxa"/>
+                    <w:right w:w="0" w:type="dxa"/>
+                  </w:tcMar>
+                  <w:vAlign w:val="center"/>
+                </w:tcPr>
+                <w:p>
+                  <w:pPr>
+                    <w:jc w:val="left"/>
+                    <w:pBdr>
+                      <w:bottom w:val="none" w:sz="0" w:space="0" w:color="000000"/>
+                      <w:top w:val="none" w:sz="0" w:space="0" w:color="000000"/>
+                      <w:left w:val="none" w:sz="0" w:space="0" w:color="000000"/>
+                      <w:right w:val="none" w:sz="0" w:space="0" w:color="000000"/>
+                    </w:pBdr>
+                    <w:spacing w:after="40" w:before="40" w:line="240"/>
+                    <w:ind w:left="60" w:right="60" w:firstLine="0" w:firstLineChars="0"/>
+                    <w:rPr>
+                      <w:rFonts w:ascii="Arial" w:hAnsi="Arial" w:eastAsia="Arial" w:cs="Arial"/>
+                      <w:i w:val="false"/>
+                      <w:b w:val="false"/>
+                      <w:u w:val="none"/>
+                      <w:strike w:val="false"/>
+                      <w:sz w:val="16"/>
+                      <w:szCs w:val="16"/>
+                      <w:color w:val="000000"/>
+                    </w:rPr>
+                  </w:pPr>
+                </w:p>
+              </w:tc>
+              <w:tc>
+                <w:tcPr>
+                  <w:tcBorders>
+                    <w:bottom w:val="single" w:sz="6" w:space="0" w:color="666666"/>
+                    <w:top w:val="single" w:sz="6" w:space="0" w:color="666666"/>
+                    <w:left w:val="none" w:sz="0" w:space="0" w:color="000000"/>
+                    <w:right w:val="none" w:sz="0" w:space="0" w:color="000000"/>
+                  </w:tcBorders>
+                  <w:shd w:val="clear" w:color="auto" w:fill="FFFFFF"/>
+                  <w:tcMar>
+                    <w:top w:w="0" w:type="dxa"/>
+                    <w:bottom w:w="0" w:type="dxa"/>
+                    <w:left w:w="0" w:type="dxa"/>
+                    <w:right w:w="0" w:type="dxa"/>
+                  </w:tcMar>
+                  <w:vAlign w:val="center"/>
+                </w:tcPr>
+                <w:p>
+                  <w:pPr>
+                    <w:jc w:val="center"/>
+                    <w:pBdr>
+                      <w:bottom w:val="none" w:sz="0" w:space="0" w:color="000000"/>
+                      <w:top w:val="none" w:sz="0" w:space="0" w:color="000000"/>
+                      <w:left w:val="none" w:sz="0" w:space="0" w:color="000000"/>
+                      <w:right w:val="none" w:sz="0" w:space="0" w:color="000000"/>
+                    </w:pBdr>
+                    <w:spacing w:after="40" w:before="40" w:line="240"/>
+                    <w:ind w:left="60" w:right="60" w:firstLine="0" w:firstLineChars="0"/>
+                    <w:rPr>
+                      <w:rFonts w:ascii="Arial" w:hAnsi="Arial" w:eastAsia="Arial" w:cs="Arial"/>
+                      <w:i w:val="false"/>
+                      <w:b w:val="false"/>
+                      <w:u w:val="none"/>
+                      <w:strike w:val="false"/>
+                      <w:sz w:val="16"/>
+                      <w:szCs w:val="16"/>
+                      <w:color w:val="000000"/>
+                    </w:rPr>
+                  </w:pPr>
+                  <w:r xmlns:w="http://schemas.openxmlformats.org/wordprocessingml/2006/main" xmlns:wp="http://schemas.openxmlformats.org/drawingml/2006/wordprocessingDrawing" xmlns:r="http://schemas.openxmlformats.org/officeDocument/2006/relationships" xmlns:w14="http://schemas.microsoft.com/office/word/2010/wordml">
+                    <w:rPr>
+                      <w:rFonts w:ascii="Arial" w:hAnsi="Arial" w:eastAsia="Arial" w:cs="Arial"/>
+                      <w:i w:val="false"/>
+                      <w:b w:val="false"/>
+                      <w:u w:val="none"/>
+                      <w:strike w:val="false"/>
+                      <w:sz w:val="16"/>
+                      <w:szCs w:val="16"/>
+                      <w:color w:val="000000"/>
+                    </w:rPr>
+                    <w:t xml:space="preserve">5</w:t>
+                  </w:r>
+                </w:p>
+              </w:tc>
+              <w:tc>
+                <w:tcPr>
+                  <w:tcBorders>
+                    <w:bottom w:val="single" w:sz="6" w:space="0" w:color="666666"/>
+                    <w:top w:val="single" w:sz="6" w:space="0" w:color="666666"/>
+                    <w:left w:val="none" w:sz="0" w:space="0" w:color="000000"/>
+                    <w:right w:val="none" w:sz="0" w:space="0" w:color="000000"/>
+                  </w:tcBorders>
+                  <w:shd w:val="clear" w:color="auto" w:fill="FFFFFF"/>
+                  <w:tcMar>
+                    <w:top w:w="0" w:type="dxa"/>
+                    <w:bottom w:w="0" w:type="dxa"/>
+                    <w:left w:w="0" w:type="dxa"/>
+                    <w:right w:w="0" w:type="dxa"/>
+                  </w:tcMar>
+                  <w:vAlign w:val="center"/>
+                </w:tcPr>
+                <w:p>
+                  <w:pPr>
+                    <w:jc w:val="center"/>
+                    <w:pBdr>
+                      <w:bottom w:val="none" w:sz="0" w:space="0" w:color="000000"/>
+                      <w:top w:val="none" w:sz="0" w:space="0" w:color="000000"/>
+                      <w:left w:val="none" w:sz="0" w:space="0" w:color="000000"/>
+                      <w:right w:val="none" w:sz="0" w:space="0" w:color="000000"/>
+                    </w:pBdr>
+                    <w:spacing w:after="40" w:before="40" w:line="240"/>
+                    <w:ind w:left="60" w:right="60" w:firstLine="0" w:firstLineChars="0"/>
+                    <w:rPr>
+                      <w:rFonts w:ascii="Arial" w:hAnsi="Arial" w:eastAsia="Arial" w:cs="Arial"/>
+                      <w:i w:val="false"/>
+                      <w:b w:val="false"/>
+                      <w:u w:val="none"/>
+                      <w:strike w:val="false"/>
+                      <w:sz w:val="16"/>
+                      <w:szCs w:val="16"/>
+                      <w:color w:val="000000"/>
+                    </w:rPr>
+                  </w:pPr>
+                  <w:r xmlns:w="http://schemas.openxmlformats.org/wordprocessingml/2006/main" xmlns:wp="http://schemas.openxmlformats.org/drawingml/2006/wordprocessingDrawing" xmlns:r="http://schemas.openxmlformats.org/officeDocument/2006/relationships" xmlns:w14="http://schemas.microsoft.com/office/word/2010/wordml">
+                    <w:rPr>
+                      <w:rFonts w:ascii="Arial" w:hAnsi="Arial" w:eastAsia="Arial" w:cs="Arial"/>
+                      <w:i w:val="false"/>
+                      <w:b w:val="false"/>
+                      <w:u w:val="none"/>
+                      <w:strike w:val="false"/>
+                      <w:sz w:val="16"/>
+                      <w:szCs w:val="16"/>
+                      <w:color w:val="000000"/>
+                    </w:rPr>
+                    <w:t xml:space="preserve">2025-07-18</w:t>
+                  </w:r>
+                </w:p>
+              </w:tc>
+            </w:tr>
+            <w:tr>
+              <w:trPr>
+                <w:trHeight w:val="360" w:hRule="auto"/>
+              </w:trPr>
+              <w:tc>
+                <w:tcPr>
+                  <w:vMerge/>
+                  <w:tcBorders>
+                    <w:bottom w:val="single" w:sz="6" w:space="0" w:color="666666"/>
+                    <w:top w:val="single" w:sz="6" w:space="0" w:color="666666"/>
+                    <w:left w:val="none" w:sz="0" w:space="0" w:color="000000"/>
+                    <w:right w:val="none" w:sz="0" w:space="0" w:color="000000"/>
+                  </w:tcBorders>
+                  <w:shd w:val="clear" w:color="auto" w:fill="FFFFFF"/>
+                  <w:tcMar>
+                    <w:top w:w="0" w:type="dxa"/>
+                    <w:bottom w:w="0" w:type="dxa"/>
+                    <w:left w:w="0" w:type="dxa"/>
+                    <w:right w:w="0" w:type="dxa"/>
+                  </w:tcMar>
+                  <w:vAlign w:val="center"/>
+                </w:tcPr>
+                <w:p>
+                  <w:pPr>
+                    <w:jc w:val="left"/>
+                    <w:pBdr>
+                      <w:bottom w:val="none" w:sz="0" w:space="0" w:color="000000"/>
+                      <w:top w:val="none" w:sz="0" w:space="0" w:color="000000"/>
+                      <w:left w:val="none" w:sz="0" w:space="0" w:color="000000"/>
+                      <w:right w:val="none" w:sz="0" w:space="0" w:color="000000"/>
+                    </w:pBdr>
+                    <w:spacing w:after="40" w:before="40" w:line="240"/>
+                    <w:ind w:left="60" w:right="60" w:firstLine="0" w:firstLineChars="0"/>
+                    <w:rPr>
+                      <w:rFonts w:ascii="Arial" w:hAnsi="Arial" w:eastAsia="Arial" w:cs="Arial"/>
+                      <w:i w:val="false"/>
+                      <w:b w:val="false"/>
+                      <w:u w:val="none"/>
+                      <w:strike w:val="false"/>
+                      <w:sz w:val="16"/>
+                      <w:szCs w:val="16"/>
+                      <w:color w:val="000000"/>
+                    </w:rPr>
+                  </w:pPr>
+                </w:p>
+              </w:tc>
+              <w:tc>
+                <w:tcPr>
+                  <w:tcBorders>
+                    <w:bottom w:val="single" w:sz="6" w:space="0" w:color="666666"/>
+                    <w:top w:val="single" w:sz="6" w:space="0" w:color="666666"/>
+                    <w:left w:val="none" w:sz="0" w:space="0" w:color="000000"/>
+                    <w:right w:val="none" w:sz="0" w:space="0" w:color="000000"/>
+                  </w:tcBorders>
+                  <w:shd w:val="clear" w:color="auto" w:fill="FFFFFF"/>
+                  <w:tcMar>
+                    <w:top w:w="0" w:type="dxa"/>
+                    <w:bottom w:w="0" w:type="dxa"/>
+                    <w:left w:w="0" w:type="dxa"/>
+                    <w:right w:w="0" w:type="dxa"/>
+                  </w:tcMar>
+                  <w:vAlign w:val="center"/>
+                </w:tcPr>
+                <w:p>
+                  <w:pPr>
+                    <w:jc w:val="center"/>
+                    <w:pBdr>
+                      <w:bottom w:val="none" w:sz="0" w:space="0" w:color="000000"/>
+                      <w:top w:val="none" w:sz="0" w:space="0" w:color="000000"/>
+                      <w:left w:val="none" w:sz="0" w:space="0" w:color="000000"/>
+                      <w:right w:val="none" w:sz="0" w:space="0" w:color="000000"/>
+                    </w:pBdr>
+                    <w:spacing w:after="40" w:before="40" w:line="240"/>
+                    <w:ind w:left="60" w:right="60" w:firstLine="0" w:firstLineChars="0"/>
+                    <w:rPr>
+                      <w:rFonts w:ascii="Arial" w:hAnsi="Arial" w:eastAsia="Arial" w:cs="Arial"/>
+                      <w:i w:val="false"/>
+                      <w:b w:val="false"/>
+                      <w:u w:val="none"/>
+                      <w:strike w:val="false"/>
+                      <w:sz w:val="16"/>
+                      <w:szCs w:val="16"/>
+                      <w:color w:val="000000"/>
+                    </w:rPr>
+                  </w:pPr>
+                  <w:r xmlns:w="http://schemas.openxmlformats.org/wordprocessingml/2006/main" xmlns:wp="http://schemas.openxmlformats.org/drawingml/2006/wordprocessingDrawing" xmlns:r="http://schemas.openxmlformats.org/officeDocument/2006/relationships" xmlns:w14="http://schemas.microsoft.com/office/word/2010/wordml">
+                    <w:rPr>
+                      <w:rFonts w:ascii="Arial" w:hAnsi="Arial" w:eastAsia="Arial" w:cs="Arial"/>
+                      <w:i w:val="false"/>
+                      <w:b w:val="false"/>
+                      <w:u w:val="none"/>
+                      <w:strike w:val="false"/>
+                      <w:sz w:val="16"/>
+                      <w:szCs w:val="16"/>
+                      <w:color w:val="000000"/>
+                    </w:rPr>
+                    <w:t xml:space="preserve">6</w:t>
+                  </w:r>
+                </w:p>
+              </w:tc>
+              <w:tc>
+                <w:tcPr>
+                  <w:tcBorders>
+                    <w:bottom w:val="single" w:sz="6" w:space="0" w:color="666666"/>
+                    <w:top w:val="single" w:sz="6" w:space="0" w:color="666666"/>
+                    <w:left w:val="none" w:sz="0" w:space="0" w:color="000000"/>
+                    <w:right w:val="none" w:sz="0" w:space="0" w:color="000000"/>
+                  </w:tcBorders>
+                  <w:shd w:val="clear" w:color="auto" w:fill="FFFFFF"/>
+                  <w:tcMar>
+                    <w:top w:w="0" w:type="dxa"/>
+                    <w:bottom w:w="0" w:type="dxa"/>
+                    <w:left w:w="0" w:type="dxa"/>
+                    <w:right w:w="0" w:type="dxa"/>
+                  </w:tcMar>
+                  <w:vAlign w:val="center"/>
+                </w:tcPr>
+                <w:p>
+                  <w:pPr>
+                    <w:jc w:val="center"/>
+                    <w:pBdr>
+                      <w:bottom w:val="none" w:sz="0" w:space="0" w:color="000000"/>
+                      <w:top w:val="none" w:sz="0" w:space="0" w:color="000000"/>
+                      <w:left w:val="none" w:sz="0" w:space="0" w:color="000000"/>
+                      <w:right w:val="none" w:sz="0" w:space="0" w:color="000000"/>
+                    </w:pBdr>
+                    <w:spacing w:after="40" w:before="40" w:line="240"/>
+                    <w:ind w:left="60" w:right="60" w:firstLine="0" w:firstLineChars="0"/>
+                    <w:rPr>
+                      <w:rFonts w:ascii="Arial" w:hAnsi="Arial" w:eastAsia="Arial" w:cs="Arial"/>
+                      <w:i w:val="false"/>
+                      <w:b w:val="false"/>
+                      <w:u w:val="none"/>
+                      <w:strike w:val="false"/>
+                      <w:sz w:val="16"/>
+                      <w:szCs w:val="16"/>
+                      <w:color w:val="000000"/>
+                    </w:rPr>
+                  </w:pPr>
+                  <w:r xmlns:w="http://schemas.openxmlformats.org/wordprocessingml/2006/main" xmlns:wp="http://schemas.openxmlformats.org/drawingml/2006/wordprocessingDrawing" xmlns:r="http://schemas.openxmlformats.org/officeDocument/2006/relationships" xmlns:w14="http://schemas.microsoft.com/office/word/2010/wordml">
+                    <w:rPr>
+                      <w:rFonts w:ascii="Arial" w:hAnsi="Arial" w:eastAsia="Arial" w:cs="Arial"/>
+                      <w:i w:val="false"/>
+                      <w:b w:val="false"/>
+                      <w:u w:val="none"/>
+                      <w:strike w:val="false"/>
+                      <w:sz w:val="16"/>
+                      <w:szCs w:val="16"/>
+                      <w:color w:val="000000"/>
+                    </w:rPr>
+                    <w:t xml:space="preserve">2025-08-29</w:t>
+                  </w:r>
+                </w:p>
+              </w:tc>
+            </w:tr>
+            <w:tr>
+              <w:trPr>
+                <w:trHeight w:val="360" w:hRule="auto"/>
+              </w:trPr>
+              <w:tc>
+                <w:tcPr>
+                  <w:vMerge/>
+                  <w:tcBorders>
+                    <w:bottom w:val="single" w:sz="6" w:space="0" w:color="666666"/>
+                    <w:top w:val="single" w:sz="6" w:space="0" w:color="666666"/>
+                    <w:left w:val="none" w:sz="0" w:space="0" w:color="000000"/>
+                    <w:right w:val="none" w:sz="0" w:space="0" w:color="000000"/>
+                  </w:tcBorders>
+                  <w:shd w:val="clear" w:color="auto" w:fill="FFFFFF"/>
+                  <w:tcMar>
+                    <w:top w:w="0" w:type="dxa"/>
+                    <w:bottom w:w="0" w:type="dxa"/>
+                    <w:left w:w="0" w:type="dxa"/>
+                    <w:right w:w="0" w:type="dxa"/>
+                  </w:tcMar>
+                  <w:vAlign w:val="center"/>
+                </w:tcPr>
+                <w:p>
+                  <w:pPr>
+                    <w:jc w:val="left"/>
+                    <w:pBdr>
+                      <w:bottom w:val="none" w:sz="0" w:space="0" w:color="000000"/>
+                      <w:top w:val="none" w:sz="0" w:space="0" w:color="000000"/>
+                      <w:left w:val="none" w:sz="0" w:space="0" w:color="000000"/>
+                      <w:right w:val="none" w:sz="0" w:space="0" w:color="000000"/>
+                    </w:pBdr>
+                    <w:spacing w:after="40" w:before="40" w:line="240"/>
+                    <w:ind w:left="60" w:right="60" w:firstLine="0" w:firstLineChars="0"/>
+                    <w:rPr>
+                      <w:rFonts w:ascii="Arial" w:hAnsi="Arial" w:eastAsia="Arial" w:cs="Arial"/>
+                      <w:i w:val="false"/>
+                      <w:b w:val="false"/>
+                      <w:u w:val="none"/>
+                      <w:strike w:val="false"/>
+                      <w:sz w:val="16"/>
+                      <w:szCs w:val="16"/>
+                      <w:color w:val="000000"/>
+                    </w:rPr>
+                  </w:pPr>
+                </w:p>
+              </w:tc>
+              <w:tc>
+                <w:tcPr>
+                  <w:tcBorders>
+                    <w:bottom w:val="single" w:sz="6" w:space="0" w:color="666666"/>
+                    <w:top w:val="single" w:sz="6" w:space="0" w:color="666666"/>
+                    <w:left w:val="none" w:sz="0" w:space="0" w:color="000000"/>
+                    <w:right w:val="none" w:sz="0" w:space="0" w:color="000000"/>
+                  </w:tcBorders>
+                  <w:shd w:val="clear" w:color="auto" w:fill="FFFFFF"/>
+                  <w:tcMar>
+                    <w:top w:w="0" w:type="dxa"/>
+                    <w:bottom w:w="0" w:type="dxa"/>
+                    <w:left w:w="0" w:type="dxa"/>
+                    <w:right w:w="0" w:type="dxa"/>
+                  </w:tcMar>
+                  <w:vAlign w:val="center"/>
+                </w:tcPr>
+                <w:p>
+                  <w:pPr>
+                    <w:jc w:val="center"/>
+                    <w:pBdr>
+                      <w:bottom w:val="none" w:sz="0" w:space="0" w:color="000000"/>
+                      <w:top w:val="none" w:sz="0" w:space="0" w:color="000000"/>
+                      <w:left w:val="none" w:sz="0" w:space="0" w:color="000000"/>
+                      <w:right w:val="none" w:sz="0" w:space="0" w:color="000000"/>
+                    </w:pBdr>
+                    <w:spacing w:after="40" w:before="40" w:line="240"/>
+                    <w:ind w:left="60" w:right="60" w:firstLine="0" w:firstLineChars="0"/>
+                    <w:rPr>
+                      <w:rFonts w:ascii="Arial" w:hAnsi="Arial" w:eastAsia="Arial" w:cs="Arial"/>
+                      <w:i w:val="false"/>
+                      <w:b w:val="false"/>
+                      <w:u w:val="none"/>
+                      <w:strike w:val="false"/>
+                      <w:sz w:val="16"/>
+                      <w:szCs w:val="16"/>
+                      <w:color w:val="000000"/>
+                    </w:rPr>
+                  </w:pPr>
+                  <w:r xmlns:w="http://schemas.openxmlformats.org/wordprocessingml/2006/main" xmlns:wp="http://schemas.openxmlformats.org/drawingml/2006/wordprocessingDrawing" xmlns:r="http://schemas.openxmlformats.org/officeDocument/2006/relationships" xmlns:w14="http://schemas.microsoft.com/office/word/2010/wordml">
+                    <w:rPr>
+                      <w:rFonts w:ascii="Arial" w:hAnsi="Arial" w:eastAsia="Arial" w:cs="Arial"/>
+                      <w:i w:val="false"/>
+                      <w:b w:val="false"/>
+                      <w:u w:val="none"/>
+                      <w:strike w:val="false"/>
+                      <w:sz w:val="16"/>
+                      <w:szCs w:val="16"/>
+                      <w:color w:val="000000"/>
+                    </w:rPr>
+                    <w:t xml:space="preserve">7</w:t>
+                  </w:r>
+                </w:p>
+              </w:tc>
+              <w:tc>
+                <w:tcPr>
+                  <w:tcBorders>
+                    <w:bottom w:val="single" w:sz="6" w:space="0" w:color="666666"/>
+                    <w:top w:val="single" w:sz="6" w:space="0" w:color="666666"/>
+                    <w:left w:val="none" w:sz="0" w:space="0" w:color="000000"/>
+                    <w:right w:val="none" w:sz="0" w:space="0" w:color="000000"/>
+                  </w:tcBorders>
+                  <w:shd w:val="clear" w:color="auto" w:fill="FFFFFF"/>
+                  <w:tcMar>
+                    <w:top w:w="0" w:type="dxa"/>
+                    <w:bottom w:w="0" w:type="dxa"/>
+                    <w:left w:w="0" w:type="dxa"/>
+                    <w:right w:w="0" w:type="dxa"/>
+                  </w:tcMar>
+                  <w:vAlign w:val="center"/>
+                </w:tcPr>
+                <w:p>
+                  <w:pPr>
+                    <w:jc w:val="center"/>
+                    <w:pBdr>
+                      <w:bottom w:val="none" w:sz="0" w:space="0" w:color="000000"/>
+                      <w:top w:val="none" w:sz="0" w:space="0" w:color="000000"/>
+                      <w:left w:val="none" w:sz="0" w:space="0" w:color="000000"/>
+                      <w:right w:val="none" w:sz="0" w:space="0" w:color="000000"/>
+                    </w:pBdr>
+                    <w:spacing w:after="40" w:before="40" w:line="240"/>
+                    <w:ind w:left="60" w:right="60" w:firstLine="0" w:firstLineChars="0"/>
+                    <w:rPr>
+                      <w:rFonts w:ascii="Arial" w:hAnsi="Arial" w:eastAsia="Arial" w:cs="Arial"/>
+                      <w:i w:val="false"/>
+                      <w:b w:val="false"/>
+                      <w:u w:val="none"/>
+                      <w:strike w:val="false"/>
+                      <w:sz w:val="16"/>
+                      <w:szCs w:val="16"/>
+                      <w:color w:val="000000"/>
+                    </w:rPr>
+                  </w:pPr>
+                  <w:r xmlns:w="http://schemas.openxmlformats.org/wordprocessingml/2006/main" xmlns:wp="http://schemas.openxmlformats.org/drawingml/2006/wordprocessingDrawing" xmlns:r="http://schemas.openxmlformats.org/officeDocument/2006/relationships" xmlns:w14="http://schemas.microsoft.com/office/word/2010/wordml">
+                    <w:rPr>
+                      <w:rFonts w:ascii="Arial" w:hAnsi="Arial" w:eastAsia="Arial" w:cs="Arial"/>
+                      <w:i w:val="false"/>
+                      <w:b w:val="false"/>
+                      <w:u w:val="none"/>
+                      <w:strike w:val="false"/>
+                      <w:sz w:val="16"/>
+                      <w:szCs w:val="16"/>
+                      <w:color w:val="000000"/>
+                    </w:rPr>
+                    <w:t xml:space="preserve">2025-09-18</w:t>
+                  </w:r>
+                </w:p>
+              </w:tc>
+            </w:tr>
+            <w:tr>
+              <w:trPr>
+                <w:trHeight w:val="360" w:hRule="auto"/>
+              </w:trPr>
+              <w:tc>
+                <w:tcPr>
+                  <w:vMerge/>
+                  <w:tcBorders>
+                    <w:bottom w:val="single" w:sz="12" w:space="0" w:color="666666"/>
+                    <w:top w:val="single" w:sz="6" w:space="0" w:color="666666"/>
+                    <w:left w:val="none" w:sz="0" w:space="0" w:color="000000"/>
+                    <w:right w:val="none" w:sz="0" w:space="0" w:color="000000"/>
+                  </w:tcBorders>
+                  <w:shd w:val="clear" w:color="auto" w:fill="FFFFFF"/>
+                  <w:tcMar>
+                    <w:top w:w="0" w:type="dxa"/>
+                    <w:bottom w:w="0" w:type="dxa"/>
+                    <w:left w:w="0" w:type="dxa"/>
+                    <w:right w:w="0" w:type="dxa"/>
+                  </w:tcMar>
+                  <w:vAlign w:val="center"/>
+                </w:tcPr>
+                <w:p>
+                  <w:pPr>
+                    <w:jc w:val="left"/>
+                    <w:pBdr>
+                      <w:bottom w:val="none" w:sz="0" w:space="0" w:color="000000"/>
+                      <w:top w:val="none" w:sz="0" w:space="0" w:color="000000"/>
+                      <w:left w:val="none" w:sz="0" w:space="0" w:color="000000"/>
+                      <w:right w:val="none" w:sz="0" w:space="0" w:color="000000"/>
+                    </w:pBdr>
+                    <w:spacing w:after="40" w:before="40" w:line="240"/>
+                    <w:ind w:left="60" w:right="60" w:firstLine="0" w:firstLineChars="0"/>
+                    <w:rPr>
+                      <w:rFonts w:ascii="Arial" w:hAnsi="Arial" w:eastAsia="Arial" w:cs="Arial"/>
+                      <w:i w:val="false"/>
+                      <w:b w:val="false"/>
+                      <w:u w:val="none"/>
+                      <w:strike w:val="false"/>
+                      <w:sz w:val="16"/>
+                      <w:szCs w:val="16"/>
+                      <w:color w:val="000000"/>
+                    </w:rPr>
+                  </w:pPr>
+                </w:p>
+              </w:tc>
+              <w:tc>
+                <w:tcPr>
+                  <w:tcBorders>
+                    <w:bottom w:val="single" w:sz="12" w:space="0" w:color="666666"/>
+                    <w:top w:val="single" w:sz="6" w:space="0" w:color="666666"/>
+                    <w:left w:val="none" w:sz="0" w:space="0" w:color="000000"/>
+                    <w:right w:val="none" w:sz="0" w:space="0" w:color="000000"/>
+                  </w:tcBorders>
+                  <w:shd w:val="clear" w:color="auto" w:fill="FFFFFF"/>
+                  <w:tcMar>
+                    <w:top w:w="0" w:type="dxa"/>
+                    <w:bottom w:w="0" w:type="dxa"/>
+                    <w:left w:w="0" w:type="dxa"/>
+                    <w:right w:w="0" w:type="dxa"/>
+                  </w:tcMar>
+                  <w:vAlign w:val="center"/>
+                </w:tcPr>
+                <w:p>
+                  <w:pPr>
+                    <w:jc w:val="center"/>
+                    <w:pBdr>
+                      <w:bottom w:val="none" w:sz="0" w:space="0" w:color="000000"/>
+                      <w:top w:val="none" w:sz="0" w:space="0" w:color="000000"/>
+                      <w:left w:val="none" w:sz="0" w:space="0" w:color="000000"/>
+                      <w:right w:val="none" w:sz="0" w:space="0" w:color="000000"/>
+                    </w:pBdr>
+                    <w:spacing w:after="40" w:before="40" w:line="240"/>
+                    <w:ind w:left="60" w:right="60" w:firstLine="0" w:firstLineChars="0"/>
+                    <w:rPr>
+                      <w:rFonts w:ascii="Arial" w:hAnsi="Arial" w:eastAsia="Arial" w:cs="Arial"/>
+                      <w:i w:val="false"/>
+                      <w:b w:val="false"/>
+                      <w:u w:val="none"/>
+                      <w:strike w:val="false"/>
+                      <w:sz w:val="16"/>
+                      <w:szCs w:val="16"/>
+                      <w:color w:val="000000"/>
+                    </w:rPr>
+                  </w:pPr>
+                  <w:r xmlns:w="http://schemas.openxmlformats.org/wordprocessingml/2006/main" xmlns:wp="http://schemas.openxmlformats.org/drawingml/2006/wordprocessingDrawing" xmlns:r="http://schemas.openxmlformats.org/officeDocument/2006/relationships" xmlns:w14="http://schemas.microsoft.com/office/word/2010/wordml">
+                    <w:rPr>
+                      <w:rFonts w:ascii="Arial" w:hAnsi="Arial" w:eastAsia="Arial" w:cs="Arial"/>
+                      <w:i w:val="false"/>
+                      <w:b w:val="false"/>
+                      <w:u w:val="none"/>
+                      <w:strike w:val="false"/>
+                      <w:sz w:val="16"/>
+                      <w:szCs w:val="16"/>
+                      <w:color w:val="000000"/>
+                    </w:rPr>
+                    <w:t xml:space="preserve">8</w:t>
+                  </w:r>
+                </w:p>
+              </w:tc>
+              <w:tc>
+                <w:tcPr>
+                  <w:tcBorders>
+                    <w:bottom w:val="single" w:sz="12" w:space="0" w:color="666666"/>
+                    <w:top w:val="single" w:sz="6" w:space="0" w:color="666666"/>
+                    <w:left w:val="none" w:sz="0" w:space="0" w:color="000000"/>
+                    <w:right w:val="none" w:sz="0" w:space="0" w:color="000000"/>
+                  </w:tcBorders>
+                  <w:shd w:val="clear" w:color="auto" w:fill="FFFFFF"/>
+                  <w:tcMar>
+                    <w:top w:w="0" w:type="dxa"/>
+                    <w:bottom w:w="0" w:type="dxa"/>
+                    <w:left w:w="0" w:type="dxa"/>
+                    <w:right w:w="0" w:type="dxa"/>
+                  </w:tcMar>
+                  <w:vAlign w:val="center"/>
+                </w:tcPr>
+                <w:p>
+                  <w:pPr>
+                    <w:jc w:val="center"/>
+                    <w:pBdr>
+                      <w:bottom w:val="none" w:sz="0" w:space="0" w:color="000000"/>
+                      <w:top w:val="none" w:sz="0" w:space="0" w:color="000000"/>
+                      <w:left w:val="none" w:sz="0" w:space="0" w:color="000000"/>
+                      <w:right w:val="none" w:sz="0" w:space="0" w:color="000000"/>
+                    </w:pBdr>
+                    <w:spacing w:after="40" w:before="40" w:line="240"/>
+                    <w:ind w:left="60" w:right="60" w:firstLine="0" w:firstLineChars="0"/>
+                    <w:rPr>
+                      <w:rFonts w:ascii="Arial" w:hAnsi="Arial" w:eastAsia="Arial" w:cs="Arial"/>
+                      <w:i w:val="false"/>
+                      <w:b w:val="false"/>
+                      <w:u w:val="none"/>
+                      <w:strike w:val="false"/>
+                      <w:sz w:val="16"/>
+                      <w:szCs w:val="16"/>
+                      <w:color w:val="000000"/>
+                    </w:rPr>
+                  </w:pPr>
+                  <w:r xmlns:w="http://schemas.openxmlformats.org/wordprocessingml/2006/main" xmlns:wp="http://schemas.openxmlformats.org/drawingml/2006/wordprocessingDrawing" xmlns:r="http://schemas.openxmlformats.org/officeDocument/2006/relationships" xmlns:w14="http://schemas.microsoft.com/office/word/2010/wordml">
+                    <w:rPr>
+                      <w:rFonts w:ascii="Arial" w:hAnsi="Arial" w:eastAsia="Arial" w:cs="Arial"/>
+                      <w:i w:val="false"/>
+                      <w:b w:val="false"/>
+                      <w:u w:val="none"/>
+                      <w:strike w:val="false"/>
+                      <w:sz w:val="16"/>
+                      <w:szCs w:val="16"/>
+                      <w:color w:val="000000"/>
+                    </w:rPr>
+                    <w:t xml:space="preserve">2025-09-29</w:t>
+                  </w:r>
+                </w:p>
+              </w:tc>
+            </w:tr>
+          </w:tbl>
+          <w:bookmarkEnd w:id="35"/>
+        </w:tc>
+      </w:tr>
+    </w:tbl>
+    <w:tbl>
+      <w:tblPr>
+        <w:tblStyle w:val="Table"/>
+        <w:tblW w:type="pct" w:w="5000"/>
+        <w:tblLayout w:type="fixed"/>
+        <w:tblLook w:firstRow="0" w:lastRow="0" w:firstColumn="0" w:lastColumn="0" w:noHBand="0" w:noVBand="0" w:val="0000"/>
+      </w:tblPr>
+      <w:tblGrid>
+        <w:gridCol w:w="7920"/>
+      </w:tblGrid>
+      <w:tr>
+        <w:tc>
+          <w:tcPr/>
+          <w:bookmarkStart w:id="36" w:name="tbl-survival"/>
+          <w:p>
+            <w:pPr>
+              <w:jc w:val="center"/>
+            </w:pPr>
+            <w:pPr>
+              <w:jc w:val="left"/>
+              <w:spacing w:before="200"/>
+              <w:pStyle w:val="ImageCaption"/>
+            </w:pPr>
+            <w:r>
+              <w:t xml:space="preserve">Table 2: Abundance estimates from the selected POPAN model. Each row (i.e., species) represents results from a single analysis/model.</w:t>
             </w:r>
           </w:p>
           <w:tbl xmlns:w="http://schemas.openxmlformats.org/wordprocessingml/2006/main" xmlns:r="http://schemas.openxmlformats.org/officeDocument/2006/relationships" xmlns:w14="http://schemas.microsoft.com/office/word/2010/wordml" xmlns:wp="http://schemas.openxmlformats.org/drawingml/2006/wordprocessingDrawing" xmlns:a="http://schemas.openxmlformats.org/drawingml/2006/main" xmlns:pic="http://schemas.openxmlformats.org/drawingml/2006/picture">
@@ -11375,7 +14402,7 @@
               </w:tc>
             </w:tr>
           </w:tbl>
-          <w:bookmarkEnd w:id="35"/>
+          <w:bookmarkEnd w:id="36"/>
         </w:tc>
       </w:tr>
     </w:tbl>
@@ -11397,7 +14424,7 @@
       <w:tr>
         <w:tc>
           <w:tcPr/>
-          <w:bookmarkStart w:id="36" w:name="tbl-abundance"/>
+          <w:bookmarkStart w:id="37" w:name="tbl-abundance"/>
           <w:p>
             <w:pPr>
               <w:jc w:val="center"/>
@@ -11408,7 +14435,7 @@
               <w:pStyle w:val="ImageCaption"/>
             </w:pPr>
             <w:r>
-              <w:t xml:space="preserve">Table 2: Abundance estimates of all individuals from the initial release (uniquely tagged, non-uniquely tagged, and untagged). Based on apparent survival estimates from the selected POPAN model and initial number of mussels released. Each row (i.e., species) represents results from a single analysis/model.</w:t>
+              <w:t xml:space="preserve">Table 3: Abundance estimates of all individuals from the initial release (uniquely tagged, non-uniquely tagged, and untagged). Based on apparent survival estimates from the selected POPAN model and initial number of mussels released. Each row (i.e., species) represents results from a single analysis/model.</w:t>
             </w:r>
           </w:p>
           <w:tbl xmlns:w="http://schemas.openxmlformats.org/wordprocessingml/2006/main" xmlns:r="http://schemas.openxmlformats.org/officeDocument/2006/relationships" xmlns:w14="http://schemas.microsoft.com/office/word/2010/wordml" xmlns:wp="http://schemas.openxmlformats.org/drawingml/2006/wordprocessingDrawing" xmlns:a="http://schemas.openxmlformats.org/drawingml/2006/main" xmlns:pic="http://schemas.openxmlformats.org/drawingml/2006/picture">
@@ -16651,7 +19678,7 @@
               </w:tc>
             </w:tr>
           </w:tbl>
-          <w:bookmarkEnd w:id="36"/>
+          <w:bookmarkEnd w:id="37"/>
         </w:tc>
       </w:tr>
     </w:tbl>
@@ -16660,8 +19687,8 @@
         <w:br w:type="page"/>
       </w:r>
     </w:p>
-    <w:bookmarkEnd w:id="37"/>
-    <w:bookmarkStart w:id="43" w:name="references"/>
+    <w:bookmarkEnd w:id="38"/>
+    <w:bookmarkStart w:id="44" w:name="references"/>
     <w:p>
       <w:pPr>
         <w:pStyle w:val="Heading1"/>
@@ -16670,8 +19697,8 @@
         <w:t xml:space="preserve">6. References</w:t>
       </w:r>
     </w:p>
-    <w:bookmarkStart w:id="42" w:name="refs"/>
-    <w:bookmarkStart w:id="38" w:name="X437bd82681b6244afc723f1058a320799156d9d"/>
+    <w:bookmarkStart w:id="43" w:name="refs"/>
+    <w:bookmarkStart w:id="39" w:name="X437bd82681b6244afc723f1058a320799156d9d"/>
     <w:p>
       <w:pPr>
         <w:pStyle w:val="Bibliography"/>
@@ -16744,8 +19771,8 @@
         <w:t xml:space="preserve">, edited by B N Petrov and F Cazakil, 267–81. Budapest, Hungary: Akademiai Kidao.</w:t>
       </w:r>
     </w:p>
-    <w:bookmarkEnd w:id="38"/>
-    <w:bookmarkStart w:id="39" w:name="X3d765049c0b9d139b2bf4c37083a4031b8ade27"/>
+    <w:bookmarkEnd w:id="39"/>
+    <w:bookmarkStart w:id="40" w:name="X3d765049c0b9d139b2bf4c37083a4031b8ade27"/>
     <w:p>
       <w:pPr>
         <w:pStyle w:val="Bibliography"/>
@@ -16830,8 +19857,8 @@
         <w:t xml:space="preserve">. 2nd ed. New York: Springer-Verlag.</w:t>
       </w:r>
     </w:p>
-    <w:bookmarkEnd w:id="39"/>
-    <w:bookmarkStart w:id="40" w:name="ref-sugiura_1978_FurtherAnalysisData"/>
+    <w:bookmarkEnd w:id="40"/>
+    <w:bookmarkStart w:id="41" w:name="ref-sugiura_1978_FurtherAnalysisData"/>
     <w:p>
       <w:pPr>
         <w:pStyle w:val="Bibliography"/>
@@ -16880,8 +19907,8 @@
         <w:t xml:space="preserve">7 (1): 13–26.</w:t>
       </w:r>
     </w:p>
-    <w:bookmarkEnd w:id="40"/>
-    <w:bookmarkStart w:id="41" w:name="Xe040a3ee9170c3970aba188ecc23934f91c03aa"/>
+    <w:bookmarkEnd w:id="41"/>
+    <w:bookmarkStart w:id="42" w:name="Xe040a3ee9170c3970aba188ecc23934f91c03aa"/>
     <w:p>
       <w:pPr>
         <w:pStyle w:val="Bibliography"/>
@@ -16921,9 +19948,9 @@
         <w:t xml:space="preserve">46 (S1): S120–39.</w:t>
       </w:r>
     </w:p>
-    <w:bookmarkEnd w:id="41"/>
     <w:bookmarkEnd w:id="42"/>
     <w:bookmarkEnd w:id="43"/>
+    <w:bookmarkEnd w:id="44"/>
     <w:sectPr>
       <w:pgSz w:h="15840" w:w="12240"/>
       <w:pgMar w:bottom="1440" w:footer="720" w:gutter="0" w:header="720" w:left="1440" w:right="1440" w:top="1440"/>

</xml_diff>

<commit_message>
doc: format occasion table and edits to results
</commit_message>
<xml_diff>
--- a/doc/Report/reston_mark_recapture_methods_results_v0.1.docx
+++ b/doc/Report/reston_mark_recapture_methods_results_v0.1.docx
@@ -33,7 +33,7 @@
         <w:pStyle w:val="FirstParagraph"/>
       </w:pPr>
       <w:r>
-        <w:t xml:space="preserve">We released a total of 2802 adult</w:t>
+        <w:t xml:space="preserve">We released a total of 1922 adult</w:t>
       </w:r>
       <w:r>
         <w:t xml:space="preserve"> </w:t>
@@ -55,7 +55,7 @@
         <w:t xml:space="preserve"> </w:t>
       </w:r>
       <w:r>
-        <w:t xml:space="preserve">We released 1224 at Glade Run (38.93031, -77.34245) on July 26, 2023, and 1578 at Snakeden Run (38.9238, -77.33168) on July 27.</w:t>
+        <w:t xml:space="preserve">We released 1224 at Glade Run (38.93031, -77.34245) on July 26, 2023, and 698 at Snakeden Run (38.9238, -77.33168) on July 27.</w:t>
       </w:r>
       <w:r>
         <w:t xml:space="preserve"> </w:t>
@@ -1736,31 +1736,7 @@
         <w:t xml:space="preserve"> </w:t>
       </w:r>
       <w:r>
-        <w:t xml:space="preserve">Assuming that survival estimates from the Burnham model are true, this would suggest that we observed approximatly</w:t>
-      </w:r>
-      <w:r>
-        <w:t xml:space="preserve"> </w:t>
-      </w:r>
-      <w:r>
-        <w:rPr>
-          <w:rStyle w:val="VerbatimChar"/>
-        </w:rPr>
-        <w:t xml:space="preserve">{r}final_detectability_glade</w:t>
-      </w:r>
-      <w:r>
-        <w:t xml:space="preserve">% of mussels at Glade Run and</w:t>
-      </w:r>
-      <w:r>
-        <w:t xml:space="preserve"> </w:t>
-      </w:r>
-      <w:r>
-        <w:rPr>
-          <w:rStyle w:val="VerbatimChar"/>
-        </w:rPr>
-        <w:t xml:space="preserve">{r}final_detectability_snakeden</w:t>
-      </w:r>
-      <w:r>
-        <w:t xml:space="preserve">% of mussels at Snakeden Run on the final sampling occasion.</w:t>
+        <w:t xml:space="preserve">Assuming that survival estimates from the Burnham model are true, this would suggest that we observed approximatly 43.7288136 % of mussels at Glade Run and 38.7387387 % of mussels at Snakeden Run on the final sampling occasion.</w:t>
       </w:r>
       <w:r>
         <w:t xml:space="preserve"> </w:t>
@@ -1790,65 +1766,31 @@
         <w:t xml:space="preserve"> </w:t>
       </w:r>
       <w:r>
-        <w:t xml:space="preserve">This is higher than the estimates from the mark-recapture analysis (Snakeden:</w:t>
+        <w:t xml:space="preserve">This is higher than the estimates from the mark-recapture analysis (Snakeden: 7.0342205% and Glade: 48.2026144%).</w:t>
       </w:r>
       <w:r>
         <w:t xml:space="preserve"> </w:t>
       </w:r>
       <w:r>
-        <w:rPr>
-          <w:rStyle w:val="VerbatimChar"/>
-        </w:rPr>
-        <w:t xml:space="preserve">{r}total_survival_snakeden</w:t>
-      </w:r>
-      <w:r>
-        <w:t xml:space="preserve">% and Glade:</w:t>
+        <w:t xml:space="preserve">This is not surprising since the mark-recapture estimates account for the probabilities of both detecting a live mussel and recovering a dead mussel, in addition to survival.</w:t>
       </w:r>
       <w:r>
         <w:t xml:space="preserve"> </w:t>
       </w:r>
       <w:r>
-        <w:rPr>
-          <w:rStyle w:val="VerbatimChar"/>
-        </w:rPr>
-        <w:t xml:space="preserve">{r}total_survival_glade</w:t>
-      </w:r>
-      <w:r>
-        <w:t xml:space="preserve">%).</w:t>
+        <w:t xml:space="preserve">Further, it is possible that our survival estimates are slightly underestimated compared to true survival.</w:t>
       </w:r>
       <w:r>
         <w:t xml:space="preserve"> </w:t>
       </w:r>
       <w:r>
-        <w:t xml:space="preserve">This is not surprising since the mark-recapture estimates account for the probabilities of both detecting a live mussel and recovering a dead mussel, in addition to survival.</w:t>
+        <w:t xml:space="preserve">Of the mussels observed either alive or dead at least once, 5.3008596% were untagged at Snakeden Run and 5.2808989% at Glade Run, suggesting at least some tag loss.</w:t>
       </w:r>
       <w:r>
         <w:t xml:space="preserve"> </w:t>
       </w:r>
       <w:r>
-        <w:t xml:space="preserve">Further, it is possible that our survival estimates are slightly underestimated compared to true survival.</w:t>
-      </w:r>
-      <w:r>
-        <w:t xml:space="preserve"> </w:t>
-      </w:r>
-      <w:r>
-        <w:t xml:space="preserve">There was high tag loss (</w:t>
-      </w:r>
-      <w:r>
-        <w:rPr>
-          <w:b/>
-          <w:bCs/>
-        </w:rPr>
-        <w:t xml:space="preserve">% here</w:t>
-      </w:r>
-      <w:r>
-        <w:t xml:space="preserve">) at each site.</w:t>
-      </w:r>
-      <w:r>
-        <w:t xml:space="preserve"> </w:t>
-      </w:r>
-      <w:r>
-        <w:t xml:space="preserve">Individuals with lost tags are modeled as if they were not seen again, which has the effect of underestiamting survival (</w:t>
+        <w:t xml:space="preserve">Individuals with lost tags are modeled as if they were not seen again, which can have the effect of underestiamting survival (</w:t>
       </w:r>
       <w:r>
         <w:rPr>
@@ -2097,13 +2039,13 @@
               <w:tblLook w:firstRow="1" w:lastRow="0" w:firstColumn="0" w:lastColumn="0" w:noHBand="0" w:noVBand="1"/>
             </w:tblPr>
             <w:tblGrid>
-              <w:gridCol w:w="1152"/>
-              <w:gridCol w:w="821"/>
-              <w:gridCol w:w="821"/>
+              <w:gridCol w:w="1025"/>
+              <w:gridCol w:w="1024"/>
+              <w:gridCol w:w="1415"/>
             </w:tblGrid>
             <w:tr>
               <w:trPr>
-                <w:trHeight w:val="360" w:hRule="auto"/>
+                <w:trHeight w:val="446" w:hRule="auto"/>
                 <w:tblHeader/>
               </w:trPr>
               <w:tc>
@@ -2271,7 +2213,7 @@
             </w:tr>
             <w:tr>
               <w:trPr>
-                <w:trHeight w:val="360" w:hRule="auto"/>
+                <w:trHeight w:val="424" w:hRule="auto"/>
               </w:trPr>
               <w:tc>
                 <w:tcPr>
@@ -2289,7 +2231,7 @@
                     <w:left w:w="0" w:type="dxa"/>
                     <w:right w:w="0" w:type="dxa"/>
                   </w:tcMar>
-                  <w:vAlign w:val="center"/>
+                  <w:vAlign w:val="top"/>
                 </w:tcPr>
                 <w:p>
                   <w:pPr>
@@ -2439,7 +2381,7 @@
             </w:tr>
             <w:tr>
               <w:trPr>
-                <w:trHeight w:val="360" w:hRule="auto"/>
+                <w:trHeight w:val="431" w:hRule="auto"/>
               </w:trPr>
               <w:tc>
                 <w:tcPr>
@@ -2457,7 +2399,7 @@
                     <w:left w:w="0" w:type="dxa"/>
                     <w:right w:w="0" w:type="dxa"/>
                   </w:tcMar>
-                  <w:vAlign w:val="center"/>
+                  <w:vAlign w:val="top"/>
                 </w:tcPr>
                 <w:p>
                   <w:pPr>
@@ -2594,7 +2536,7 @@
             </w:tr>
             <w:tr>
               <w:trPr>
-                <w:trHeight w:val="360" w:hRule="auto"/>
+                <w:trHeight w:val="431" w:hRule="auto"/>
               </w:trPr>
               <w:tc>
                 <w:tcPr>
@@ -2612,7 +2554,7 @@
                     <w:left w:w="0" w:type="dxa"/>
                     <w:right w:w="0" w:type="dxa"/>
                   </w:tcMar>
-                  <w:vAlign w:val="center"/>
+                  <w:vAlign w:val="top"/>
                 </w:tcPr>
                 <w:p>
                   <w:pPr>
@@ -2749,7 +2691,7 @@
             </w:tr>
             <w:tr>
               <w:trPr>
-                <w:trHeight w:val="360" w:hRule="auto"/>
+                <w:trHeight w:val="431" w:hRule="auto"/>
               </w:trPr>
               <w:tc>
                 <w:tcPr>
@@ -2767,7 +2709,7 @@
                     <w:left w:w="0" w:type="dxa"/>
                     <w:right w:w="0" w:type="dxa"/>
                   </w:tcMar>
-                  <w:vAlign w:val="center"/>
+                  <w:vAlign w:val="top"/>
                 </w:tcPr>
                 <w:p>
                   <w:pPr>
@@ -2904,7 +2846,7 @@
             </w:tr>
             <w:tr>
               <w:trPr>
-                <w:trHeight w:val="360" w:hRule="auto"/>
+                <w:trHeight w:val="431" w:hRule="auto"/>
               </w:trPr>
               <w:tc>
                 <w:tcPr>
@@ -2922,7 +2864,7 @@
                     <w:left w:w="0" w:type="dxa"/>
                     <w:right w:w="0" w:type="dxa"/>
                   </w:tcMar>
-                  <w:vAlign w:val="center"/>
+                  <w:vAlign w:val="top"/>
                 </w:tcPr>
                 <w:p>
                   <w:pPr>
@@ -3059,7 +3001,7 @@
             </w:tr>
             <w:tr>
               <w:trPr>
-                <w:trHeight w:val="360" w:hRule="auto"/>
+                <w:trHeight w:val="431" w:hRule="auto"/>
               </w:trPr>
               <w:tc>
                 <w:tcPr>
@@ -3077,7 +3019,7 @@
                     <w:left w:w="0" w:type="dxa"/>
                     <w:right w:w="0" w:type="dxa"/>
                   </w:tcMar>
-                  <w:vAlign w:val="center"/>
+                  <w:vAlign w:val="top"/>
                 </w:tcPr>
                 <w:p>
                   <w:pPr>
@@ -3214,7 +3156,7 @@
             </w:tr>
             <w:tr>
               <w:trPr>
-                <w:trHeight w:val="360" w:hRule="auto"/>
+                <w:trHeight w:val="431" w:hRule="auto"/>
               </w:trPr>
               <w:tc>
                 <w:tcPr>
@@ -3232,7 +3174,7 @@
                     <w:left w:w="0" w:type="dxa"/>
                     <w:right w:w="0" w:type="dxa"/>
                   </w:tcMar>
-                  <w:vAlign w:val="center"/>
+                  <w:vAlign w:val="top"/>
                 </w:tcPr>
                 <w:p>
                   <w:pPr>
@@ -3369,7 +3311,7 @@
             </w:tr>
             <w:tr>
               <w:trPr>
-                <w:trHeight w:val="360" w:hRule="auto"/>
+                <w:trHeight w:val="431" w:hRule="auto"/>
               </w:trPr>
               <w:tc>
                 <w:tcPr>
@@ -3387,7 +3329,7 @@
                     <w:left w:w="0" w:type="dxa"/>
                     <w:right w:w="0" w:type="dxa"/>
                   </w:tcMar>
-                  <w:vAlign w:val="center"/>
+                  <w:vAlign w:val="top"/>
                 </w:tcPr>
                 <w:p>
                   <w:pPr>
@@ -3524,7 +3466,7 @@
             </w:tr>
             <w:tr>
               <w:trPr>
-                <w:trHeight w:val="360" w:hRule="auto"/>
+                <w:trHeight w:val="431" w:hRule="auto"/>
               </w:trPr>
               <w:tc>
                 <w:tcPr>
@@ -3542,7 +3484,7 @@
                     <w:left w:w="0" w:type="dxa"/>
                     <w:right w:w="0" w:type="dxa"/>
                   </w:tcMar>
-                  <w:vAlign w:val="center"/>
+                  <w:vAlign w:val="top"/>
                 </w:tcPr>
                 <w:p>
                   <w:pPr>
@@ -3679,7 +3621,7 @@
             </w:tr>
             <w:tr>
               <w:trPr>
-                <w:trHeight w:val="360" w:hRule="auto"/>
+                <w:trHeight w:val="438" w:hRule="auto"/>
               </w:trPr>
               <w:tc>
                 <w:tcPr>
@@ -3697,7 +3639,7 @@
                     <w:left w:w="0" w:type="dxa"/>
                     <w:right w:w="0" w:type="dxa"/>
                   </w:tcMar>
-                  <w:vAlign w:val="center"/>
+                  <w:vAlign w:val="top"/>
                 </w:tcPr>
                 <w:p>
                   <w:pPr>
@@ -3847,7 +3789,7 @@
             </w:tr>
             <w:tr>
               <w:trPr>
-                <w:trHeight w:val="360" w:hRule="auto"/>
+                <w:trHeight w:val="431" w:hRule="auto"/>
               </w:trPr>
               <w:tc>
                 <w:tcPr>
@@ -3865,7 +3807,7 @@
                     <w:left w:w="0" w:type="dxa"/>
                     <w:right w:w="0" w:type="dxa"/>
                   </w:tcMar>
-                  <w:vAlign w:val="center"/>
+                  <w:vAlign w:val="top"/>
                 </w:tcPr>
                 <w:p>
                   <w:pPr>
@@ -4002,7 +3944,7 @@
             </w:tr>
             <w:tr>
               <w:trPr>
-                <w:trHeight w:val="360" w:hRule="auto"/>
+                <w:trHeight w:val="431" w:hRule="auto"/>
               </w:trPr>
               <w:tc>
                 <w:tcPr>
@@ -4020,7 +3962,7 @@
                     <w:left w:w="0" w:type="dxa"/>
                     <w:right w:w="0" w:type="dxa"/>
                   </w:tcMar>
-                  <w:vAlign w:val="center"/>
+                  <w:vAlign w:val="top"/>
                 </w:tcPr>
                 <w:p>
                   <w:pPr>
@@ -4157,7 +4099,7 @@
             </w:tr>
             <w:tr>
               <w:trPr>
-                <w:trHeight w:val="360" w:hRule="auto"/>
+                <w:trHeight w:val="431" w:hRule="auto"/>
               </w:trPr>
               <w:tc>
                 <w:tcPr>
@@ -4175,7 +4117,7 @@
                     <w:left w:w="0" w:type="dxa"/>
                     <w:right w:w="0" w:type="dxa"/>
                   </w:tcMar>
-                  <w:vAlign w:val="center"/>
+                  <w:vAlign w:val="top"/>
                 </w:tcPr>
                 <w:p>
                   <w:pPr>
@@ -4312,7 +4254,7 @@
             </w:tr>
             <w:tr>
               <w:trPr>
-                <w:trHeight w:val="360" w:hRule="auto"/>
+                <w:trHeight w:val="431" w:hRule="auto"/>
               </w:trPr>
               <w:tc>
                 <w:tcPr>
@@ -4330,7 +4272,7 @@
                     <w:left w:w="0" w:type="dxa"/>
                     <w:right w:w="0" w:type="dxa"/>
                   </w:tcMar>
-                  <w:vAlign w:val="center"/>
+                  <w:vAlign w:val="top"/>
                 </w:tcPr>
                 <w:p>
                   <w:pPr>
@@ -4467,7 +4409,7 @@
             </w:tr>
             <w:tr>
               <w:trPr>
-                <w:trHeight w:val="360" w:hRule="auto"/>
+                <w:trHeight w:val="431" w:hRule="auto"/>
               </w:trPr>
               <w:tc>
                 <w:tcPr>
@@ -4485,7 +4427,7 @@
                     <w:left w:w="0" w:type="dxa"/>
                     <w:right w:w="0" w:type="dxa"/>
                   </w:tcMar>
-                  <w:vAlign w:val="center"/>
+                  <w:vAlign w:val="top"/>
                 </w:tcPr>
                 <w:p>
                   <w:pPr>
@@ -4622,7 +4564,7 @@
             </w:tr>
             <w:tr>
               <w:trPr>
-                <w:trHeight w:val="360" w:hRule="auto"/>
+                <w:trHeight w:val="431" w:hRule="auto"/>
               </w:trPr>
               <w:tc>
                 <w:tcPr>
@@ -4640,7 +4582,7 @@
                     <w:left w:w="0" w:type="dxa"/>
                     <w:right w:w="0" w:type="dxa"/>
                   </w:tcMar>
-                  <w:vAlign w:val="center"/>
+                  <w:vAlign w:val="top"/>
                 </w:tcPr>
                 <w:p>
                   <w:pPr>
@@ -4777,7 +4719,7 @@
             </w:tr>
             <w:tr>
               <w:trPr>
-                <w:trHeight w:val="360" w:hRule="auto"/>
+                <w:trHeight w:val="431" w:hRule="auto"/>
               </w:trPr>
               <w:tc>
                 <w:tcPr>
@@ -4795,7 +4737,7 @@
                     <w:left w:w="0" w:type="dxa"/>
                     <w:right w:w="0" w:type="dxa"/>
                   </w:tcMar>
-                  <w:vAlign w:val="center"/>
+                  <w:vAlign w:val="top"/>
                 </w:tcPr>
                 <w:p>
                   <w:pPr>
@@ -4932,7 +4874,7 @@
             </w:tr>
             <w:tr>
               <w:trPr>
-                <w:trHeight w:val="360" w:hRule="auto"/>
+                <w:trHeight w:val="438" w:hRule="auto"/>
               </w:trPr>
               <w:tc>
                 <w:tcPr>
@@ -4950,7 +4892,7 @@
                     <w:left w:w="0" w:type="dxa"/>
                     <w:right w:w="0" w:type="dxa"/>
                   </w:tcMar>
-                  <w:vAlign w:val="center"/>
+                  <w:vAlign w:val="top"/>
                 </w:tcPr>
                 <w:p>
                   <w:pPr>

</xml_diff>

<commit_message>
doc: working abundance table
</commit_message>
<xml_diff>
--- a/doc/Report/reston_mark_recapture_methods_results_v0.1.docx
+++ b/doc/Report/reston_mark_recapture_methods_results_v0.1.docx
@@ -14392,15 +14392,15 @@
               <w:tblLook w:firstRow="1" w:lastRow="0" w:firstColumn="0" w:lastColumn="0" w:noHBand="0" w:noVBand="1"/>
             </w:tblPr>
             <w:tblGrid>
-              <w:gridCol w:w="1152"/>
-              <w:gridCol w:w="821"/>
-              <w:gridCol w:w="821"/>
-              <w:gridCol w:w="821"/>
-              <w:gridCol w:w="821"/>
+              <w:gridCol w:w="1025"/>
+              <w:gridCol w:w="1727"/>
+              <w:gridCol w:w="1887"/>
+              <w:gridCol w:w="1531"/>
+              <w:gridCol w:w="1548"/>
             </w:tblGrid>
             <w:tr>
               <w:trPr>
-                <w:trHeight w:val="360" w:hRule="auto"/>
+                <w:trHeight w:val="446" w:hRule="auto"/>
                 <w:tblHeader/>
               </w:trPr>
               <w:tc>
@@ -14676,10 +14676,11 @@
             </w:tr>
             <w:tr>
               <w:trPr>
-                <w:trHeight w:val="360" w:hRule="auto"/>
+                <w:trHeight w:val="424" w:hRule="auto"/>
               </w:trPr>
               <w:tc>
                 <w:tcPr>
+                  <w:vMerge w:val="restart"/>
                   <w:tcBorders>
                     <w:bottom w:val="single" w:sz="6" w:space="0" w:color="666666"/>
                     <w:top w:val="single" w:sz="12" w:space="0" w:color="666666"/>
@@ -14693,7 +14694,7 @@
                     <w:left w:w="0" w:type="dxa"/>
                     <w:right w:w="0" w:type="dxa"/>
                   </w:tcMar>
-                  <w:vAlign w:val="center"/>
+                  <w:vAlign w:val="top"/>
                 </w:tcPr>
                 <w:p>
                   <w:pPr>
@@ -14951,24 +14952,25 @@
             </w:tr>
             <w:tr>
               <w:trPr>
-                <w:trHeight w:val="360" w:hRule="auto"/>
+                <w:trHeight w:val="431" w:hRule="auto"/>
               </w:trPr>
               <w:tc>
                 <w:tcPr>
-                  <w:tcBorders>
-                    <w:bottom w:val="single" w:sz="6" w:space="0" w:color="666666"/>
-                    <w:top w:val="single" w:sz="6" w:space="0" w:color="666666"/>
-                    <w:left w:val="none" w:sz="0" w:space="0" w:color="000000"/>
-                    <w:right w:val="none" w:sz="0" w:space="0" w:color="000000"/>
-                  </w:tcBorders>
-                  <w:shd w:val="clear" w:color="auto" w:fill="FFFFFF"/>
-                  <w:tcMar>
-                    <w:top w:w="0" w:type="dxa"/>
-                    <w:bottom w:w="0" w:type="dxa"/>
-                    <w:left w:w="0" w:type="dxa"/>
-                    <w:right w:w="0" w:type="dxa"/>
-                  </w:tcMar>
-                  <w:vAlign w:val="center"/>
+                  <w:vMerge/>
+                  <w:tcBorders>
+                    <w:bottom w:val="single" w:sz="6" w:space="0" w:color="666666"/>
+                    <w:top w:val="single" w:sz="6" w:space="0" w:color="666666"/>
+                    <w:left w:val="none" w:sz="0" w:space="0" w:color="000000"/>
+                    <w:right w:val="none" w:sz="0" w:space="0" w:color="000000"/>
+                  </w:tcBorders>
+                  <w:shd w:val="clear" w:color="auto" w:fill="FFFFFF"/>
+                  <w:tcMar>
+                    <w:top w:w="0" w:type="dxa"/>
+                    <w:bottom w:w="0" w:type="dxa"/>
+                    <w:left w:w="0" w:type="dxa"/>
+                    <w:right w:w="0" w:type="dxa"/>
+                  </w:tcMar>
+                  <w:vAlign w:val="top"/>
                 </w:tcPr>
                 <w:p>
                   <w:pPr>
@@ -14992,19 +14994,6 @@
                       <w:color w:val="000000"/>
                     </w:rPr>
                   </w:pPr>
-                  <w:r xmlns:w="http://schemas.openxmlformats.org/wordprocessingml/2006/main" xmlns:wp="http://schemas.openxmlformats.org/drawingml/2006/wordprocessingDrawing" xmlns:r="http://schemas.openxmlformats.org/officeDocument/2006/relationships" xmlns:w14="http://schemas.microsoft.com/office/word/2010/wordml">
-                    <w:rPr>
-                      <w:rFonts w:ascii="Arial" w:hAnsi="Arial" w:eastAsia="Arial" w:cs="Arial"/>
-                      <w:i w:val="false"/>
-                      <w:b w:val="false"/>
-                      <w:u w:val="none"/>
-                      <w:strike w:val="false"/>
-                      <w:sz w:val="16"/>
-                      <w:szCs w:val="16"/>
-                      <w:color w:val="000000"/>
-                    </w:rPr>
-                    <w:t xml:space="preserve">Glade</w:t>
-                  </w:r>
                 </w:p>
               </w:tc>
               <w:tc>
@@ -15226,24 +15215,25 @@
             </w:tr>
             <w:tr>
               <w:trPr>
-                <w:trHeight w:val="360" w:hRule="auto"/>
+                <w:trHeight w:val="431" w:hRule="auto"/>
               </w:trPr>
               <w:tc>
                 <w:tcPr>
-                  <w:tcBorders>
-                    <w:bottom w:val="single" w:sz="6" w:space="0" w:color="666666"/>
-                    <w:top w:val="single" w:sz="6" w:space="0" w:color="666666"/>
-                    <w:left w:val="none" w:sz="0" w:space="0" w:color="000000"/>
-                    <w:right w:val="none" w:sz="0" w:space="0" w:color="000000"/>
-                  </w:tcBorders>
-                  <w:shd w:val="clear" w:color="auto" w:fill="FFFFFF"/>
-                  <w:tcMar>
-                    <w:top w:w="0" w:type="dxa"/>
-                    <w:bottom w:w="0" w:type="dxa"/>
-                    <w:left w:w="0" w:type="dxa"/>
-                    <w:right w:w="0" w:type="dxa"/>
-                  </w:tcMar>
-                  <w:vAlign w:val="center"/>
+                  <w:vMerge/>
+                  <w:tcBorders>
+                    <w:bottom w:val="single" w:sz="6" w:space="0" w:color="666666"/>
+                    <w:top w:val="single" w:sz="6" w:space="0" w:color="666666"/>
+                    <w:left w:val="none" w:sz="0" w:space="0" w:color="000000"/>
+                    <w:right w:val="none" w:sz="0" w:space="0" w:color="000000"/>
+                  </w:tcBorders>
+                  <w:shd w:val="clear" w:color="auto" w:fill="FFFFFF"/>
+                  <w:tcMar>
+                    <w:top w:w="0" w:type="dxa"/>
+                    <w:bottom w:w="0" w:type="dxa"/>
+                    <w:left w:w="0" w:type="dxa"/>
+                    <w:right w:w="0" w:type="dxa"/>
+                  </w:tcMar>
+                  <w:vAlign w:val="top"/>
                 </w:tcPr>
                 <w:p>
                   <w:pPr>
@@ -15267,19 +15257,6 @@
                       <w:color w:val="000000"/>
                     </w:rPr>
                   </w:pPr>
-                  <w:r xmlns:w="http://schemas.openxmlformats.org/wordprocessingml/2006/main" xmlns:wp="http://schemas.openxmlformats.org/drawingml/2006/wordprocessingDrawing" xmlns:r="http://schemas.openxmlformats.org/officeDocument/2006/relationships" xmlns:w14="http://schemas.microsoft.com/office/word/2010/wordml">
-                    <w:rPr>
-                      <w:rFonts w:ascii="Arial" w:hAnsi="Arial" w:eastAsia="Arial" w:cs="Arial"/>
-                      <w:i w:val="false"/>
-                      <w:b w:val="false"/>
-                      <w:u w:val="none"/>
-                      <w:strike w:val="false"/>
-                      <w:sz w:val="16"/>
-                      <w:szCs w:val="16"/>
-                      <w:color w:val="000000"/>
-                    </w:rPr>
-                    <w:t xml:space="preserve">Glade</w:t>
-                  </w:r>
                 </w:p>
               </w:tc>
               <w:tc>
@@ -15501,24 +15478,25 @@
             </w:tr>
             <w:tr>
               <w:trPr>
-                <w:trHeight w:val="360" w:hRule="auto"/>
+                <w:trHeight w:val="431" w:hRule="auto"/>
               </w:trPr>
               <w:tc>
                 <w:tcPr>
-                  <w:tcBorders>
-                    <w:bottom w:val="single" w:sz="6" w:space="0" w:color="666666"/>
-                    <w:top w:val="single" w:sz="6" w:space="0" w:color="666666"/>
-                    <w:left w:val="none" w:sz="0" w:space="0" w:color="000000"/>
-                    <w:right w:val="none" w:sz="0" w:space="0" w:color="000000"/>
-                  </w:tcBorders>
-                  <w:shd w:val="clear" w:color="auto" w:fill="FFFFFF"/>
-                  <w:tcMar>
-                    <w:top w:w="0" w:type="dxa"/>
-                    <w:bottom w:w="0" w:type="dxa"/>
-                    <w:left w:w="0" w:type="dxa"/>
-                    <w:right w:w="0" w:type="dxa"/>
-                  </w:tcMar>
-                  <w:vAlign w:val="center"/>
+                  <w:vMerge/>
+                  <w:tcBorders>
+                    <w:bottom w:val="single" w:sz="6" w:space="0" w:color="666666"/>
+                    <w:top w:val="single" w:sz="6" w:space="0" w:color="666666"/>
+                    <w:left w:val="none" w:sz="0" w:space="0" w:color="000000"/>
+                    <w:right w:val="none" w:sz="0" w:space="0" w:color="000000"/>
+                  </w:tcBorders>
+                  <w:shd w:val="clear" w:color="auto" w:fill="FFFFFF"/>
+                  <w:tcMar>
+                    <w:top w:w="0" w:type="dxa"/>
+                    <w:bottom w:w="0" w:type="dxa"/>
+                    <w:left w:w="0" w:type="dxa"/>
+                    <w:right w:w="0" w:type="dxa"/>
+                  </w:tcMar>
+                  <w:vAlign w:val="top"/>
                 </w:tcPr>
                 <w:p>
                   <w:pPr>
@@ -15542,19 +15520,6 @@
                       <w:color w:val="000000"/>
                     </w:rPr>
                   </w:pPr>
-                  <w:r xmlns:w="http://schemas.openxmlformats.org/wordprocessingml/2006/main" xmlns:wp="http://schemas.openxmlformats.org/drawingml/2006/wordprocessingDrawing" xmlns:r="http://schemas.openxmlformats.org/officeDocument/2006/relationships" xmlns:w14="http://schemas.microsoft.com/office/word/2010/wordml">
-                    <w:rPr>
-                      <w:rFonts w:ascii="Arial" w:hAnsi="Arial" w:eastAsia="Arial" w:cs="Arial"/>
-                      <w:i w:val="false"/>
-                      <w:b w:val="false"/>
-                      <w:u w:val="none"/>
-                      <w:strike w:val="false"/>
-                      <w:sz w:val="16"/>
-                      <w:szCs w:val="16"/>
-                      <w:color w:val="000000"/>
-                    </w:rPr>
-                    <w:t xml:space="preserve">Glade</w:t>
-                  </w:r>
                 </w:p>
               </w:tc>
               <w:tc>
@@ -15776,24 +15741,25 @@
             </w:tr>
             <w:tr>
               <w:trPr>
-                <w:trHeight w:val="360" w:hRule="auto"/>
+                <w:trHeight w:val="431" w:hRule="auto"/>
               </w:trPr>
               <w:tc>
                 <w:tcPr>
-                  <w:tcBorders>
-                    <w:bottom w:val="single" w:sz="6" w:space="0" w:color="666666"/>
-                    <w:top w:val="single" w:sz="6" w:space="0" w:color="666666"/>
-                    <w:left w:val="none" w:sz="0" w:space="0" w:color="000000"/>
-                    <w:right w:val="none" w:sz="0" w:space="0" w:color="000000"/>
-                  </w:tcBorders>
-                  <w:shd w:val="clear" w:color="auto" w:fill="FFFFFF"/>
-                  <w:tcMar>
-                    <w:top w:w="0" w:type="dxa"/>
-                    <w:bottom w:w="0" w:type="dxa"/>
-                    <w:left w:w="0" w:type="dxa"/>
-                    <w:right w:w="0" w:type="dxa"/>
-                  </w:tcMar>
-                  <w:vAlign w:val="center"/>
+                  <w:vMerge/>
+                  <w:tcBorders>
+                    <w:bottom w:val="single" w:sz="6" w:space="0" w:color="666666"/>
+                    <w:top w:val="single" w:sz="6" w:space="0" w:color="666666"/>
+                    <w:left w:val="none" w:sz="0" w:space="0" w:color="000000"/>
+                    <w:right w:val="none" w:sz="0" w:space="0" w:color="000000"/>
+                  </w:tcBorders>
+                  <w:shd w:val="clear" w:color="auto" w:fill="FFFFFF"/>
+                  <w:tcMar>
+                    <w:top w:w="0" w:type="dxa"/>
+                    <w:bottom w:w="0" w:type="dxa"/>
+                    <w:left w:w="0" w:type="dxa"/>
+                    <w:right w:w="0" w:type="dxa"/>
+                  </w:tcMar>
+                  <w:vAlign w:val="top"/>
                 </w:tcPr>
                 <w:p>
                   <w:pPr>
@@ -15817,19 +15783,6 @@
                       <w:color w:val="000000"/>
                     </w:rPr>
                   </w:pPr>
-                  <w:r xmlns:w="http://schemas.openxmlformats.org/wordprocessingml/2006/main" xmlns:wp="http://schemas.openxmlformats.org/drawingml/2006/wordprocessingDrawing" xmlns:r="http://schemas.openxmlformats.org/officeDocument/2006/relationships" xmlns:w14="http://schemas.microsoft.com/office/word/2010/wordml">
-                    <w:rPr>
-                      <w:rFonts w:ascii="Arial" w:hAnsi="Arial" w:eastAsia="Arial" w:cs="Arial"/>
-                      <w:i w:val="false"/>
-                      <w:b w:val="false"/>
-                      <w:u w:val="none"/>
-                      <w:strike w:val="false"/>
-                      <w:sz w:val="16"/>
-                      <w:szCs w:val="16"/>
-                      <w:color w:val="000000"/>
-                    </w:rPr>
-                    <w:t xml:space="preserve">Glade</w:t>
-                  </w:r>
                 </w:p>
               </w:tc>
               <w:tc>
@@ -16051,24 +16004,25 @@
             </w:tr>
             <w:tr>
               <w:trPr>
-                <w:trHeight w:val="360" w:hRule="auto"/>
+                <w:trHeight w:val="431" w:hRule="auto"/>
               </w:trPr>
               <w:tc>
                 <w:tcPr>
-                  <w:tcBorders>
-                    <w:bottom w:val="single" w:sz="6" w:space="0" w:color="666666"/>
-                    <w:top w:val="single" w:sz="6" w:space="0" w:color="666666"/>
-                    <w:left w:val="none" w:sz="0" w:space="0" w:color="000000"/>
-                    <w:right w:val="none" w:sz="0" w:space="0" w:color="000000"/>
-                  </w:tcBorders>
-                  <w:shd w:val="clear" w:color="auto" w:fill="FFFFFF"/>
-                  <w:tcMar>
-                    <w:top w:w="0" w:type="dxa"/>
-                    <w:bottom w:w="0" w:type="dxa"/>
-                    <w:left w:w="0" w:type="dxa"/>
-                    <w:right w:w="0" w:type="dxa"/>
-                  </w:tcMar>
-                  <w:vAlign w:val="center"/>
+                  <w:vMerge/>
+                  <w:tcBorders>
+                    <w:bottom w:val="single" w:sz="6" w:space="0" w:color="666666"/>
+                    <w:top w:val="single" w:sz="6" w:space="0" w:color="666666"/>
+                    <w:left w:val="none" w:sz="0" w:space="0" w:color="000000"/>
+                    <w:right w:val="none" w:sz="0" w:space="0" w:color="000000"/>
+                  </w:tcBorders>
+                  <w:shd w:val="clear" w:color="auto" w:fill="FFFFFF"/>
+                  <w:tcMar>
+                    <w:top w:w="0" w:type="dxa"/>
+                    <w:bottom w:w="0" w:type="dxa"/>
+                    <w:left w:w="0" w:type="dxa"/>
+                    <w:right w:w="0" w:type="dxa"/>
+                  </w:tcMar>
+                  <w:vAlign w:val="top"/>
                 </w:tcPr>
                 <w:p>
                   <w:pPr>
@@ -16092,19 +16046,6 @@
                       <w:color w:val="000000"/>
                     </w:rPr>
                   </w:pPr>
-                  <w:r xmlns:w="http://schemas.openxmlformats.org/wordprocessingml/2006/main" xmlns:wp="http://schemas.openxmlformats.org/drawingml/2006/wordprocessingDrawing" xmlns:r="http://schemas.openxmlformats.org/officeDocument/2006/relationships" xmlns:w14="http://schemas.microsoft.com/office/word/2010/wordml">
-                    <w:rPr>
-                      <w:rFonts w:ascii="Arial" w:hAnsi="Arial" w:eastAsia="Arial" w:cs="Arial"/>
-                      <w:i w:val="false"/>
-                      <w:b w:val="false"/>
-                      <w:u w:val="none"/>
-                      <w:strike w:val="false"/>
-                      <w:sz w:val="16"/>
-                      <w:szCs w:val="16"/>
-                      <w:color w:val="000000"/>
-                    </w:rPr>
-                    <w:t xml:space="preserve">Glade</w:t>
-                  </w:r>
                 </w:p>
               </w:tc>
               <w:tc>
@@ -16326,24 +16267,25 @@
             </w:tr>
             <w:tr>
               <w:trPr>
-                <w:trHeight w:val="360" w:hRule="auto"/>
+                <w:trHeight w:val="431" w:hRule="auto"/>
               </w:trPr>
               <w:tc>
                 <w:tcPr>
-                  <w:tcBorders>
-                    <w:bottom w:val="single" w:sz="6" w:space="0" w:color="666666"/>
-                    <w:top w:val="single" w:sz="6" w:space="0" w:color="666666"/>
-                    <w:left w:val="none" w:sz="0" w:space="0" w:color="000000"/>
-                    <w:right w:val="none" w:sz="0" w:space="0" w:color="000000"/>
-                  </w:tcBorders>
-                  <w:shd w:val="clear" w:color="auto" w:fill="FFFFFF"/>
-                  <w:tcMar>
-                    <w:top w:w="0" w:type="dxa"/>
-                    <w:bottom w:w="0" w:type="dxa"/>
-                    <w:left w:w="0" w:type="dxa"/>
-                    <w:right w:w="0" w:type="dxa"/>
-                  </w:tcMar>
-                  <w:vAlign w:val="center"/>
+                  <w:vMerge/>
+                  <w:tcBorders>
+                    <w:bottom w:val="single" w:sz="6" w:space="0" w:color="666666"/>
+                    <w:top w:val="single" w:sz="6" w:space="0" w:color="666666"/>
+                    <w:left w:val="none" w:sz="0" w:space="0" w:color="000000"/>
+                    <w:right w:val="none" w:sz="0" w:space="0" w:color="000000"/>
+                  </w:tcBorders>
+                  <w:shd w:val="clear" w:color="auto" w:fill="FFFFFF"/>
+                  <w:tcMar>
+                    <w:top w:w="0" w:type="dxa"/>
+                    <w:bottom w:w="0" w:type="dxa"/>
+                    <w:left w:w="0" w:type="dxa"/>
+                    <w:right w:w="0" w:type="dxa"/>
+                  </w:tcMar>
+                  <w:vAlign w:val="top"/>
                 </w:tcPr>
                 <w:p>
                   <w:pPr>
@@ -16367,19 +16309,6 @@
                       <w:color w:val="000000"/>
                     </w:rPr>
                   </w:pPr>
-                  <w:r xmlns:w="http://schemas.openxmlformats.org/wordprocessingml/2006/main" xmlns:wp="http://schemas.openxmlformats.org/drawingml/2006/wordprocessingDrawing" xmlns:r="http://schemas.openxmlformats.org/officeDocument/2006/relationships" xmlns:w14="http://schemas.microsoft.com/office/word/2010/wordml">
-                    <w:rPr>
-                      <w:rFonts w:ascii="Arial" w:hAnsi="Arial" w:eastAsia="Arial" w:cs="Arial"/>
-                      <w:i w:val="false"/>
-                      <w:b w:val="false"/>
-                      <w:u w:val="none"/>
-                      <w:strike w:val="false"/>
-                      <w:sz w:val="16"/>
-                      <w:szCs w:val="16"/>
-                      <w:color w:val="000000"/>
-                    </w:rPr>
-                    <w:t xml:space="preserve">Glade</w:t>
-                  </w:r>
                 </w:p>
               </w:tc>
               <w:tc>
@@ -16601,24 +16530,25 @@
             </w:tr>
             <w:tr>
               <w:trPr>
-                <w:trHeight w:val="360" w:hRule="auto"/>
+                <w:trHeight w:val="431" w:hRule="auto"/>
               </w:trPr>
               <w:tc>
                 <w:tcPr>
-                  <w:tcBorders>
-                    <w:bottom w:val="single" w:sz="6" w:space="0" w:color="666666"/>
-                    <w:top w:val="single" w:sz="6" w:space="0" w:color="666666"/>
-                    <w:left w:val="none" w:sz="0" w:space="0" w:color="000000"/>
-                    <w:right w:val="none" w:sz="0" w:space="0" w:color="000000"/>
-                  </w:tcBorders>
-                  <w:shd w:val="clear" w:color="auto" w:fill="FFFFFF"/>
-                  <w:tcMar>
-                    <w:top w:w="0" w:type="dxa"/>
-                    <w:bottom w:w="0" w:type="dxa"/>
-                    <w:left w:w="0" w:type="dxa"/>
-                    <w:right w:w="0" w:type="dxa"/>
-                  </w:tcMar>
-                  <w:vAlign w:val="center"/>
+                  <w:vMerge/>
+                  <w:tcBorders>
+                    <w:bottom w:val="single" w:sz="6" w:space="0" w:color="666666"/>
+                    <w:top w:val="single" w:sz="6" w:space="0" w:color="666666"/>
+                    <w:left w:val="none" w:sz="0" w:space="0" w:color="000000"/>
+                    <w:right w:val="none" w:sz="0" w:space="0" w:color="000000"/>
+                  </w:tcBorders>
+                  <w:shd w:val="clear" w:color="auto" w:fill="FFFFFF"/>
+                  <w:tcMar>
+                    <w:top w:w="0" w:type="dxa"/>
+                    <w:bottom w:w="0" w:type="dxa"/>
+                    <w:left w:w="0" w:type="dxa"/>
+                    <w:right w:w="0" w:type="dxa"/>
+                  </w:tcMar>
+                  <w:vAlign w:val="top"/>
                 </w:tcPr>
                 <w:p>
                   <w:pPr>
@@ -16642,19 +16572,6 @@
                       <w:color w:val="000000"/>
                     </w:rPr>
                   </w:pPr>
-                  <w:r xmlns:w="http://schemas.openxmlformats.org/wordprocessingml/2006/main" xmlns:wp="http://schemas.openxmlformats.org/drawingml/2006/wordprocessingDrawing" xmlns:r="http://schemas.openxmlformats.org/officeDocument/2006/relationships" xmlns:w14="http://schemas.microsoft.com/office/word/2010/wordml">
-                    <w:rPr>
-                      <w:rFonts w:ascii="Arial" w:hAnsi="Arial" w:eastAsia="Arial" w:cs="Arial"/>
-                      <w:i w:val="false"/>
-                      <w:b w:val="false"/>
-                      <w:u w:val="none"/>
-                      <w:strike w:val="false"/>
-                      <w:sz w:val="16"/>
-                      <w:szCs w:val="16"/>
-                      <w:color w:val="000000"/>
-                    </w:rPr>
-                    <w:t xml:space="preserve">Glade</w:t>
-                  </w:r>
                 </w:p>
               </w:tc>
               <w:tc>
@@ -16876,24 +16793,25 @@
             </w:tr>
             <w:tr>
               <w:trPr>
-                <w:trHeight w:val="360" w:hRule="auto"/>
+                <w:trHeight w:val="431" w:hRule="auto"/>
               </w:trPr>
               <w:tc>
                 <w:tcPr>
-                  <w:tcBorders>
-                    <w:bottom w:val="single" w:sz="6" w:space="0" w:color="666666"/>
-                    <w:top w:val="single" w:sz="6" w:space="0" w:color="666666"/>
-                    <w:left w:val="none" w:sz="0" w:space="0" w:color="000000"/>
-                    <w:right w:val="none" w:sz="0" w:space="0" w:color="000000"/>
-                  </w:tcBorders>
-                  <w:shd w:val="clear" w:color="auto" w:fill="FFFFFF"/>
-                  <w:tcMar>
-                    <w:top w:w="0" w:type="dxa"/>
-                    <w:bottom w:w="0" w:type="dxa"/>
-                    <w:left w:w="0" w:type="dxa"/>
-                    <w:right w:w="0" w:type="dxa"/>
-                  </w:tcMar>
-                  <w:vAlign w:val="center"/>
+                  <w:vMerge/>
+                  <w:tcBorders>
+                    <w:bottom w:val="single" w:sz="6" w:space="0" w:color="666666"/>
+                    <w:top w:val="single" w:sz="6" w:space="0" w:color="666666"/>
+                    <w:left w:val="none" w:sz="0" w:space="0" w:color="000000"/>
+                    <w:right w:val="none" w:sz="0" w:space="0" w:color="000000"/>
+                  </w:tcBorders>
+                  <w:shd w:val="clear" w:color="auto" w:fill="FFFFFF"/>
+                  <w:tcMar>
+                    <w:top w:w="0" w:type="dxa"/>
+                    <w:bottom w:w="0" w:type="dxa"/>
+                    <w:left w:w="0" w:type="dxa"/>
+                    <w:right w:w="0" w:type="dxa"/>
+                  </w:tcMar>
+                  <w:vAlign w:val="top"/>
                 </w:tcPr>
                 <w:p>
                   <w:pPr>
@@ -16917,19 +16835,6 @@
                       <w:color w:val="000000"/>
                     </w:rPr>
                   </w:pPr>
-                  <w:r xmlns:w="http://schemas.openxmlformats.org/wordprocessingml/2006/main" xmlns:wp="http://schemas.openxmlformats.org/drawingml/2006/wordprocessingDrawing" xmlns:r="http://schemas.openxmlformats.org/officeDocument/2006/relationships" xmlns:w14="http://schemas.microsoft.com/office/word/2010/wordml">
-                    <w:rPr>
-                      <w:rFonts w:ascii="Arial" w:hAnsi="Arial" w:eastAsia="Arial" w:cs="Arial"/>
-                      <w:i w:val="false"/>
-                      <w:b w:val="false"/>
-                      <w:u w:val="none"/>
-                      <w:strike w:val="false"/>
-                      <w:sz w:val="16"/>
-                      <w:szCs w:val="16"/>
-                      <w:color w:val="000000"/>
-                    </w:rPr>
-                    <w:t xml:space="preserve">Glade</w:t>
-                  </w:r>
                 </w:p>
               </w:tc>
               <w:tc>
@@ -17151,24 +17056,25 @@
             </w:tr>
             <w:tr>
               <w:trPr>
-                <w:trHeight w:val="360" w:hRule="auto"/>
+                <w:trHeight w:val="431" w:hRule="auto"/>
               </w:trPr>
               <w:tc>
                 <w:tcPr>
-                  <w:tcBorders>
-                    <w:bottom w:val="single" w:sz="6" w:space="0" w:color="666666"/>
-                    <w:top w:val="single" w:sz="6" w:space="0" w:color="666666"/>
-                    <w:left w:val="none" w:sz="0" w:space="0" w:color="000000"/>
-                    <w:right w:val="none" w:sz="0" w:space="0" w:color="000000"/>
-                  </w:tcBorders>
-                  <w:shd w:val="clear" w:color="auto" w:fill="FFFFFF"/>
-                  <w:tcMar>
-                    <w:top w:w="0" w:type="dxa"/>
-                    <w:bottom w:w="0" w:type="dxa"/>
-                    <w:left w:w="0" w:type="dxa"/>
-                    <w:right w:w="0" w:type="dxa"/>
-                  </w:tcMar>
-                  <w:vAlign w:val="center"/>
+                  <w:vMerge w:val="restart"/>
+                  <w:tcBorders>
+                    <w:bottom w:val="single" w:sz="12" w:space="0" w:color="666666"/>
+                    <w:top w:val="single" w:sz="6" w:space="0" w:color="666666"/>
+                    <w:left w:val="none" w:sz="0" w:space="0" w:color="000000"/>
+                    <w:right w:val="none" w:sz="0" w:space="0" w:color="000000"/>
+                  </w:tcBorders>
+                  <w:shd w:val="clear" w:color="auto" w:fill="FFFFFF"/>
+                  <w:tcMar>
+                    <w:top w:w="0" w:type="dxa"/>
+                    <w:bottom w:w="0" w:type="dxa"/>
+                    <w:left w:w="0" w:type="dxa"/>
+                    <w:right w:w="0" w:type="dxa"/>
+                  </w:tcMar>
+                  <w:vAlign w:val="top"/>
                 </w:tcPr>
                 <w:p>
                   <w:pPr>
@@ -17426,24 +17332,25 @@
             </w:tr>
             <w:tr>
               <w:trPr>
-                <w:trHeight w:val="360" w:hRule="auto"/>
+                <w:trHeight w:val="431" w:hRule="auto"/>
               </w:trPr>
               <w:tc>
                 <w:tcPr>
-                  <w:tcBorders>
-                    <w:bottom w:val="single" w:sz="6" w:space="0" w:color="666666"/>
-                    <w:top w:val="single" w:sz="6" w:space="0" w:color="666666"/>
-                    <w:left w:val="none" w:sz="0" w:space="0" w:color="000000"/>
-                    <w:right w:val="none" w:sz="0" w:space="0" w:color="000000"/>
-                  </w:tcBorders>
-                  <w:shd w:val="clear" w:color="auto" w:fill="FFFFFF"/>
-                  <w:tcMar>
-                    <w:top w:w="0" w:type="dxa"/>
-                    <w:bottom w:w="0" w:type="dxa"/>
-                    <w:left w:w="0" w:type="dxa"/>
-                    <w:right w:w="0" w:type="dxa"/>
-                  </w:tcMar>
-                  <w:vAlign w:val="center"/>
+                  <w:vMerge/>
+                  <w:tcBorders>
+                    <w:bottom w:val="single" w:sz="6" w:space="0" w:color="666666"/>
+                    <w:top w:val="single" w:sz="12" w:space="0" w:color="666666"/>
+                    <w:left w:val="none" w:sz="0" w:space="0" w:color="000000"/>
+                    <w:right w:val="none" w:sz="0" w:space="0" w:color="000000"/>
+                  </w:tcBorders>
+                  <w:shd w:val="clear" w:color="auto" w:fill="FFFFFF"/>
+                  <w:tcMar>
+                    <w:top w:w="0" w:type="dxa"/>
+                    <w:bottom w:w="0" w:type="dxa"/>
+                    <w:left w:w="0" w:type="dxa"/>
+                    <w:right w:w="0" w:type="dxa"/>
+                  </w:tcMar>
+                  <w:vAlign w:val="top"/>
                 </w:tcPr>
                 <w:p>
                   <w:pPr>
@@ -17467,19 +17374,6 @@
                       <w:color w:val="000000"/>
                     </w:rPr>
                   </w:pPr>
-                  <w:r xmlns:w="http://schemas.openxmlformats.org/wordprocessingml/2006/main" xmlns:wp="http://schemas.openxmlformats.org/drawingml/2006/wordprocessingDrawing" xmlns:r="http://schemas.openxmlformats.org/officeDocument/2006/relationships" xmlns:w14="http://schemas.microsoft.com/office/word/2010/wordml">
-                    <w:rPr>
-                      <w:rFonts w:ascii="Arial" w:hAnsi="Arial" w:eastAsia="Arial" w:cs="Arial"/>
-                      <w:i w:val="false"/>
-                      <w:b w:val="false"/>
-                      <w:u w:val="none"/>
-                      <w:strike w:val="false"/>
-                      <w:sz w:val="16"/>
-                      <w:szCs w:val="16"/>
-                      <w:color w:val="000000"/>
-                    </w:rPr>
-                    <w:t xml:space="preserve">Snakeden</w:t>
-                  </w:r>
                 </w:p>
               </w:tc>
               <w:tc>
@@ -17701,24 +17595,25 @@
             </w:tr>
             <w:tr>
               <w:trPr>
-                <w:trHeight w:val="360" w:hRule="auto"/>
+                <w:trHeight w:val="431" w:hRule="auto"/>
               </w:trPr>
               <w:tc>
                 <w:tcPr>
-                  <w:tcBorders>
-                    <w:bottom w:val="single" w:sz="6" w:space="0" w:color="666666"/>
-                    <w:top w:val="single" w:sz="6" w:space="0" w:color="666666"/>
-                    <w:left w:val="none" w:sz="0" w:space="0" w:color="000000"/>
-                    <w:right w:val="none" w:sz="0" w:space="0" w:color="000000"/>
-                  </w:tcBorders>
-                  <w:shd w:val="clear" w:color="auto" w:fill="FFFFFF"/>
-                  <w:tcMar>
-                    <w:top w:w="0" w:type="dxa"/>
-                    <w:bottom w:w="0" w:type="dxa"/>
-                    <w:left w:w="0" w:type="dxa"/>
-                    <w:right w:w="0" w:type="dxa"/>
-                  </w:tcMar>
-                  <w:vAlign w:val="center"/>
+                  <w:vMerge/>
+                  <w:tcBorders>
+                    <w:bottom w:val="single" w:sz="6" w:space="0" w:color="666666"/>
+                    <w:top w:val="single" w:sz="6" w:space="0" w:color="666666"/>
+                    <w:left w:val="none" w:sz="0" w:space="0" w:color="000000"/>
+                    <w:right w:val="none" w:sz="0" w:space="0" w:color="000000"/>
+                  </w:tcBorders>
+                  <w:shd w:val="clear" w:color="auto" w:fill="FFFFFF"/>
+                  <w:tcMar>
+                    <w:top w:w="0" w:type="dxa"/>
+                    <w:bottom w:w="0" w:type="dxa"/>
+                    <w:left w:w="0" w:type="dxa"/>
+                    <w:right w:w="0" w:type="dxa"/>
+                  </w:tcMar>
+                  <w:vAlign w:val="top"/>
                 </w:tcPr>
                 <w:p>
                   <w:pPr>
@@ -17742,19 +17637,6 @@
                       <w:color w:val="000000"/>
                     </w:rPr>
                   </w:pPr>
-                  <w:r xmlns:w="http://schemas.openxmlformats.org/wordprocessingml/2006/main" xmlns:wp="http://schemas.openxmlformats.org/drawingml/2006/wordprocessingDrawing" xmlns:r="http://schemas.openxmlformats.org/officeDocument/2006/relationships" xmlns:w14="http://schemas.microsoft.com/office/word/2010/wordml">
-                    <w:rPr>
-                      <w:rFonts w:ascii="Arial" w:hAnsi="Arial" w:eastAsia="Arial" w:cs="Arial"/>
-                      <w:i w:val="false"/>
-                      <w:b w:val="false"/>
-                      <w:u w:val="none"/>
-                      <w:strike w:val="false"/>
-                      <w:sz w:val="16"/>
-                      <w:szCs w:val="16"/>
-                      <w:color w:val="000000"/>
-                    </w:rPr>
-                    <w:t xml:space="preserve">Snakeden</w:t>
-                  </w:r>
                 </w:p>
               </w:tc>
               <w:tc>
@@ -17976,24 +17858,25 @@
             </w:tr>
             <w:tr>
               <w:trPr>
-                <w:trHeight w:val="360" w:hRule="auto"/>
+                <w:trHeight w:val="431" w:hRule="auto"/>
               </w:trPr>
               <w:tc>
                 <w:tcPr>
-                  <w:tcBorders>
-                    <w:bottom w:val="single" w:sz="6" w:space="0" w:color="666666"/>
-                    <w:top w:val="single" w:sz="6" w:space="0" w:color="666666"/>
-                    <w:left w:val="none" w:sz="0" w:space="0" w:color="000000"/>
-                    <w:right w:val="none" w:sz="0" w:space="0" w:color="000000"/>
-                  </w:tcBorders>
-                  <w:shd w:val="clear" w:color="auto" w:fill="FFFFFF"/>
-                  <w:tcMar>
-                    <w:top w:w="0" w:type="dxa"/>
-                    <w:bottom w:w="0" w:type="dxa"/>
-                    <w:left w:w="0" w:type="dxa"/>
-                    <w:right w:w="0" w:type="dxa"/>
-                  </w:tcMar>
-                  <w:vAlign w:val="center"/>
+                  <w:vMerge/>
+                  <w:tcBorders>
+                    <w:bottom w:val="single" w:sz="6" w:space="0" w:color="666666"/>
+                    <w:top w:val="single" w:sz="6" w:space="0" w:color="666666"/>
+                    <w:left w:val="none" w:sz="0" w:space="0" w:color="000000"/>
+                    <w:right w:val="none" w:sz="0" w:space="0" w:color="000000"/>
+                  </w:tcBorders>
+                  <w:shd w:val="clear" w:color="auto" w:fill="FFFFFF"/>
+                  <w:tcMar>
+                    <w:top w:w="0" w:type="dxa"/>
+                    <w:bottom w:w="0" w:type="dxa"/>
+                    <w:left w:w="0" w:type="dxa"/>
+                    <w:right w:w="0" w:type="dxa"/>
+                  </w:tcMar>
+                  <w:vAlign w:val="top"/>
                 </w:tcPr>
                 <w:p>
                   <w:pPr>
@@ -18017,19 +17900,6 @@
                       <w:color w:val="000000"/>
                     </w:rPr>
                   </w:pPr>
-                  <w:r xmlns:w="http://schemas.openxmlformats.org/wordprocessingml/2006/main" xmlns:wp="http://schemas.openxmlformats.org/drawingml/2006/wordprocessingDrawing" xmlns:r="http://schemas.openxmlformats.org/officeDocument/2006/relationships" xmlns:w14="http://schemas.microsoft.com/office/word/2010/wordml">
-                    <w:rPr>
-                      <w:rFonts w:ascii="Arial" w:hAnsi="Arial" w:eastAsia="Arial" w:cs="Arial"/>
-                      <w:i w:val="false"/>
-                      <w:b w:val="false"/>
-                      <w:u w:val="none"/>
-                      <w:strike w:val="false"/>
-                      <w:sz w:val="16"/>
-                      <w:szCs w:val="16"/>
-                      <w:color w:val="000000"/>
-                    </w:rPr>
-                    <w:t xml:space="preserve">Snakeden</w:t>
-                  </w:r>
                 </w:p>
               </w:tc>
               <w:tc>
@@ -18251,24 +18121,25 @@
             </w:tr>
             <w:tr>
               <w:trPr>
-                <w:trHeight w:val="360" w:hRule="auto"/>
+                <w:trHeight w:val="431" w:hRule="auto"/>
               </w:trPr>
               <w:tc>
                 <w:tcPr>
-                  <w:tcBorders>
-                    <w:bottom w:val="single" w:sz="6" w:space="0" w:color="666666"/>
-                    <w:top w:val="single" w:sz="6" w:space="0" w:color="666666"/>
-                    <w:left w:val="none" w:sz="0" w:space="0" w:color="000000"/>
-                    <w:right w:val="none" w:sz="0" w:space="0" w:color="000000"/>
-                  </w:tcBorders>
-                  <w:shd w:val="clear" w:color="auto" w:fill="FFFFFF"/>
-                  <w:tcMar>
-                    <w:top w:w="0" w:type="dxa"/>
-                    <w:bottom w:w="0" w:type="dxa"/>
-                    <w:left w:w="0" w:type="dxa"/>
-                    <w:right w:w="0" w:type="dxa"/>
-                  </w:tcMar>
-                  <w:vAlign w:val="center"/>
+                  <w:vMerge/>
+                  <w:tcBorders>
+                    <w:bottom w:val="single" w:sz="6" w:space="0" w:color="666666"/>
+                    <w:top w:val="single" w:sz="6" w:space="0" w:color="666666"/>
+                    <w:left w:val="none" w:sz="0" w:space="0" w:color="000000"/>
+                    <w:right w:val="none" w:sz="0" w:space="0" w:color="000000"/>
+                  </w:tcBorders>
+                  <w:shd w:val="clear" w:color="auto" w:fill="FFFFFF"/>
+                  <w:tcMar>
+                    <w:top w:w="0" w:type="dxa"/>
+                    <w:bottom w:w="0" w:type="dxa"/>
+                    <w:left w:w="0" w:type="dxa"/>
+                    <w:right w:w="0" w:type="dxa"/>
+                  </w:tcMar>
+                  <w:vAlign w:val="top"/>
                 </w:tcPr>
                 <w:p>
                   <w:pPr>
@@ -18292,19 +18163,6 @@
                       <w:color w:val="000000"/>
                     </w:rPr>
                   </w:pPr>
-                  <w:r xmlns:w="http://schemas.openxmlformats.org/wordprocessingml/2006/main" xmlns:wp="http://schemas.openxmlformats.org/drawingml/2006/wordprocessingDrawing" xmlns:r="http://schemas.openxmlformats.org/officeDocument/2006/relationships" xmlns:w14="http://schemas.microsoft.com/office/word/2010/wordml">
-                    <w:rPr>
-                      <w:rFonts w:ascii="Arial" w:hAnsi="Arial" w:eastAsia="Arial" w:cs="Arial"/>
-                      <w:i w:val="false"/>
-                      <w:b w:val="false"/>
-                      <w:u w:val="none"/>
-                      <w:strike w:val="false"/>
-                      <w:sz w:val="16"/>
-                      <w:szCs w:val="16"/>
-                      <w:color w:val="000000"/>
-                    </w:rPr>
-                    <w:t xml:space="preserve">Snakeden</w:t>
-                  </w:r>
                 </w:p>
               </w:tc>
               <w:tc>
@@ -18526,24 +18384,25 @@
             </w:tr>
             <w:tr>
               <w:trPr>
-                <w:trHeight w:val="360" w:hRule="auto"/>
+                <w:trHeight w:val="431" w:hRule="auto"/>
               </w:trPr>
               <w:tc>
                 <w:tcPr>
-                  <w:tcBorders>
-                    <w:bottom w:val="single" w:sz="6" w:space="0" w:color="666666"/>
-                    <w:top w:val="single" w:sz="6" w:space="0" w:color="666666"/>
-                    <w:left w:val="none" w:sz="0" w:space="0" w:color="000000"/>
-                    <w:right w:val="none" w:sz="0" w:space="0" w:color="000000"/>
-                  </w:tcBorders>
-                  <w:shd w:val="clear" w:color="auto" w:fill="FFFFFF"/>
-                  <w:tcMar>
-                    <w:top w:w="0" w:type="dxa"/>
-                    <w:bottom w:w="0" w:type="dxa"/>
-                    <w:left w:w="0" w:type="dxa"/>
-                    <w:right w:w="0" w:type="dxa"/>
-                  </w:tcMar>
-                  <w:vAlign w:val="center"/>
+                  <w:vMerge/>
+                  <w:tcBorders>
+                    <w:bottom w:val="single" w:sz="6" w:space="0" w:color="666666"/>
+                    <w:top w:val="single" w:sz="6" w:space="0" w:color="666666"/>
+                    <w:left w:val="none" w:sz="0" w:space="0" w:color="000000"/>
+                    <w:right w:val="none" w:sz="0" w:space="0" w:color="000000"/>
+                  </w:tcBorders>
+                  <w:shd w:val="clear" w:color="auto" w:fill="FFFFFF"/>
+                  <w:tcMar>
+                    <w:top w:w="0" w:type="dxa"/>
+                    <w:bottom w:w="0" w:type="dxa"/>
+                    <w:left w:w="0" w:type="dxa"/>
+                    <w:right w:w="0" w:type="dxa"/>
+                  </w:tcMar>
+                  <w:vAlign w:val="top"/>
                 </w:tcPr>
                 <w:p>
                   <w:pPr>
@@ -18567,19 +18426,6 @@
                       <w:color w:val="000000"/>
                     </w:rPr>
                   </w:pPr>
-                  <w:r xmlns:w="http://schemas.openxmlformats.org/wordprocessingml/2006/main" xmlns:wp="http://schemas.openxmlformats.org/drawingml/2006/wordprocessingDrawing" xmlns:r="http://schemas.openxmlformats.org/officeDocument/2006/relationships" xmlns:w14="http://schemas.microsoft.com/office/word/2010/wordml">
-                    <w:rPr>
-                      <w:rFonts w:ascii="Arial" w:hAnsi="Arial" w:eastAsia="Arial" w:cs="Arial"/>
-                      <w:i w:val="false"/>
-                      <w:b w:val="false"/>
-                      <w:u w:val="none"/>
-                      <w:strike w:val="false"/>
-                      <w:sz w:val="16"/>
-                      <w:szCs w:val="16"/>
-                      <w:color w:val="000000"/>
-                    </w:rPr>
-                    <w:t xml:space="preserve">Snakeden</w:t>
-                  </w:r>
                 </w:p>
               </w:tc>
               <w:tc>
@@ -18801,24 +18647,25 @@
             </w:tr>
             <w:tr>
               <w:trPr>
-                <w:trHeight w:val="360" w:hRule="auto"/>
+                <w:trHeight w:val="431" w:hRule="auto"/>
               </w:trPr>
               <w:tc>
                 <w:tcPr>
-                  <w:tcBorders>
-                    <w:bottom w:val="single" w:sz="6" w:space="0" w:color="666666"/>
-                    <w:top w:val="single" w:sz="6" w:space="0" w:color="666666"/>
-                    <w:left w:val="none" w:sz="0" w:space="0" w:color="000000"/>
-                    <w:right w:val="none" w:sz="0" w:space="0" w:color="000000"/>
-                  </w:tcBorders>
-                  <w:shd w:val="clear" w:color="auto" w:fill="FFFFFF"/>
-                  <w:tcMar>
-                    <w:top w:w="0" w:type="dxa"/>
-                    <w:bottom w:w="0" w:type="dxa"/>
-                    <w:left w:w="0" w:type="dxa"/>
-                    <w:right w:w="0" w:type="dxa"/>
-                  </w:tcMar>
-                  <w:vAlign w:val="center"/>
+                  <w:vMerge/>
+                  <w:tcBorders>
+                    <w:bottom w:val="single" w:sz="6" w:space="0" w:color="666666"/>
+                    <w:top w:val="single" w:sz="6" w:space="0" w:color="666666"/>
+                    <w:left w:val="none" w:sz="0" w:space="0" w:color="000000"/>
+                    <w:right w:val="none" w:sz="0" w:space="0" w:color="000000"/>
+                  </w:tcBorders>
+                  <w:shd w:val="clear" w:color="auto" w:fill="FFFFFF"/>
+                  <w:tcMar>
+                    <w:top w:w="0" w:type="dxa"/>
+                    <w:bottom w:w="0" w:type="dxa"/>
+                    <w:left w:w="0" w:type="dxa"/>
+                    <w:right w:w="0" w:type="dxa"/>
+                  </w:tcMar>
+                  <w:vAlign w:val="top"/>
                 </w:tcPr>
                 <w:p>
                   <w:pPr>
@@ -18842,19 +18689,6 @@
                       <w:color w:val="000000"/>
                     </w:rPr>
                   </w:pPr>
-                  <w:r xmlns:w="http://schemas.openxmlformats.org/wordprocessingml/2006/main" xmlns:wp="http://schemas.openxmlformats.org/drawingml/2006/wordprocessingDrawing" xmlns:r="http://schemas.openxmlformats.org/officeDocument/2006/relationships" xmlns:w14="http://schemas.microsoft.com/office/word/2010/wordml">
-                    <w:rPr>
-                      <w:rFonts w:ascii="Arial" w:hAnsi="Arial" w:eastAsia="Arial" w:cs="Arial"/>
-                      <w:i w:val="false"/>
-                      <w:b w:val="false"/>
-                      <w:u w:val="none"/>
-                      <w:strike w:val="false"/>
-                      <w:sz w:val="16"/>
-                      <w:szCs w:val="16"/>
-                      <w:color w:val="000000"/>
-                    </w:rPr>
-                    <w:t xml:space="preserve">Snakeden</w:t>
-                  </w:r>
                 </w:p>
               </w:tc>
               <w:tc>
@@ -19076,24 +18910,25 @@
             </w:tr>
             <w:tr>
               <w:trPr>
-                <w:trHeight w:val="360" w:hRule="auto"/>
+                <w:trHeight w:val="431" w:hRule="auto"/>
               </w:trPr>
               <w:tc>
                 <w:tcPr>
-                  <w:tcBorders>
-                    <w:bottom w:val="single" w:sz="6" w:space="0" w:color="666666"/>
-                    <w:top w:val="single" w:sz="6" w:space="0" w:color="666666"/>
-                    <w:left w:val="none" w:sz="0" w:space="0" w:color="000000"/>
-                    <w:right w:val="none" w:sz="0" w:space="0" w:color="000000"/>
-                  </w:tcBorders>
-                  <w:shd w:val="clear" w:color="auto" w:fill="FFFFFF"/>
-                  <w:tcMar>
-                    <w:top w:w="0" w:type="dxa"/>
-                    <w:bottom w:w="0" w:type="dxa"/>
-                    <w:left w:w="0" w:type="dxa"/>
-                    <w:right w:w="0" w:type="dxa"/>
-                  </w:tcMar>
-                  <w:vAlign w:val="center"/>
+                  <w:vMerge/>
+                  <w:tcBorders>
+                    <w:bottom w:val="single" w:sz="6" w:space="0" w:color="666666"/>
+                    <w:top w:val="single" w:sz="6" w:space="0" w:color="666666"/>
+                    <w:left w:val="none" w:sz="0" w:space="0" w:color="000000"/>
+                    <w:right w:val="none" w:sz="0" w:space="0" w:color="000000"/>
+                  </w:tcBorders>
+                  <w:shd w:val="clear" w:color="auto" w:fill="FFFFFF"/>
+                  <w:tcMar>
+                    <w:top w:w="0" w:type="dxa"/>
+                    <w:bottom w:w="0" w:type="dxa"/>
+                    <w:left w:w="0" w:type="dxa"/>
+                    <w:right w:w="0" w:type="dxa"/>
+                  </w:tcMar>
+                  <w:vAlign w:val="top"/>
                 </w:tcPr>
                 <w:p>
                   <w:pPr>
@@ -19117,19 +18952,6 @@
                       <w:color w:val="000000"/>
                     </w:rPr>
                   </w:pPr>
-                  <w:r xmlns:w="http://schemas.openxmlformats.org/wordprocessingml/2006/main" xmlns:wp="http://schemas.openxmlformats.org/drawingml/2006/wordprocessingDrawing" xmlns:r="http://schemas.openxmlformats.org/officeDocument/2006/relationships" xmlns:w14="http://schemas.microsoft.com/office/word/2010/wordml">
-                    <w:rPr>
-                      <w:rFonts w:ascii="Arial" w:hAnsi="Arial" w:eastAsia="Arial" w:cs="Arial"/>
-                      <w:i w:val="false"/>
-                      <w:b w:val="false"/>
-                      <w:u w:val="none"/>
-                      <w:strike w:val="false"/>
-                      <w:sz w:val="16"/>
-                      <w:szCs w:val="16"/>
-                      <w:color w:val="000000"/>
-                    </w:rPr>
-                    <w:t xml:space="preserve">Snakeden</w:t>
-                  </w:r>
                 </w:p>
               </w:tc>
               <w:tc>
@@ -19351,10 +19173,11 @@
             </w:tr>
             <w:tr>
               <w:trPr>
-                <w:trHeight w:val="360" w:hRule="auto"/>
+                <w:trHeight w:val="438" w:hRule="auto"/>
               </w:trPr>
               <w:tc>
                 <w:tcPr>
+                  <w:vMerge/>
                   <w:tcBorders>
                     <w:bottom w:val="single" w:sz="12" w:space="0" w:color="666666"/>
                     <w:top w:val="single" w:sz="6" w:space="0" w:color="666666"/>
@@ -19368,7 +19191,7 @@
                     <w:left w:w="0" w:type="dxa"/>
                     <w:right w:w="0" w:type="dxa"/>
                   </w:tcMar>
-                  <w:vAlign w:val="center"/>
+                  <w:vAlign w:val="top"/>
                 </w:tcPr>
                 <w:p>
                   <w:pPr>
@@ -19392,19 +19215,6 @@
                       <w:color w:val="000000"/>
                     </w:rPr>
                   </w:pPr>
-                  <w:r xmlns:w="http://schemas.openxmlformats.org/wordprocessingml/2006/main" xmlns:wp="http://schemas.openxmlformats.org/drawingml/2006/wordprocessingDrawing" xmlns:r="http://schemas.openxmlformats.org/officeDocument/2006/relationships" xmlns:w14="http://schemas.microsoft.com/office/word/2010/wordml">
-                    <w:rPr>
-                      <w:rFonts w:ascii="Arial" w:hAnsi="Arial" w:eastAsia="Arial" w:cs="Arial"/>
-                      <w:i w:val="false"/>
-                      <w:b w:val="false"/>
-                      <w:u w:val="none"/>
-                      <w:strike w:val="false"/>
-                      <w:sz w:val="16"/>
-                      <w:szCs w:val="16"/>
-                      <w:color w:val="000000"/>
-                    </w:rPr>
-                    <w:t xml:space="preserve">Snakeden</w:t>
-                  </w:r>
                 </w:p>
               </w:tc>
               <w:tc>

</xml_diff>

<commit_message>
doc: initial readthrough corrections
</commit_message>
<xml_diff>
--- a/doc/Report/reston_mark_recapture_methods_results_v0.1.docx
+++ b/doc/Report/reston_mark_recapture_methods_results_v0.1.docx
@@ -55,7 +55,7 @@
         <w:t xml:space="preserve"> </w:t>
       </w:r>
       <w:r>
-        <w:t xml:space="preserve">We released 1224 at Glade Run (38.93031, -77.34245) on July 26, 2023, and 698 at Snakeden Run (38.9238, -77.33168) on July 27.</w:t>
+        <w:t xml:space="preserve">We released 1224 mussels at Glade Run (38.93031, -77.34245) on July 26, 2023, and 698 mussels at Snakeden Run (38.9238, -77.33168) on July 27.</w:t>
       </w:r>
       <w:r>
         <w:t xml:space="preserve"> </w:t>
@@ -67,7 +67,18 @@
         <w:t xml:space="preserve"> </w:t>
       </w:r>
       <w:r>
-        <w:t xml:space="preserve">The entire area of each site was later sampled via snorkeling a total of eight times from July 2023 to September 2024.</w:t>
+        <w:t xml:space="preserve">The entire area of each site was later sampled a total of eight times from July 2023 to September 2024 (</w:t>
+      </w:r>
+      <w:hyperlink w:anchor="tbl-occasions">
+        <w:r>
+          <w:rPr>
+            <w:rStyle w:val="Hyperlink"/>
+          </w:rPr>
+          <w:t xml:space="preserve">Table 1</w:t>
+        </w:r>
+      </w:hyperlink>
+      <w:r>
+        <w:t xml:space="preserve">) via a combination of mask and snorkel searches, view scopes, visual inspection of shallow areas, and manual substrate searches.</w:t>
       </w:r>
       <w:r>
         <w:t xml:space="preserve"> </w:t>
@@ -144,35 +155,16 @@
         <w:t xml:space="preserve">Because we also found a high proportion of dead mussels during sampling, we used Burnham’s joint recovery model which incorporates both live encounters and dead recoveries (</w:t>
       </w:r>
       <w:r>
-        <w:t xml:space="preserve">(</w:t>
-      </w:r>
-      <w:r>
-        <w:rPr>
-          <w:b/>
-          <w:bCs/>
-        </w:rPr>
-        <w:t xml:space="preserve">BURNHAM?</w:t>
-      </w:r>
-      <w:r>
-        <w:t xml:space="preserve">)</w:t>
+        <w:t xml:space="preserve">Burnham (1993)</w:t>
+      </w:r>
+      <w:r>
+        <w:t xml:space="preserve">) to analyze our mark-recapture data.</w:t>
       </w:r>
       <w:r>
         <w:t xml:space="preserve"> </w:t>
       </w:r>
       <w:r>
-        <w:t xml:space="preserve">1993) to analyze our mark-recapture data.</w:t>
-      </w:r>
-      <w:r>
-        <w:t xml:space="preserve"> </w:t>
-      </w:r>
-      <w:r>
-        <w:t xml:space="preserve">The Burnham model is an open population model that allows for the estimation of both apparent survival and population size.</w:t>
-      </w:r>
-      <w:r>
-        <w:t xml:space="preserve"> </w:t>
-      </w:r>
-      <w:r>
-        <w:t xml:space="preserve">It has four model parameters that are directly estimated:</w:t>
+        <w:t xml:space="preserve">The Burnham model is an open population model that allows for the estimation of four model parameters:</w:t>
       </w:r>
     </w:p>
     <w:p>
@@ -392,7 +384,7 @@
         <w:t xml:space="preserve"> </w:t>
       </w:r>
       <w:r>
-        <w:t xml:space="preserve">A set of candidate models were developed under the Burnham model for estimating.</w:t>
+        <w:t xml:space="preserve">A set of candidate models were developed under the Burnham joint framework for comparison.</w:t>
       </w:r>
       <w:r>
         <w:t xml:space="preserve"> </w:t>
@@ -447,20 +439,38 @@
         <w:t xml:space="preserve">varied between each sampling occasion (</w:t>
       </w:r>
       <m:oMath>
-        <m:r>
-          <m:t>t</m:t>
-        </m:r>
+        <m:sSub>
+          <m:e>
+            <m:r>
+              <m:t>S</m:t>
+            </m:r>
+          </m:e>
+          <m:sub>
+            <m:r>
+              <m:t>t</m:t>
+            </m:r>
+          </m:sub>
+        </m:sSub>
       </m:oMath>
       <w:r>
         <w:t xml:space="preserve">), was constant between all occasions(</w:t>
       </w:r>
       <m:oMath>
-        <m:r>
-          <m:rPr>
-            <m:sty m:val="p"/>
-          </m:rPr>
-          <m:t>.</m:t>
-        </m:r>
+        <m:sSub>
+          <m:e>
+            <m:r>
+              <m:t>S</m:t>
+            </m:r>
+          </m:e>
+          <m:sub>
+            <m:r>
+              <m:rPr>
+                <m:sty m:val="p"/>
+              </m:rPr>
+              <m:t>.</m:t>
+            </m:r>
+          </m:sub>
+        </m:sSub>
       </m:oMath>
       <w:r>
         <w:t xml:space="preserve">), or was constant between occasions for the same year but varied between years (</w:t>
@@ -503,20 +513,38 @@
         <w:t xml:space="preserve">was constant over all occasions(</w:t>
       </w:r>
       <m:oMath>
-        <m:r>
-          <m:rPr>
-            <m:sty m:val="p"/>
-          </m:rPr>
-          <m:t>.</m:t>
-        </m:r>
+        <m:sSub>
+          <m:e>
+            <m:r>
+              <m:t>p</m:t>
+            </m:r>
+          </m:e>
+          <m:sub>
+            <m:r>
+              <m:rPr>
+                <m:sty m:val="p"/>
+              </m:rPr>
+              <m:t>.</m:t>
+            </m:r>
+          </m:sub>
+        </m:sSub>
       </m:oMath>
       <w:r>
         <w:t xml:space="preserve">) or was constant between occasions for the same year but varied between years (</w:t>
       </w:r>
       <m:oMath>
-        <m:r>
-          <m:t>y</m:t>
-        </m:r>
+        <m:sSub>
+          <m:e>
+            <m:r>
+              <m:t>p</m:t>
+            </m:r>
+          </m:e>
+          <m:sub>
+            <m:r>
+              <m:t>y</m:t>
+            </m:r>
+          </m:sub>
+        </m:sSub>
         <m:r>
           <m:t>e</m:t>
         </m:r>
@@ -551,20 +579,38 @@
         <w:t xml:space="preserve">was constant over all occasions(</w:t>
       </w:r>
       <m:oMath>
-        <m:r>
-          <m:rPr>
-            <m:sty m:val="p"/>
-          </m:rPr>
-          <m:t>.</m:t>
-        </m:r>
+        <m:sSub>
+          <m:e>
+            <m:r>
+              <m:t>r</m:t>
+            </m:r>
+          </m:e>
+          <m:sub>
+            <m:r>
+              <m:rPr>
+                <m:sty m:val="p"/>
+              </m:rPr>
+              <m:t>.</m:t>
+            </m:r>
+          </m:sub>
+        </m:sSub>
       </m:oMath>
       <w:r>
         <w:t xml:space="preserve">) or was constant between occasions for the same year but varied between years (</w:t>
       </w:r>
       <m:oMath>
-        <m:r>
-          <m:t>y</m:t>
-        </m:r>
+        <m:sSub>
+          <m:e>
+            <m:r>
+              <m:t>r</m:t>
+            </m:r>
+          </m:e>
+          <m:sub>
+            <m:r>
+              <m:t>y</m:t>
+            </m:r>
+          </m:sub>
+        </m:sSub>
         <m:r>
           <m:t>e</m:t>
         </m:r>
@@ -933,31 +979,13 @@
         <w:pStyle w:val="BodyText"/>
       </w:pPr>
       <w:r>
-        <w:t xml:space="preserve">Because time intervals between occasions varied, we standardized survival estimates assuming a 30 day period (i.e., monthly survival), in addition to the survival estimates over each interval (interval survival).</w:t>
+        <w:t xml:space="preserve">Because time intervals between occasions varied, we standardized survival estimates assuming a 30 day period (i.e., monthly survival), in addition to the survival estimates over each interval between occasions (interval survival).</w:t>
       </w:r>
       <w:r>
         <w:t xml:space="preserve"> </w:t>
       </w:r>
       <w:r>
-        <w:t xml:space="preserve">Finally, we calculated the expected abundance using interval survival estimates for the selected model of each site.</w:t>
-      </w:r>
-      <w:r>
-        <w:t xml:space="preserve"> </w:t>
-      </w:r>
-      <w:r>
-        <w:t xml:space="preserve">The Burnham model does not directly calculate abundance as either a real or derived parameter.</w:t>
-      </w:r>
-      <w:r>
-        <w:t xml:space="preserve"> </w:t>
-      </w:r>
-      <w:r>
-        <w:t xml:space="preserve">For this study, we were tracking a single release cohort over time.</w:t>
-      </w:r>
-      <w:r>
-        <w:t xml:space="preserve"> </w:t>
-      </w:r>
-      <w:r>
-        <w:t xml:space="preserve">Consequently we calculated the expected abundance using survival estimates from the selected model of each site.</w:t>
+        <w:t xml:space="preserve">Finally, we calculated the expected abundance on each occasion using interval survival estimates for the selected model of each site and the initial size of the release cohort.</w:t>
       </w:r>
     </w:p>
     <w:bookmarkEnd w:id="22"/>
@@ -1724,19 +1752,19 @@
         <w:pStyle w:val="BodyText"/>
       </w:pPr>
       <w:r>
-        <w:t xml:space="preserve">Abundance estimates seem to match naive estimates of abundance based on raw number of mussels observed alive at each occasion.</w:t>
+        <w:t xml:space="preserve">Mark-recapture abundance estimates seem to match naive estimates of abundance based on the raw number of mussels observed alive at each occasion.</w:t>
       </w:r>
       <w:r>
         <w:t xml:space="preserve"> </w:t>
       </w:r>
       <w:r>
-        <w:t xml:space="preserve">On the last sampling occasion, we observed 258 and 43 live mussels at Glade Run and Snakeden Run, respectivley.</w:t>
+        <w:t xml:space="preserve">On the last sampling occasion, we observed 258 and 43 live mussels at Glade Run and Snakeden Run, respectively.</w:t>
       </w:r>
       <w:r>
         <w:t xml:space="preserve"> </w:t>
       </w:r>
       <w:r>
-        <w:t xml:space="preserve">Assuming that survival estimates from the Burnham model are true, this would suggest that we observed approximatly 43.7288136 % of mussels at Glade Run and 38.7387387 % of mussels at Snakeden Run on the final sampling occasion.</w:t>
+        <w:t xml:space="preserve">Assuming that survival estimates from the Burnham model are true, this would suggest that we observed approximately 43.7288136% of mussels at Glade Run and 38.7387387% of mussels at Snakeden Run on the final sampling occasion.</w:t>
       </w:r>
       <w:r>
         <w:t xml:space="preserve"> </w:t>
@@ -1772,7 +1800,23 @@
         <w:t xml:space="preserve"> </w:t>
       </w:r>
       <w:r>
-        <w:t xml:space="preserve">This is not surprising since the mark-recapture estimates account for the probabilities of both detecting a live mussel and recovering a dead mussel, in addition to survival.</w:t>
+        <w:t xml:space="preserve">This is not surprising since the mark-recapture estimates account for the probabilities of both detecting a live mussel (</w:t>
+      </w:r>
+      <m:oMath>
+        <m:r>
+          <m:t>p</m:t>
+        </m:r>
+      </m:oMath>
+      <w:r>
+        <w:t xml:space="preserve">) and recovering a dead mussel (</w:t>
+      </w:r>
+      <m:oMath>
+        <m:r>
+          <m:t>r</m:t>
+        </m:r>
+      </m:oMath>
+      <w:r>
+        <w:t xml:space="preserve">), in addition to survival.</w:t>
       </w:r>
       <w:r>
         <w:t xml:space="preserve"> </w:t>
@@ -1790,7 +1834,7 @@
         <w:t xml:space="preserve"> </w:t>
       </w:r>
       <w:r>
-        <w:t xml:space="preserve">Individuals with lost tags are modeled as if they were not seen again, which can have the effect of underestiamting survival (</w:t>
+        <w:t xml:space="preserve">Individuals with lost tags are modeled as if they were not seen again, which can have the effect of underestimating survival (</w:t>
       </w:r>
       <w:r>
         <w:rPr>
@@ -1806,17 +1850,7 @@
         <w:t xml:space="preserve"> </w:t>
       </w:r>
       <w:r>
-        <w:rPr>
-          <w:b/>
-          <w:bCs/>
-        </w:rPr>
-        <w:t xml:space="preserve">Note: Next sentence is trying to tie this back to the naive abundance/detectability estimate from prior aragraph. I.e., it reinforces that the report and mark-recapture estaimtes are in reasonable agreement. Need to think about how to do this more clearly though</w:t>
-      </w:r>
-      <w:r>
-        <w:t xml:space="preserve"> </w:t>
-      </w:r>
-      <w:r>
-        <w:t xml:space="preserve">If true survival is higher than we estimated, then the abundance estimate on the last occasion would be correspondingly higher, and the detectability would be lower and more in line with typical detectability of freshwater mussels.</w:t>
+        <w:t xml:space="preserve">If our survival estimates are negatively biased, the true abundance on the last occasion would be correspondingly higher and detectability on the last occasion would be more in line with typical detectability of freshwater mussels.</w:t>
       </w:r>
     </w:p>
     <w:bookmarkEnd w:id="25"/>
@@ -2029,7 +2063,7 @@
               <w:pStyle w:val="ImageCaption"/>
             </w:pPr>
             <w:r>
-              <w:t xml:space="preserve">Table 1: Abundance estimates from the selected POPAN model. Each row (i.e., species) represents results from a single analysis/model.</w:t>
+              <w:t xml:space="preserve">Table 1: Sampling dates for mark-recapture surveys.</w:t>
             </w:r>
           </w:p>
           <w:tbl xmlns:w="http://schemas.openxmlformats.org/wordprocessingml/2006/main" xmlns:r="http://schemas.openxmlformats.org/officeDocument/2006/relationships" xmlns:w14="http://schemas.microsoft.com/office/word/2010/wordml" xmlns:wp="http://schemas.openxmlformats.org/drawingml/2006/wordprocessingDrawing" xmlns:a="http://schemas.openxmlformats.org/drawingml/2006/main" xmlns:pic="http://schemas.openxmlformats.org/drawingml/2006/picture">
@@ -5056,7 +5090,7 @@
               <w:pStyle w:val="ImageCaption"/>
             </w:pPr>
             <w:r>
-              <w:t xml:space="preserve">Table 2: Abundance estimates from the selected POPAN model. Each row (i.e., species) represents results from a single analysis/model.</w:t>
+              <w:t xml:space="preserve">Table 2: Survival for intervals between sampling occasions as estimated from the selected Burnham joint model.</w:t>
             </w:r>
           </w:p>
           <w:tbl xmlns:w="http://schemas.openxmlformats.org/wordprocessingml/2006/main" xmlns:r="http://schemas.openxmlformats.org/officeDocument/2006/relationships" xmlns:w14="http://schemas.microsoft.com/office/word/2010/wordml" xmlns:wp="http://schemas.openxmlformats.org/drawingml/2006/wordprocessingDrawing" xmlns:a="http://schemas.openxmlformats.org/drawingml/2006/main" xmlns:pic="http://schemas.openxmlformats.org/drawingml/2006/picture">
@@ -14382,7 +14416,7 @@
               <w:pStyle w:val="ImageCaption"/>
             </w:pPr>
             <w:r>
-              <w:t xml:space="preserve">Table 3: Abundance estimates of all individuals from the initial release (uniquely tagged, non-uniquely tagged, and untagged). Based on apparent survival estimates from the selected POPAN model and initial number of mussels released. Each row (i.e., species) represents results from a single analysis/model.</w:t>
+              <w:t xml:space="preserve">Table 3: Abundance estimates of the initial release cohort on each sampling occasion. Based on interval survival estimates from the selected Burnham joint model and initial number of mussels released.</w:t>
             </w:r>
           </w:p>
           <w:tbl xmlns:w="http://schemas.openxmlformats.org/wordprocessingml/2006/main" xmlns:r="http://schemas.openxmlformats.org/officeDocument/2006/relationships" xmlns:w14="http://schemas.microsoft.com/office/word/2010/wordml" xmlns:wp="http://schemas.openxmlformats.org/drawingml/2006/wordprocessingDrawing" xmlns:a="http://schemas.openxmlformats.org/drawingml/2006/main" xmlns:pic="http://schemas.openxmlformats.org/drawingml/2006/picture">
@@ -19445,7 +19479,7 @@
       </w:r>
     </w:p>
     <w:bookmarkEnd w:id="38"/>
-    <w:bookmarkStart w:id="44" w:name="references"/>
+    <w:bookmarkStart w:id="45" w:name="references"/>
     <w:p>
       <w:pPr>
         <w:pStyle w:val="Heading1"/>
@@ -19454,7 +19488,7 @@
         <w:t xml:space="preserve">6. References</w:t>
       </w:r>
     </w:p>
-    <w:bookmarkStart w:id="43" w:name="refs"/>
+    <w:bookmarkStart w:id="44" w:name="refs"/>
     <w:bookmarkStart w:id="39" w:name="X437bd82681b6244afc723f1058a320799156d9d"/>
     <w:p>
       <w:pPr>
@@ -19529,7 +19563,42 @@
       </w:r>
     </w:p>
     <w:bookmarkEnd w:id="39"/>
-    <w:bookmarkStart w:id="40" w:name="X3d765049c0b9d139b2bf4c37083a4031b8ade27"/>
+    <w:bookmarkStart w:id="40" w:name="ref-burnham_1993_TheoryCombinedAnalysis"/>
+    <w:p>
+      <w:pPr>
+        <w:pStyle w:val="Bibliography"/>
+      </w:pPr>
+      <w:r>
+        <w:t xml:space="preserve">Burnham, Kenneth P. 1993.</w:t>
+      </w:r>
+      <w:r>
+        <w:t xml:space="preserve"> </w:t>
+      </w:r>
+      <w:r>
+        <w:t xml:space="preserve">“A Theory for Combined Analysis of Ring Recovery and Recapture Data.”</w:t>
+      </w:r>
+      <w:r>
+        <w:t xml:space="preserve"> </w:t>
+      </w:r>
+      <w:r>
+        <w:t xml:space="preserve">In</w:t>
+      </w:r>
+      <w:r>
+        <w:t xml:space="preserve"> </w:t>
+      </w:r>
+      <w:r>
+        <w:rPr>
+          <w:i/>
+          <w:iCs/>
+        </w:rPr>
+        <w:t xml:space="preserve">Marked Individuals in the Study of Bird Population</w:t>
+      </w:r>
+      <w:r>
+        <w:t xml:space="preserve">, edited by Jean-Dominique Lebreton and P M North, 199–213. Basel, Switzerland: Birkhäuser Verlag.</w:t>
+      </w:r>
+    </w:p>
+    <w:bookmarkEnd w:id="40"/>
+    <w:bookmarkStart w:id="41" w:name="X3d765049c0b9d139b2bf4c37083a4031b8ade27"/>
     <w:p>
       <w:pPr>
         <w:pStyle w:val="Bibliography"/>
@@ -19614,8 +19683,8 @@
         <w:t xml:space="preserve">. 2nd ed. New York: Springer-Verlag.</w:t>
       </w:r>
     </w:p>
-    <w:bookmarkEnd w:id="40"/>
-    <w:bookmarkStart w:id="41" w:name="ref-sugiura_1978_FurtherAnalysisData"/>
+    <w:bookmarkEnd w:id="41"/>
+    <w:bookmarkStart w:id="42" w:name="ref-sugiura_1978_FurtherAnalysisData"/>
     <w:p>
       <w:pPr>
         <w:pStyle w:val="Bibliography"/>
@@ -19664,8 +19733,8 @@
         <w:t xml:space="preserve">7 (1): 13–26.</w:t>
       </w:r>
     </w:p>
-    <w:bookmarkEnd w:id="41"/>
-    <w:bookmarkStart w:id="42" w:name="Xe040a3ee9170c3970aba188ecc23934f91c03aa"/>
+    <w:bookmarkEnd w:id="42"/>
+    <w:bookmarkStart w:id="43" w:name="Xe040a3ee9170c3970aba188ecc23934f91c03aa"/>
     <w:p>
       <w:pPr>
         <w:pStyle w:val="Bibliography"/>
@@ -19705,9 +19774,9 @@
         <w:t xml:space="preserve">46 (S1): S120–39.</w:t>
       </w:r>
     </w:p>
-    <w:bookmarkEnd w:id="42"/>
     <w:bookmarkEnd w:id="43"/>
     <w:bookmarkEnd w:id="44"/>
+    <w:bookmarkEnd w:id="45"/>
     <w:sectPr>
       <w:pgSz w:h="15840" w:w="12240"/>
       <w:pgMar w:bottom="1440" w:footer="720" w:gutter="0" w:header="720" w:left="1440" w:right="1440" w:top="1440"/>

</xml_diff>

<commit_message>
doc: round report values
</commit_message>
<xml_diff>
--- a/doc/Report/reston_mark_recapture_methods_results_v0.1.docx
+++ b/doc/Report/reston_mark_recapture_methods_results_v0.1.docx
@@ -1764,7 +1764,7 @@
         <w:t xml:space="preserve"> </w:t>
       </w:r>
       <w:r>
-        <w:t xml:space="preserve">Assuming that survival estimates from the Burnham model are true, this would suggest that we observed approximately 43.7288136% of mussels at Glade Run and 38.7387387% of mussels at Snakeden Run on the final sampling occasion.</w:t>
+        <w:t xml:space="preserve">Assuming that survival estimates from the Burnham model are true, this would suggest that we observed approximately 44% of mussels at Glade Run and 39% of mussels at Snakeden Run on the final sampling occasion.</w:t>
       </w:r>
       <w:r>
         <w:t xml:space="preserve"> </w:t>
@@ -1794,7 +1794,7 @@
         <w:t xml:space="preserve"> </w:t>
       </w:r>
       <w:r>
-        <w:t xml:space="preserve">This is higher than the estimates from the mark-recapture analysis (Snakeden: 7.0342205% and Glade: 48.2026144%).</w:t>
+        <w:t xml:space="preserve">This is higher than the estimates from the mark-recapture analysis (Snakeden: 7% and Glade: 48%).</w:t>
       </w:r>
       <w:r>
         <w:t xml:space="preserve"> </w:t>
@@ -1828,7 +1828,7 @@
         <w:t xml:space="preserve"> </w:t>
       </w:r>
       <w:r>
-        <w:t xml:space="preserve">Of the mussels observed either alive or dead at least once, 5.3008596% were untagged at Snakeden Run and 5.2808989% at Glade Run, suggesting at least some tag loss.</w:t>
+        <w:t xml:space="preserve">Of the mussels observed either alive or dead at least once, 5.3% were untagged at Snakeden Run and 5.3% at Glade Run, suggesting at least some tag loss.</w:t>
       </w:r>
       <w:r>
         <w:t xml:space="preserve"> </w:t>

</xml_diff>

<commit_message>
doc: add detectability references to report
</commit_message>
<xml_diff>
--- a/doc/Report/reston_mark_recapture_methods_results_v0.1.docx
+++ b/doc/Report/reston_mark_recapture_methods_results_v0.1.docx
@@ -1844,17 +1844,107 @@
         <w:t xml:space="preserve"> </w:t>
       </w:r>
       <w:r>
-        <w:t xml:space="preserve">This level of detectability is somewhat higher than is typical but still within a reasonable range for freshwater mussels (</w:t>
+        <w:t xml:space="preserve">However, model estimates of capture probability from our selected models were lower, especially at Snakeden Run (~14% at Snakeden Run and 18-36% at Glade Run).</w:t>
+      </w:r>
+      <w:r>
+        <w:t xml:space="preserve"> </w:t>
+      </w:r>
+      <w:r>
+        <w:t xml:space="preserve">Capture probabilities for freshwater mussels are typically more similar to our model estimates (</w:t>
+      </w:r>
+      <w:r>
+        <w:t xml:space="preserve">Villella, Smith, and Lemarié (2004)</w:t>
+      </w:r>
+      <w:r>
+        <w:t xml:space="preserve"> </w:t>
+      </w:r>
+      <w:r>
+        <w:t xml:space="preserve">and</w:t>
+      </w:r>
+      <w:r>
+        <w:t xml:space="preserve"> </w:t>
+      </w:r>
+      <w:r>
+        <w:t xml:space="preserve">Meador, Peterson, and Wisniewski (2011)</w:t>
+      </w:r>
+      <w:r>
+        <w:t xml:space="preserve">).</w:t>
+      </w:r>
+      <w:r>
+        <w:t xml:space="preserve"> </w:t>
+      </w:r>
+      <w:r>
+        <w:t xml:space="preserve">While, capture probabilities this high have been observed for freshwater mussels, these higher probabilities are usually observed during warmer months (</w:t>
+      </w:r>
+      <w:r>
+        <w:t xml:space="preserve">Matter, Borrero, and Fleece (2013)</w:t>
+      </w:r>
+      <w:r>
+        <w:t xml:space="preserve">,</w:t>
+      </w:r>
+      <w:r>
+        <w:t xml:space="preserve"> </w:t>
+      </w:r>
+      <w:r>
+        <w:t xml:space="preserve">Wisniewski et al. (2013)</w:t>
+      </w:r>
+      <w:r>
+        <w:t xml:space="preserve">, and</w:t>
+      </w:r>
+      <w:r>
+        <w:t xml:space="preserve"> </w:t>
+      </w:r>
+      <w:r>
+        <w:t xml:space="preserve">Carey et al. (2019)</w:t>
+      </w:r>
+      <w:r>
+        <w:t xml:space="preserve">).</w:t>
+      </w:r>
+      <w:r>
+        <w:t xml:space="preserve"> </w:t>
+      </w:r>
+      <w:r>
+        <w:t xml:space="preserve">Indeed,</w:t>
+      </w:r>
+      <w:r>
+        <w:t xml:space="preserve"> </w:t>
+      </w:r>
+      <w:r>
+        <w:t xml:space="preserve">Villella, Smith, and Lemarié (2004)</w:t>
+      </w:r>
+      <w:r>
+        <w:t xml:space="preserve"> </w:t>
+      </w:r>
+      <w:r>
+        <w:t xml:space="preserve">found that the highest capture probabilities for</w:t>
+      </w:r>
+      <w:r>
+        <w:t xml:space="preserve"> </w:t>
       </w:r>
       <w:r>
         <w:rPr>
-          <w:b/>
-          <w:bCs/>
+          <w:i/>
+          <w:iCs/>
         </w:rPr>
-        <w:t xml:space="preserve">Reference</w:t>
-      </w:r>
-      <w:r>
-        <w:t xml:space="preserve">).</w:t>
+        <w:t xml:space="preserve">E. complanata</w:t>
+      </w:r>
+      <w:r>
+        <w:t xml:space="preserve"> </w:t>
+      </w:r>
+      <w:r>
+        <w:t xml:space="preserve">occurred in July (12-18%) but was only 3% in October and January.</w:t>
+      </w:r>
+      <w:r>
+        <w:t xml:space="preserve"> </w:t>
+      </w:r>
+      <w:r>
+        <w:t xml:space="preserve">Given that model estimates of capture probability are typical of freshwater mussels, it is possible that survival estimates may be underestimated compared to true survival.</w:t>
+      </w:r>
+      <w:r>
+        <w:t xml:space="preserve"> </w:t>
+      </w:r>
+      <w:r>
+        <w:t xml:space="preserve">This would cause lower estimated abundance on the last occasion, resulting in the higher estimates of detectability based on abundance and number of live mussels observed on the last occasion.</w:t>
       </w:r>
     </w:p>
     <w:p>
@@ -1938,7 +2028,7 @@
         <w:t xml:space="preserve"> </w:t>
       </w:r>
       <w:r>
-        <w:t xml:space="preserve">If our survival estimates are negatively biased, the true abundance on the last occasion would be correspondingly higher and detectability on the last occasion would be more in line with typical detectability of freshwater mussels.</w:t>
+        <w:t xml:space="preserve">If our survival estimates are negatively biased, the true abundance on the last occasion would be correspondingly higher and capture probabilities on the last occasion would be more in line with typical capture probabilities of freshwater mussels.</w:t>
       </w:r>
     </w:p>
     <w:bookmarkEnd w:id="25"/>
@@ -19567,7 +19657,7 @@
       </w:r>
     </w:p>
     <w:bookmarkEnd w:id="38"/>
-    <w:bookmarkStart w:id="51" w:name="references"/>
+    <w:bookmarkStart w:id="61" w:name="references"/>
     <w:p>
       <w:pPr>
         <w:pStyle w:val="Heading1"/>
@@ -19576,7 +19666,7 @@
         <w:t xml:space="preserve">6. References</w:t>
       </w:r>
     </w:p>
-    <w:bookmarkStart w:id="50" w:name="refs"/>
+    <w:bookmarkStart w:id="60" w:name="refs"/>
     <w:bookmarkStart w:id="39" w:name="X437bd82681b6244afc723f1058a320799156d9d"/>
     <w:p>
       <w:pPr>
@@ -19772,7 +19862,98 @@
       </w:r>
     </w:p>
     <w:bookmarkEnd w:id="41"/>
-    <w:bookmarkStart w:id="43" w:name="X94b0a13f2133c462f2cb4b50072d82104e6a7f0"/>
+    <w:bookmarkStart w:id="43" w:name="X5430f6ff24fbdbd7cf10c479a162618f287e5db"/>
+    <w:p>
+      <w:pPr>
+        <w:pStyle w:val="Bibliography"/>
+      </w:pPr>
+      <w:r>
+        <w:t xml:space="preserve">Carey, Caitlin S., Jess W. Jones, Robert S. Butler, Marcella J. Kelly, and Eric M. Hallerman. 2019.</w:t>
+      </w:r>
+      <w:r>
+        <w:t xml:space="preserve"> </w:t>
+      </w:r>
+      <w:r>
+        <w:t xml:space="preserve">“A</w:t>
+      </w:r>
+      <w:r>
+        <w:t xml:space="preserve"> </w:t>
+      </w:r>
+      <w:r>
+        <w:t xml:space="preserve">Comparison</w:t>
+      </w:r>
+      <w:r>
+        <w:t xml:space="preserve"> </w:t>
+      </w:r>
+      <w:r>
+        <w:t xml:space="preserve">of</w:t>
+      </w:r>
+      <w:r>
+        <w:t xml:space="preserve"> </w:t>
+      </w:r>
+      <w:r>
+        <w:t xml:space="preserve">Systematic Quadrat</w:t>
+      </w:r>
+      <w:r>
+        <w:t xml:space="preserve"> </w:t>
+      </w:r>
+      <w:r>
+        <w:t xml:space="preserve">and</w:t>
+      </w:r>
+      <w:r>
+        <w:t xml:space="preserve"> </w:t>
+      </w:r>
+      <w:r>
+        <w:t xml:space="preserve">Capture-Mark-Recapture Sampling Designs</w:t>
+      </w:r>
+      <w:r>
+        <w:t xml:space="preserve"> </w:t>
+      </w:r>
+      <w:r>
+        <w:t xml:space="preserve">for</w:t>
+      </w:r>
+      <w:r>
+        <w:t xml:space="preserve"> </w:t>
+      </w:r>
+      <w:r>
+        <w:t xml:space="preserve">Assessing Freshwater Mussel Populations</w:t>
+      </w:r>
+      <w:r>
+        <w:t xml:space="preserve">.”</w:t>
+      </w:r>
+      <w:r>
+        <w:t xml:space="preserve"> </w:t>
+      </w:r>
+      <w:r>
+        <w:rPr>
+          <w:i/>
+          <w:iCs/>
+        </w:rPr>
+        <w:t xml:space="preserve">Diversity</w:t>
+      </w:r>
+      <w:r>
+        <w:t xml:space="preserve"> </w:t>
+      </w:r>
+      <w:r>
+        <w:t xml:space="preserve">11 (8): 127.</w:t>
+      </w:r>
+      <w:r>
+        <w:t xml:space="preserve"> </w:t>
+      </w:r>
+      <w:hyperlink r:id="rId42">
+        <w:r>
+          <w:rPr>
+            <w:rStyle w:val="Hyperlink"/>
+          </w:rPr>
+          <w:t xml:space="preserve">https://doi.org/10.3390/d11080127</w:t>
+        </w:r>
+      </w:hyperlink>
+      <w:r>
+        <w:t xml:space="preserve">.</w:t>
+      </w:r>
+    </w:p>
+    <w:bookmarkEnd w:id="43"/>
+    <w:bookmarkStart w:id="45" w:name="X94b0a13f2133c462f2cb4b50072d82104e6a7f0"/>
     <w:p>
       <w:pPr>
         <w:pStyle w:val="Bibliography"/>
@@ -19838,7 +20019,7 @@
       <w:r>
         <w:t xml:space="preserve"> </w:t>
       </w:r>
-      <w:hyperlink r:id="rId42">
+      <w:hyperlink r:id="rId44">
         <w:r>
           <w:rPr>
             <w:rStyle w:val="Hyperlink"/>
@@ -19850,8 +20031,145 @@
         <w:t xml:space="preserve">.</w:t>
       </w:r>
     </w:p>
-    <w:bookmarkEnd w:id="43"/>
-    <w:bookmarkStart w:id="45" w:name="ref-nelson.etal_1980_EffectBandLoss"/>
+    <w:bookmarkEnd w:id="45"/>
+    <w:bookmarkStart w:id="47" w:name="X3454e8ac675c33e8681afa3a514ceab6cacb8b5"/>
+    <w:p>
+      <w:pPr>
+        <w:pStyle w:val="Bibliography"/>
+      </w:pPr>
+      <w:r>
+        <w:t xml:space="preserve">Matter, Stephen F., Francisco Borrero, and Cody Fleece. 2013.</w:t>
+      </w:r>
+      <w:r>
+        <w:t xml:space="preserve"> </w:t>
+      </w:r>
+      <w:r>
+        <w:t xml:space="preserve">“Modeling the</w:t>
+      </w:r>
+      <w:r>
+        <w:t xml:space="preserve"> </w:t>
+      </w:r>
+      <w:r>
+        <w:t xml:space="preserve">Survival</w:t>
+      </w:r>
+      <w:r>
+        <w:t xml:space="preserve"> </w:t>
+      </w:r>
+      <w:r>
+        <w:t xml:space="preserve">and</w:t>
+      </w:r>
+      <w:r>
+        <w:t xml:space="preserve"> </w:t>
+      </w:r>
+      <w:r>
+        <w:t xml:space="preserve">Population Growth</w:t>
+      </w:r>
+      <w:r>
+        <w:t xml:space="preserve"> </w:t>
+      </w:r>
+      <w:r>
+        <w:t xml:space="preserve">of the</w:t>
+      </w:r>
+      <w:r>
+        <w:t xml:space="preserve"> </w:t>
+      </w:r>
+      <w:r>
+        <w:t xml:space="preserve">Freshwater Mussel</w:t>
+      </w:r>
+      <w:r>
+        <w:t xml:space="preserve">,</w:t>
+      </w:r>
+      <w:r>
+        <w:t xml:space="preserve"> </w:t>
+      </w:r>
+      <w:r>
+        <w:t xml:space="preserve">Lampsilis</w:t>
+      </w:r>
+      <w:r>
+        <w:t xml:space="preserve"> </w:t>
+      </w:r>
+      <w:r>
+        <w:t xml:space="preserve">Radiata Luteola.”</w:t>
+      </w:r>
+      <w:r>
+        <w:t xml:space="preserve"> </w:t>
+      </w:r>
+      <w:r>
+        <w:rPr>
+          <w:i/>
+          <w:iCs/>
+        </w:rPr>
+        <w:t xml:space="preserve">The American Midland Naturalist</w:t>
+      </w:r>
+      <w:r>
+        <w:t xml:space="preserve"> </w:t>
+      </w:r>
+      <w:r>
+        <w:t xml:space="preserve">169 (1): 122–36.</w:t>
+      </w:r>
+      <w:r>
+        <w:t xml:space="preserve"> </w:t>
+      </w:r>
+      <w:hyperlink r:id="rId46">
+        <w:r>
+          <w:rPr>
+            <w:rStyle w:val="Hyperlink"/>
+          </w:rPr>
+          <w:t xml:space="preserve">https://doi.org/10.1674/0003-0031-169.1.122</w:t>
+        </w:r>
+      </w:hyperlink>
+      <w:r>
+        <w:t xml:space="preserve">.</w:t>
+      </w:r>
+    </w:p>
+    <w:bookmarkEnd w:id="47"/>
+    <w:bookmarkStart w:id="49" w:name="Xe0303b5c306a8218b378fa611435df53058613f"/>
+    <w:p>
+      <w:pPr>
+        <w:pStyle w:val="Bibliography"/>
+      </w:pPr>
+      <w:r>
+        <w:t xml:space="preserve">Meador, Jason R, James T Peterson, and Jason M Wisniewski. 2011.</w:t>
+      </w:r>
+      <w:r>
+        <w:t xml:space="preserve"> </w:t>
+      </w:r>
+      <w:r>
+        <w:t xml:space="preserve">“An Evaluation of the Factors Influencing Freshwater Mussel Capture Probability, Survival, and Temporary Emigration in a Large Lowland River.”</w:t>
+      </w:r>
+      <w:r>
+        <w:t xml:space="preserve"> </w:t>
+      </w:r>
+      <w:r>
+        <w:rPr>
+          <w:i/>
+          <w:iCs/>
+        </w:rPr>
+        <w:t xml:space="preserve">Journal of the North American Benthological Society</w:t>
+      </w:r>
+      <w:r>
+        <w:t xml:space="preserve"> </w:t>
+      </w:r>
+      <w:r>
+        <w:t xml:space="preserve">30 (2): 507–21.</w:t>
+      </w:r>
+      <w:r>
+        <w:t xml:space="preserve"> </w:t>
+      </w:r>
+      <w:hyperlink r:id="rId48">
+        <w:r>
+          <w:rPr>
+            <w:rStyle w:val="Hyperlink"/>
+          </w:rPr>
+          <w:t xml:space="preserve">https://doi.org/10.1899/10-105.1</w:t>
+        </w:r>
+      </w:hyperlink>
+      <w:r>
+        <w:t xml:space="preserve">.</w:t>
+      </w:r>
+    </w:p>
+    <w:bookmarkEnd w:id="49"/>
+    <w:bookmarkStart w:id="51" w:name="ref-nelson.etal_1980_EffectBandLoss"/>
     <w:p>
       <w:pPr>
         <w:pStyle w:val="Bibliography"/>
@@ -19929,7 +20247,7 @@
       <w:r>
         <w:t xml:space="preserve"> </w:t>
       </w:r>
-      <w:hyperlink r:id="rId44">
+      <w:hyperlink r:id="rId50">
         <w:r>
           <w:rPr>
             <w:rStyle w:val="Hyperlink"/>
@@ -19941,8 +20259,8 @@
         <w:t xml:space="preserve">.</w:t>
       </w:r>
     </w:p>
-    <w:bookmarkEnd w:id="45"/>
-    <w:bookmarkStart w:id="46" w:name="ref-sugiura_1978_FurtherAnalysisData"/>
+    <w:bookmarkEnd w:id="51"/>
+    <w:bookmarkStart w:id="52" w:name="ref-sugiura_1978_FurtherAnalysisData"/>
     <w:p>
       <w:pPr>
         <w:pStyle w:val="Bibliography"/>
@@ -19991,8 +20309,8 @@
         <w:t xml:space="preserve">7 (1): 13–26.</w:t>
       </w:r>
     </w:p>
-    <w:bookmarkEnd w:id="46"/>
-    <w:bookmarkStart w:id="48" w:name="ref-touzalin.etal_2023_MarkLossCan"/>
+    <w:bookmarkEnd w:id="52"/>
+    <w:bookmarkStart w:id="54" w:name="ref-touzalin.etal_2023_MarkLossCan"/>
     <w:p>
       <w:pPr>
         <w:pStyle w:val="Bibliography"/>
@@ -20025,7 +20343,7 @@
       <w:r>
         <w:t xml:space="preserve"> </w:t>
       </w:r>
-      <w:hyperlink r:id="rId47">
+      <w:hyperlink r:id="rId53">
         <w:r>
           <w:rPr>
             <w:rStyle w:val="Hyperlink"/>
@@ -20037,8 +20355,54 @@
         <w:t xml:space="preserve">.</w:t>
       </w:r>
     </w:p>
-    <w:bookmarkEnd w:id="48"/>
-    <w:bookmarkStart w:id="49" w:name="Xe040a3ee9170c3970aba188ecc23934f91c03aa"/>
+    <w:bookmarkEnd w:id="54"/>
+    <w:bookmarkStart w:id="56" w:name="X9e26f96055772b42e4b218bf0c6bd7b46ce920d"/>
+    <w:p>
+      <w:pPr>
+        <w:pStyle w:val="Bibliography"/>
+      </w:pPr>
+      <w:r>
+        <w:t xml:space="preserve">Villella, Rita F, David R Smith, and David P Lemarié. 2004.</w:t>
+      </w:r>
+      <w:r>
+        <w:t xml:space="preserve"> </w:t>
+      </w:r>
+      <w:r>
+        <w:t xml:space="preserve">“Estimating Survival and Recruitment in a Freshwater Mussel Population Using Mark-Recapture Techniques.”</w:t>
+      </w:r>
+      <w:r>
+        <w:t xml:space="preserve"> </w:t>
+      </w:r>
+      <w:r>
+        <w:rPr>
+          <w:i/>
+          <w:iCs/>
+        </w:rPr>
+        <w:t xml:space="preserve">American Midland Naturalist</w:t>
+      </w:r>
+      <w:r>
+        <w:t xml:space="preserve"> </w:t>
+      </w:r>
+      <w:r>
+        <w:t xml:space="preserve">151 (1): 114–33.</w:t>
+      </w:r>
+      <w:r>
+        <w:t xml:space="preserve"> </w:t>
+      </w:r>
+      <w:hyperlink r:id="rId55">
+        <w:r>
+          <w:rPr>
+            <w:rStyle w:val="Hyperlink"/>
+          </w:rPr>
+          <w:t xml:space="preserve">https://doi.org/10.1674/0003-0031(2004)151[0114:ESARIA]2.0.CO;2</w:t>
+        </w:r>
+      </w:hyperlink>
+      <w:r>
+        <w:t xml:space="preserve">.</w:t>
+      </w:r>
+    </w:p>
+    <w:bookmarkEnd w:id="56"/>
+    <w:bookmarkStart w:id="57" w:name="Xe040a3ee9170c3970aba188ecc23934f91c03aa"/>
     <w:p>
       <w:pPr>
         <w:pStyle w:val="Bibliography"/>
@@ -20078,9 +20442,97 @@
         <w:t xml:space="preserve">46 (S1): S120–39.</w:t>
       </w:r>
     </w:p>
-    <w:bookmarkEnd w:id="49"/>
-    <w:bookmarkEnd w:id="50"/>
-    <w:bookmarkEnd w:id="51"/>
+    <w:bookmarkEnd w:id="57"/>
+    <w:bookmarkStart w:id="59" w:name="Xc1706993ac9af5846ea90e9c5186e4a9a9bf63f"/>
+    <w:p>
+      <w:pPr>
+        <w:pStyle w:val="Bibliography"/>
+      </w:pPr>
+      <w:r>
+        <w:t xml:space="preserve">Wisniewski, Jason M., Colin P. Shea, Sandy Abbott, and R. Carson Stringfellow. 2013.</w:t>
+      </w:r>
+      <w:r>
+        <w:t xml:space="preserve"> </w:t>
+      </w:r>
+      <w:r>
+        <w:t xml:space="preserve">“Imperfect</w:t>
+      </w:r>
+      <w:r>
+        <w:t xml:space="preserve"> </w:t>
+      </w:r>
+      <w:r>
+        <w:t xml:space="preserve">Recapture</w:t>
+      </w:r>
+      <w:r>
+        <w:t xml:space="preserve">:</w:t>
+      </w:r>
+      <w:r>
+        <w:t xml:space="preserve"> </w:t>
+      </w:r>
+      <w:r>
+        <w:t xml:space="preserve">A Potential Source</w:t>
+      </w:r>
+      <w:r>
+        <w:t xml:space="preserve"> </w:t>
+      </w:r>
+      <w:r>
+        <w:t xml:space="preserve">of</w:t>
+      </w:r>
+      <w:r>
+        <w:t xml:space="preserve"> </w:t>
+      </w:r>
+      <w:r>
+        <w:t xml:space="preserve">Bias</w:t>
+      </w:r>
+      <w:r>
+        <w:t xml:space="preserve"> </w:t>
+      </w:r>
+      <w:r>
+        <w:t xml:space="preserve">in</w:t>
+      </w:r>
+      <w:r>
+        <w:t xml:space="preserve"> </w:t>
+      </w:r>
+      <w:r>
+        <w:t xml:space="preserve">Freshwater Mussel Studies</w:t>
+      </w:r>
+      <w:r>
+        <w:t xml:space="preserve">.”</w:t>
+      </w:r>
+      <w:r>
+        <w:t xml:space="preserve"> </w:t>
+      </w:r>
+      <w:r>
+        <w:rPr>
+          <w:i/>
+          <w:iCs/>
+        </w:rPr>
+        <w:t xml:space="preserve">The American Midland Naturalist</w:t>
+      </w:r>
+      <w:r>
+        <w:t xml:space="preserve"> </w:t>
+      </w:r>
+      <w:r>
+        <w:t xml:space="preserve">170 (2): 229–47.</w:t>
+      </w:r>
+      <w:r>
+        <w:t xml:space="preserve"> </w:t>
+      </w:r>
+      <w:hyperlink r:id="rId58">
+        <w:r>
+          <w:rPr>
+            <w:rStyle w:val="Hyperlink"/>
+          </w:rPr>
+          <w:t xml:space="preserve">https://doi.org/10.1674/0003-0031-170.2.229</w:t>
+        </w:r>
+      </w:hyperlink>
+      <w:r>
+        <w:t xml:space="preserve">.</w:t>
+      </w:r>
+    </w:p>
+    <w:bookmarkEnd w:id="59"/>
+    <w:bookmarkEnd w:id="60"/>
+    <w:bookmarkEnd w:id="61"/>
     <w:sectPr>
       <w:pgSz w:h="15840" w:w="12240"/>
       <w:pgMar w:bottom="1440" w:footer="720" w:gutter="0" w:header="720" w:left="1440" w:right="1440" w:top="1440"/>

</xml_diff>